<commit_message>
summary und aufwandsübersicht ausgefüllt
</commit_message>
<xml_diff>
--- a/Doc/Dokumentation/Case Study Doku.docx
+++ b/Doc/Dokumentation/Case Study Doku.docx
@@ -456,13 +456,25 @@
       </w:r>
     </w:p>
     <w:p>
-      <w:pPr>
-        <w:rPr>
-          <w:b/>
-          <w:bCs/>
-          <w:sz w:val="28"/>
-          <w:szCs w:val="28"/>
-        </w:rPr>
+      <w:r>
+        <w:t>In dieser Case Study wurde eine Aufzugsteuerung mit vier Etagen geplant, umgesetzt und getestet. Ziel des Projekts war es, eine praxisnahe Steuerungsaufgabe mit SPS, HMI, digitalen Eingängen und zwei Antrieben zu realisieren. Der Aufzug sollte Etagenanforderungen erkennen, die gewählte Zieletage anfahren und die Türsteuerung sicher in den Ablauf einbinden.</w:t>
+      </w:r>
+    </w:p>
+    <w:p>
+      <w:r>
+        <w:t xml:space="preserve">Für die Umsetzung wurde zuerst ein technisches Konzept mit Flussdiagramm, Zustandsautomat, Architekturübersicht und HMI-Skizze erstellt. Auf dieser Grundlage entstand im LASAL </w:t>
+      </w:r>
+      <w:proofErr w:type="spellStart"/>
+      <w:r>
+        <w:t>Machine</w:t>
+      </w:r>
+      <w:proofErr w:type="spellEnd"/>
+      <w:r>
+        <w:t xml:space="preserve"> Manager ein strukturiertes SPS-Projekt mit getrennten Bereichen für Hauptablauf, Aufzugmodul, Sensorik, Türantrieb, Aufzugantrieb und Visualisierung. Die Bedienung und Zustandsanzeige wurden über das HMI umgesetzt, sodass aktuelle Etage, Zieletage, Fahrtrichtung, Türzustand sowie weitere Signale nachvollziehbar dargestellt werden konnten.</w:t>
+      </w:r>
+    </w:p>
+    <w:p>
+      <w:pPr>
         <w:sectPr>
           <w:pgSz w:w="11906" w:h="16838"/>
           <w:pgMar w:top="1418" w:right="1134" w:bottom="1134" w:left="1134" w:header="709" w:footer="709" w:gutter="0"/>
@@ -471,6 +483,9 @@
           <w:docGrid w:linePitch="360"/>
         </w:sectPr>
       </w:pPr>
+      <w:r>
+        <w:t>Während der Realisierung wurden die Motoranbindung, die HMI-Kommunikation, die Git-Zusammenarbeit und mehrere Test- und Bugfix-Runden schrittweise aufgebaut. Herausforderungen wie fehlende Bibliotheksdateien, Branch-Abstimmungen und die Anbindung einzelner Statuswerte konnten im Team gelöst werden. Insgesamt zeigt die Arbeit, dass eine saubere Planung, klare Schnittstellen, Versionsverwaltung und regelmässiges Testen entscheidend sind, um aus einer ersten Projektidee eine funktionierende und erweiterbare Aufzugsteuerung zu entwickeln.</w:t>
+      </w:r>
     </w:p>
     <w:p/>
     <w:sdt>
@@ -537,7 +552,7 @@
           <w:r>
             <w:fldChar w:fldCharType="separate"/>
           </w:r>
-          <w:hyperlink w:anchor="_Toc233147810" w:history="1">
+          <w:hyperlink w:anchor="_Toc233202747" w:history="1">
             <w:r>
               <w:rPr>
                 <w:rStyle w:val="Hyperlink"/>
@@ -584,7 +599,7 @@
                 <w:noProof/>
                 <w:webHidden/>
               </w:rPr>
-              <w:instrText xml:space="preserve"> PAGEREF _Toc233147810 \h </w:instrText>
+              <w:instrText xml:space="preserve"> PAGEREF _Toc233202747 \h </w:instrText>
             </w:r>
             <w:r>
               <w:rPr>
@@ -632,7 +647,7 @@
               <w14:ligatures w14:val="standardContextual"/>
             </w:rPr>
           </w:pPr>
-          <w:hyperlink w:anchor="_Toc233147811" w:history="1">
+          <w:hyperlink w:anchor="_Toc233202748" w:history="1">
             <w:r>
               <w:rPr>
                 <w:rStyle w:val="Hyperlink"/>
@@ -679,7 +694,7 @@
                 <w:noProof/>
                 <w:webHidden/>
               </w:rPr>
-              <w:instrText xml:space="preserve"> PAGEREF _Toc233147811 \h </w:instrText>
+              <w:instrText xml:space="preserve"> PAGEREF _Toc233202748 \h </w:instrText>
             </w:r>
             <w:r>
               <w:rPr>
@@ -727,7 +742,7 @@
               <w14:ligatures w14:val="standardContextual"/>
             </w:rPr>
           </w:pPr>
-          <w:hyperlink w:anchor="_Toc233147812" w:history="1">
+          <w:hyperlink w:anchor="_Toc233202749" w:history="1">
             <w:r>
               <w:rPr>
                 <w:rStyle w:val="Hyperlink"/>
@@ -775,7 +790,7 @@
                 <w:noProof/>
                 <w:webHidden/>
               </w:rPr>
-              <w:instrText xml:space="preserve"> PAGEREF _Toc233147812 \h </w:instrText>
+              <w:instrText xml:space="preserve"> PAGEREF _Toc233202749 \h </w:instrText>
             </w:r>
             <w:r>
               <w:rPr>
@@ -823,7 +838,7 @@
               <w14:ligatures w14:val="standardContextual"/>
             </w:rPr>
           </w:pPr>
-          <w:hyperlink w:anchor="_Toc233147813" w:history="1">
+          <w:hyperlink w:anchor="_Toc233202750" w:history="1">
             <w:r>
               <w:rPr>
                 <w:rStyle w:val="Hyperlink"/>
@@ -871,7 +886,7 @@
                 <w:noProof/>
                 <w:webHidden/>
               </w:rPr>
-              <w:instrText xml:space="preserve"> PAGEREF _Toc233147813 \h </w:instrText>
+              <w:instrText xml:space="preserve"> PAGEREF _Toc233202750 \h </w:instrText>
             </w:r>
             <w:r>
               <w:rPr>
@@ -919,7 +934,7 @@
               <w14:ligatures w14:val="standardContextual"/>
             </w:rPr>
           </w:pPr>
-          <w:hyperlink w:anchor="_Toc233147814" w:history="1">
+          <w:hyperlink w:anchor="_Toc233202751" w:history="1">
             <w:r>
               <w:rPr>
                 <w:rStyle w:val="Hyperlink"/>
@@ -966,7 +981,7 @@
                 <w:noProof/>
                 <w:webHidden/>
               </w:rPr>
-              <w:instrText xml:space="preserve"> PAGEREF _Toc233147814 \h </w:instrText>
+              <w:instrText xml:space="preserve"> PAGEREF _Toc233202751 \h </w:instrText>
             </w:r>
             <w:r>
               <w:rPr>
@@ -1014,7 +1029,7 @@
               <w14:ligatures w14:val="standardContextual"/>
             </w:rPr>
           </w:pPr>
-          <w:hyperlink w:anchor="_Toc233147815" w:history="1">
+          <w:hyperlink w:anchor="_Toc233202752" w:history="1">
             <w:r>
               <w:rPr>
                 <w:rStyle w:val="Hyperlink"/>
@@ -1062,7 +1077,7 @@
                 <w:noProof/>
                 <w:webHidden/>
               </w:rPr>
-              <w:instrText xml:space="preserve"> PAGEREF _Toc233147815 \h </w:instrText>
+              <w:instrText xml:space="preserve"> PAGEREF _Toc233202752 \h </w:instrText>
             </w:r>
             <w:r>
               <w:rPr>
@@ -1110,7 +1125,7 @@
               <w14:ligatures w14:val="standardContextual"/>
             </w:rPr>
           </w:pPr>
-          <w:hyperlink w:anchor="_Toc233147816" w:history="1">
+          <w:hyperlink w:anchor="_Toc233202753" w:history="1">
             <w:r>
               <w:rPr>
                 <w:rStyle w:val="Hyperlink"/>
@@ -1158,7 +1173,7 @@
                 <w:noProof/>
                 <w:webHidden/>
               </w:rPr>
-              <w:instrText xml:space="preserve"> PAGEREF _Toc233147816 \h </w:instrText>
+              <w:instrText xml:space="preserve"> PAGEREF _Toc233202753 \h </w:instrText>
             </w:r>
             <w:r>
               <w:rPr>
@@ -1206,7 +1221,7 @@
               <w14:ligatures w14:val="standardContextual"/>
             </w:rPr>
           </w:pPr>
-          <w:hyperlink w:anchor="_Toc233147817" w:history="1">
+          <w:hyperlink w:anchor="_Toc233202754" w:history="1">
             <w:r>
               <w:rPr>
                 <w:rStyle w:val="Hyperlink"/>
@@ -1254,7 +1269,7 @@
                 <w:noProof/>
                 <w:webHidden/>
               </w:rPr>
-              <w:instrText xml:space="preserve"> PAGEREF _Toc233147817 \h </w:instrText>
+              <w:instrText xml:space="preserve"> PAGEREF _Toc233202754 \h </w:instrText>
             </w:r>
             <w:r>
               <w:rPr>
@@ -1302,7 +1317,7 @@
               <w14:ligatures w14:val="standardContextual"/>
             </w:rPr>
           </w:pPr>
-          <w:hyperlink w:anchor="_Toc233147818" w:history="1">
+          <w:hyperlink w:anchor="_Toc233202755" w:history="1">
             <w:r>
               <w:rPr>
                 <w:rStyle w:val="Hyperlink"/>
@@ -1350,7 +1365,7 @@
                 <w:noProof/>
                 <w:webHidden/>
               </w:rPr>
-              <w:instrText xml:space="preserve"> PAGEREF _Toc233147818 \h </w:instrText>
+              <w:instrText xml:space="preserve"> PAGEREF _Toc233202755 \h </w:instrText>
             </w:r>
             <w:r>
               <w:rPr>
@@ -1398,7 +1413,7 @@
               <w14:ligatures w14:val="standardContextual"/>
             </w:rPr>
           </w:pPr>
-          <w:hyperlink w:anchor="_Toc233147819" w:history="1">
+          <w:hyperlink w:anchor="_Toc233202756" w:history="1">
             <w:r>
               <w:rPr>
                 <w:rStyle w:val="Hyperlink"/>
@@ -1446,7 +1461,7 @@
                 <w:noProof/>
                 <w:webHidden/>
               </w:rPr>
-              <w:instrText xml:space="preserve"> PAGEREF _Toc233147819 \h </w:instrText>
+              <w:instrText xml:space="preserve"> PAGEREF _Toc233202756 \h </w:instrText>
             </w:r>
             <w:r>
               <w:rPr>
@@ -1494,7 +1509,7 @@
               <w14:ligatures w14:val="standardContextual"/>
             </w:rPr>
           </w:pPr>
-          <w:hyperlink w:anchor="_Toc233147820" w:history="1">
+          <w:hyperlink w:anchor="_Toc233202757" w:history="1">
             <w:r>
               <w:rPr>
                 <w:rStyle w:val="Hyperlink"/>
@@ -1541,7 +1556,7 @@
                 <w:noProof/>
                 <w:webHidden/>
               </w:rPr>
-              <w:instrText xml:space="preserve"> PAGEREF _Toc233147820 \h </w:instrText>
+              <w:instrText xml:space="preserve"> PAGEREF _Toc233202757 \h </w:instrText>
             </w:r>
             <w:r>
               <w:rPr>
@@ -1589,7 +1604,7 @@
               <w14:ligatures w14:val="standardContextual"/>
             </w:rPr>
           </w:pPr>
-          <w:hyperlink w:anchor="_Toc233147821" w:history="1">
+          <w:hyperlink w:anchor="_Toc233202758" w:history="1">
             <w:r>
               <w:rPr>
                 <w:rStyle w:val="Hyperlink"/>
@@ -1636,7 +1651,7 @@
                 <w:noProof/>
                 <w:webHidden/>
               </w:rPr>
-              <w:instrText xml:space="preserve"> PAGEREF _Toc233147821 \h </w:instrText>
+              <w:instrText xml:space="preserve"> PAGEREF _Toc233202758 \h </w:instrText>
             </w:r>
             <w:r>
               <w:rPr>
@@ -1684,7 +1699,7 @@
               <w14:ligatures w14:val="standardContextual"/>
             </w:rPr>
           </w:pPr>
-          <w:hyperlink w:anchor="_Toc233147822" w:history="1">
+          <w:hyperlink w:anchor="_Toc233202759" w:history="1">
             <w:r>
               <w:rPr>
                 <w:rStyle w:val="Hyperlink"/>
@@ -1731,7 +1746,7 @@
                 <w:noProof/>
                 <w:webHidden/>
               </w:rPr>
-              <w:instrText xml:space="preserve"> PAGEREF _Toc233147822 \h </w:instrText>
+              <w:instrText xml:space="preserve"> PAGEREF _Toc233202759 \h </w:instrText>
             </w:r>
             <w:r>
               <w:rPr>
@@ -1779,7 +1794,7 @@
               <w14:ligatures w14:val="standardContextual"/>
             </w:rPr>
           </w:pPr>
-          <w:hyperlink w:anchor="_Toc233147823" w:history="1">
+          <w:hyperlink w:anchor="_Toc233202760" w:history="1">
             <w:r>
               <w:rPr>
                 <w:rStyle w:val="Hyperlink"/>
@@ -1826,7 +1841,7 @@
                 <w:noProof/>
                 <w:webHidden/>
               </w:rPr>
-              <w:instrText xml:space="preserve"> PAGEREF _Toc233147823 \h </w:instrText>
+              <w:instrText xml:space="preserve"> PAGEREF _Toc233202760 \h </w:instrText>
             </w:r>
             <w:r>
               <w:rPr>
@@ -1874,7 +1889,7 @@
               <w14:ligatures w14:val="standardContextual"/>
             </w:rPr>
           </w:pPr>
-          <w:hyperlink w:anchor="_Toc233147824" w:history="1">
+          <w:hyperlink w:anchor="_Toc233202761" w:history="1">
             <w:r>
               <w:rPr>
                 <w:rStyle w:val="Hyperlink"/>
@@ -1921,7 +1936,7 @@
                 <w:noProof/>
                 <w:webHidden/>
               </w:rPr>
-              <w:instrText xml:space="preserve"> PAGEREF _Toc233147824 \h </w:instrText>
+              <w:instrText xml:space="preserve"> PAGEREF _Toc233202761 \h </w:instrText>
             </w:r>
             <w:r>
               <w:rPr>
@@ -1969,7 +1984,7 @@
               <w14:ligatures w14:val="standardContextual"/>
             </w:rPr>
           </w:pPr>
-          <w:hyperlink w:anchor="_Toc233147825" w:history="1">
+          <w:hyperlink w:anchor="_Toc233202762" w:history="1">
             <w:r>
               <w:rPr>
                 <w:rStyle w:val="Hyperlink"/>
@@ -2016,7 +2031,7 @@
                 <w:noProof/>
                 <w:webHidden/>
               </w:rPr>
-              <w:instrText xml:space="preserve"> PAGEREF _Toc233147825 \h </w:instrText>
+              <w:instrText xml:space="preserve"> PAGEREF _Toc233202762 \h </w:instrText>
             </w:r>
             <w:r>
               <w:rPr>
@@ -2064,7 +2079,7 @@
               <w14:ligatures w14:val="standardContextual"/>
             </w:rPr>
           </w:pPr>
-          <w:hyperlink w:anchor="_Toc233147826" w:history="1">
+          <w:hyperlink w:anchor="_Toc233202763" w:history="1">
             <w:r>
               <w:rPr>
                 <w:rStyle w:val="Hyperlink"/>
@@ -2111,7 +2126,7 @@
                 <w:noProof/>
                 <w:webHidden/>
               </w:rPr>
-              <w:instrText xml:space="preserve"> PAGEREF _Toc233147826 \h </w:instrText>
+              <w:instrText xml:space="preserve"> PAGEREF _Toc233202763 \h </w:instrText>
             </w:r>
             <w:r>
               <w:rPr>
@@ -2159,7 +2174,7 @@
               <w14:ligatures w14:val="standardContextual"/>
             </w:rPr>
           </w:pPr>
-          <w:hyperlink w:anchor="_Toc233147827" w:history="1">
+          <w:hyperlink w:anchor="_Toc233202764" w:history="1">
             <w:r>
               <w:rPr>
                 <w:rStyle w:val="Hyperlink"/>
@@ -2206,7 +2221,7 @@
                 <w:noProof/>
                 <w:webHidden/>
               </w:rPr>
-              <w:instrText xml:space="preserve"> PAGEREF _Toc233147827 \h </w:instrText>
+              <w:instrText xml:space="preserve"> PAGEREF _Toc233202764 \h </w:instrText>
             </w:r>
             <w:r>
               <w:rPr>
@@ -2254,7 +2269,7 @@
               <w14:ligatures w14:val="standardContextual"/>
             </w:rPr>
           </w:pPr>
-          <w:hyperlink w:anchor="_Toc233147828" w:history="1">
+          <w:hyperlink w:anchor="_Toc233202765" w:history="1">
             <w:r>
               <w:rPr>
                 <w:rStyle w:val="Hyperlink"/>
@@ -2301,7 +2316,7 @@
                 <w:noProof/>
                 <w:webHidden/>
               </w:rPr>
-              <w:instrText xml:space="preserve"> PAGEREF _Toc233147828 \h </w:instrText>
+              <w:instrText xml:space="preserve"> PAGEREF _Toc233202765 \h </w:instrText>
             </w:r>
             <w:r>
               <w:rPr>
@@ -2349,7 +2364,7 @@
               <w14:ligatures w14:val="standardContextual"/>
             </w:rPr>
           </w:pPr>
-          <w:hyperlink w:anchor="_Toc233147829" w:history="1">
+          <w:hyperlink w:anchor="_Toc233202766" w:history="1">
             <w:r>
               <w:rPr>
                 <w:rStyle w:val="Hyperlink"/>
@@ -2396,7 +2411,7 @@
                 <w:noProof/>
                 <w:webHidden/>
               </w:rPr>
-              <w:instrText xml:space="preserve"> PAGEREF _Toc233147829 \h </w:instrText>
+              <w:instrText xml:space="preserve"> PAGEREF _Toc233202766 \h </w:instrText>
             </w:r>
             <w:r>
               <w:rPr>
@@ -2444,7 +2459,7 @@
               <w14:ligatures w14:val="standardContextual"/>
             </w:rPr>
           </w:pPr>
-          <w:hyperlink w:anchor="_Toc233147830" w:history="1">
+          <w:hyperlink w:anchor="_Toc233202767" w:history="1">
             <w:r>
               <w:rPr>
                 <w:rStyle w:val="Hyperlink"/>
@@ -2491,7 +2506,7 @@
                 <w:noProof/>
                 <w:webHidden/>
               </w:rPr>
-              <w:instrText xml:space="preserve"> PAGEREF _Toc233147830 \h </w:instrText>
+              <w:instrText xml:space="preserve"> PAGEREF _Toc233202767 \h </w:instrText>
             </w:r>
             <w:r>
               <w:rPr>
@@ -2539,7 +2554,7 @@
               <w14:ligatures w14:val="standardContextual"/>
             </w:rPr>
           </w:pPr>
-          <w:hyperlink w:anchor="_Toc233147831" w:history="1">
+          <w:hyperlink w:anchor="_Toc233202768" w:history="1">
             <w:r>
               <w:rPr>
                 <w:rStyle w:val="Hyperlink"/>
@@ -2586,7 +2601,7 @@
                 <w:noProof/>
                 <w:webHidden/>
               </w:rPr>
-              <w:instrText xml:space="preserve"> PAGEREF _Toc233147831 \h </w:instrText>
+              <w:instrText xml:space="preserve"> PAGEREF _Toc233202768 \h </w:instrText>
             </w:r>
             <w:r>
               <w:rPr>
@@ -2634,7 +2649,7 @@
               <w14:ligatures w14:val="standardContextual"/>
             </w:rPr>
           </w:pPr>
-          <w:hyperlink w:anchor="_Toc233147832" w:history="1">
+          <w:hyperlink w:anchor="_Toc233202769" w:history="1">
             <w:r>
               <w:rPr>
                 <w:rStyle w:val="Hyperlink"/>
@@ -2681,7 +2696,7 @@
                 <w:noProof/>
                 <w:webHidden/>
               </w:rPr>
-              <w:instrText xml:space="preserve"> PAGEREF _Toc233147832 \h </w:instrText>
+              <w:instrText xml:space="preserve"> PAGEREF _Toc233202769 \h </w:instrText>
             </w:r>
             <w:r>
               <w:rPr>
@@ -2729,7 +2744,7 @@
               <w14:ligatures w14:val="standardContextual"/>
             </w:rPr>
           </w:pPr>
-          <w:hyperlink w:anchor="_Toc233147833" w:history="1">
+          <w:hyperlink w:anchor="_Toc233202770" w:history="1">
             <w:r>
               <w:rPr>
                 <w:rStyle w:val="Hyperlink"/>
@@ -2776,7 +2791,7 @@
                 <w:noProof/>
                 <w:webHidden/>
               </w:rPr>
-              <w:instrText xml:space="preserve"> PAGEREF _Toc233147833 \h </w:instrText>
+              <w:instrText xml:space="preserve"> PAGEREF _Toc233202770 \h </w:instrText>
             </w:r>
             <w:r>
               <w:rPr>
@@ -2824,7 +2839,7 @@
               <w14:ligatures w14:val="standardContextual"/>
             </w:rPr>
           </w:pPr>
-          <w:hyperlink w:anchor="_Toc233147834" w:history="1">
+          <w:hyperlink w:anchor="_Toc233202771" w:history="1">
             <w:r>
               <w:rPr>
                 <w:rStyle w:val="Hyperlink"/>
@@ -2871,7 +2886,7 @@
                 <w:noProof/>
                 <w:webHidden/>
               </w:rPr>
-              <w:instrText xml:space="preserve"> PAGEREF _Toc233147834 \h </w:instrText>
+              <w:instrText xml:space="preserve"> PAGEREF _Toc233202771 \h </w:instrText>
             </w:r>
             <w:r>
               <w:rPr>
@@ -2918,7 +2933,7 @@
               <w14:ligatures w14:val="standardContextual"/>
             </w:rPr>
           </w:pPr>
-          <w:hyperlink w:anchor="_Toc233147835" w:history="1">
+          <w:hyperlink w:anchor="_Toc233202772" w:history="1">
             <w:r>
               <w:rPr>
                 <w:rStyle w:val="Hyperlink"/>
@@ -2945,7 +2960,7 @@
                 <w:noProof/>
                 <w:webHidden/>
               </w:rPr>
-              <w:instrText xml:space="preserve"> PAGEREF _Toc233147835 \h </w:instrText>
+              <w:instrText xml:space="preserve"> PAGEREF _Toc233202772 \h </w:instrText>
             </w:r>
             <w:r>
               <w:rPr>
@@ -2992,7 +3007,7 @@
               <w14:ligatures w14:val="standardContextual"/>
             </w:rPr>
           </w:pPr>
-          <w:hyperlink w:anchor="_Toc233147836" w:history="1">
+          <w:hyperlink w:anchor="_Toc233202773" w:history="1">
             <w:r>
               <w:rPr>
                 <w:rStyle w:val="Hyperlink"/>
@@ -3019,7 +3034,7 @@
                 <w:noProof/>
                 <w:webHidden/>
               </w:rPr>
-              <w:instrText xml:space="preserve"> PAGEREF _Toc233147836 \h </w:instrText>
+              <w:instrText xml:space="preserve"> PAGEREF _Toc233202773 \h </w:instrText>
             </w:r>
             <w:r>
               <w:rPr>
@@ -3066,7 +3081,7 @@
               <w14:ligatures w14:val="standardContextual"/>
             </w:rPr>
           </w:pPr>
-          <w:hyperlink w:anchor="_Toc233147837" w:history="1">
+          <w:hyperlink w:anchor="_Toc233202774" w:history="1">
             <w:r>
               <w:rPr>
                 <w:rStyle w:val="Hyperlink"/>
@@ -3093,7 +3108,7 @@
                 <w:noProof/>
                 <w:webHidden/>
               </w:rPr>
-              <w:instrText xml:space="preserve"> PAGEREF _Toc233147837 \h </w:instrText>
+              <w:instrText xml:space="preserve"> PAGEREF _Toc233202774 \h </w:instrText>
             </w:r>
             <w:r>
               <w:rPr>
@@ -3140,7 +3155,7 @@
               <w14:ligatures w14:val="standardContextual"/>
             </w:rPr>
           </w:pPr>
-          <w:hyperlink w:anchor="_Toc233147838" w:history="1">
+          <w:hyperlink w:anchor="_Toc233202775" w:history="1">
             <w:r>
               <w:rPr>
                 <w:rStyle w:val="Hyperlink"/>
@@ -3167,7 +3182,7 @@
                 <w:noProof/>
                 <w:webHidden/>
               </w:rPr>
-              <w:instrText xml:space="preserve"> PAGEREF _Toc233147838 \h </w:instrText>
+              <w:instrText xml:space="preserve"> PAGEREF _Toc233202775 \h </w:instrText>
             </w:r>
             <w:r>
               <w:rPr>
@@ -3214,7 +3229,7 @@
               <w14:ligatures w14:val="standardContextual"/>
             </w:rPr>
           </w:pPr>
-          <w:hyperlink w:anchor="_Toc233147839" w:history="1">
+          <w:hyperlink w:anchor="_Toc233202776" w:history="1">
             <w:r>
               <w:rPr>
                 <w:rStyle w:val="Hyperlink"/>
@@ -3241,7 +3256,7 @@
                 <w:noProof/>
                 <w:webHidden/>
               </w:rPr>
-              <w:instrText xml:space="preserve"> PAGEREF _Toc233147839 \h </w:instrText>
+              <w:instrText xml:space="preserve"> PAGEREF _Toc233202776 \h </w:instrText>
             </w:r>
             <w:r>
               <w:rPr>
@@ -3288,7 +3303,7 @@
               <w14:ligatures w14:val="standardContextual"/>
             </w:rPr>
           </w:pPr>
-          <w:hyperlink w:anchor="_Toc233147840" w:history="1">
+          <w:hyperlink w:anchor="_Toc233202777" w:history="1">
             <w:r>
               <w:rPr>
                 <w:rStyle w:val="Hyperlink"/>
@@ -3315,7 +3330,7 @@
                 <w:noProof/>
                 <w:webHidden/>
               </w:rPr>
-              <w:instrText xml:space="preserve"> PAGEREF _Toc233147840 \h </w:instrText>
+              <w:instrText xml:space="preserve"> PAGEREF _Toc233202777 \h </w:instrText>
             </w:r>
             <w:r>
               <w:rPr>
@@ -3378,7 +3393,7 @@
       <w:pPr>
         <w:pStyle w:val="berschrift1"/>
       </w:pPr>
-      <w:bookmarkStart w:id="0" w:name="_Toc233147810"/>
+      <w:bookmarkStart w:id="0" w:name="_Toc233202747"/>
       <w:r>
         <w:lastRenderedPageBreak/>
         <w:t>Einleitung</w:t>
@@ -3406,7 +3421,7 @@
       <w:pPr>
         <w:pStyle w:val="berschrift1"/>
       </w:pPr>
-      <w:bookmarkStart w:id="1" w:name="_Toc233147811"/>
+      <w:bookmarkStart w:id="1" w:name="_Toc233202748"/>
       <w:r>
         <w:t>Anforderungen und Ziele</w:t>
       </w:r>
@@ -3444,7 +3459,7 @@
           <w:bCs/>
         </w:rPr>
       </w:pPr>
-      <w:bookmarkStart w:id="2" w:name="_Toc233147812"/>
+      <w:bookmarkStart w:id="2" w:name="_Toc233202749"/>
       <w:r>
         <w:rPr>
           <w:bCs/>
@@ -3491,7 +3506,7 @@
           <w:bCs/>
         </w:rPr>
       </w:pPr>
-      <w:bookmarkStart w:id="3" w:name="_Toc233147813"/>
+      <w:bookmarkStart w:id="3" w:name="_Toc233202750"/>
       <w:r>
         <w:rPr>
           <w:bCs/>
@@ -3528,7 +3543,7 @@
       <w:pPr>
         <w:pStyle w:val="berschrift1"/>
       </w:pPr>
-      <w:bookmarkStart w:id="4" w:name="_Toc233147814"/>
+      <w:bookmarkStart w:id="4" w:name="_Toc233202751"/>
       <w:r>
         <w:t>Planen und Konzipieren</w:t>
       </w:r>
@@ -3559,7 +3574,7 @@
         </w:rPr>
         <w:t xml:space="preserve"> </w:t>
       </w:r>
-      <w:bookmarkStart w:id="5" w:name="_Toc233147815"/>
+      <w:bookmarkStart w:id="5" w:name="_Toc233202752"/>
       <w:r>
         <w:rPr>
           <w:bCs/>
@@ -3671,7 +3686,7 @@
           <w:bCs/>
         </w:rPr>
       </w:pPr>
-      <w:bookmarkStart w:id="7" w:name="_Toc233147816"/>
+      <w:bookmarkStart w:id="7" w:name="_Toc233202753"/>
       <w:r>
         <w:rPr>
           <w:bCs/>
@@ -3796,7 +3811,7 @@
       <w:r>
         <w:t xml:space="preserve"> </w:t>
       </w:r>
-      <w:bookmarkStart w:id="9" w:name="_Toc233147817"/>
+      <w:bookmarkStart w:id="9" w:name="_Toc233202754"/>
       <w:r>
         <w:rPr>
           <w:bCs/>
@@ -3923,7 +3938,7 @@
           <w:bCs/>
         </w:rPr>
       </w:pPr>
-      <w:bookmarkStart w:id="11" w:name="_Toc233147818"/>
+      <w:bookmarkStart w:id="11" w:name="_Toc233202755"/>
       <w:r>
         <w:rPr>
           <w:bCs/>
@@ -4117,7 +4132,7 @@
           <w:bCs/>
         </w:rPr>
       </w:pPr>
-      <w:bookmarkStart w:id="13" w:name="_Toc233147819"/>
+      <w:bookmarkStart w:id="13" w:name="_Toc233202756"/>
       <w:r>
         <w:rPr>
           <w:bCs/>
@@ -4256,7 +4271,7 @@
       <w:pPr>
         <w:pStyle w:val="berschrift1"/>
       </w:pPr>
-      <w:bookmarkStart w:id="14" w:name="_Toc233147820"/>
+      <w:bookmarkStart w:id="14" w:name="_Toc233202757"/>
       <w:r>
         <w:t>Umsetzung</w:t>
       </w:r>
@@ -4266,7 +4281,7 @@
       <w:pPr>
         <w:pStyle w:val="berschrift2"/>
       </w:pPr>
-      <w:bookmarkStart w:id="15" w:name="_Toc233147821"/>
+      <w:bookmarkStart w:id="15" w:name="_Toc233202758"/>
       <w:r>
         <w:t>Aufbau des SPS-Projekt</w:t>
       </w:r>
@@ -4328,7 +4343,7 @@
         </w:rPr>
         <w:lastRenderedPageBreak/>
         <w:drawing>
-          <wp:inline distT="0" distB="0" distL="0" distR="0" wp14:anchorId="54625FE5" wp14:editId="64E90BA5">
+          <wp:inline distT="0" distB="0" distL="0" distR="0" wp14:anchorId="54625FE5" wp14:editId="307D0D68">
             <wp:extent cx="6120130" cy="1140460"/>
             <wp:effectExtent l="0" t="0" r="1270" b="2540"/>
             <wp:docPr id="1795454183" name="Grafik 2" descr="Benutzeranhang"/>
@@ -4411,7 +4426,7 @@
       <w:pPr>
         <w:pStyle w:val="berschrift2"/>
       </w:pPr>
-      <w:bookmarkStart w:id="17" w:name="_Toc233147822"/>
+      <w:bookmarkStart w:id="17" w:name="_Toc233202759"/>
       <w:r>
         <w:t>Versionsverwaltung und Git-Test</w:t>
       </w:r>
@@ -4434,7 +4449,7 @@
       <w:pPr>
         <w:pStyle w:val="berschrift2"/>
       </w:pPr>
-      <w:bookmarkStart w:id="18" w:name="_Toc233147823"/>
+      <w:bookmarkStart w:id="18" w:name="_Toc233202760"/>
       <w:r>
         <w:t>Aufbau der Architektur im SPS-Projekt</w:t>
       </w:r>
@@ -4563,7 +4578,7 @@
       <w:pPr>
         <w:pStyle w:val="berschrift2"/>
       </w:pPr>
-      <w:bookmarkStart w:id="20" w:name="_Toc233147824"/>
+      <w:bookmarkStart w:id="20" w:name="_Toc233202761"/>
       <w:r>
         <w:lastRenderedPageBreak/>
         <w:t>Motoranbindung und Motion-Grundlage</w:t>
@@ -4679,7 +4694,7 @@
       <w:pPr>
         <w:pStyle w:val="berschrift2"/>
       </w:pPr>
-      <w:bookmarkStart w:id="22" w:name="_Toc233147825"/>
+      <w:bookmarkStart w:id="22" w:name="_Toc233202762"/>
       <w:r>
         <w:lastRenderedPageBreak/>
         <w:t>Aufbau der Sensorik und Hilfsklassen</w:t>
@@ -4691,7 +4706,7 @@
       <w:pPr>
         <w:pStyle w:val="berschrift2"/>
       </w:pPr>
-      <w:bookmarkStart w:id="23" w:name="_Toc233147826"/>
+      <w:bookmarkStart w:id="23" w:name="_Toc233202763"/>
       <w:r>
         <w:t>Umsetzung der Hauptsteuerung</w:t>
       </w:r>
@@ -4702,7 +4717,7 @@
       <w:pPr>
         <w:pStyle w:val="berschrift2"/>
       </w:pPr>
-      <w:bookmarkStart w:id="24" w:name="_Toc233147827"/>
+      <w:bookmarkStart w:id="24" w:name="_Toc233202764"/>
       <w:r>
         <w:t>Schrittkette der Aufzugsteuerung</w:t>
       </w:r>
@@ -4713,7 +4728,7 @@
       <w:pPr>
         <w:pStyle w:val="berschrift2"/>
       </w:pPr>
-      <w:bookmarkStart w:id="25" w:name="_Toc233147828"/>
+      <w:bookmarkStart w:id="25" w:name="_Toc233202765"/>
       <w:r>
         <w:t>Ansteuerung von Aufzug- und Türantrieb</w:t>
       </w:r>
@@ -4727,7 +4742,7 @@
       <w:r>
         <w:t xml:space="preserve"> </w:t>
       </w:r>
-      <w:bookmarkStart w:id="26" w:name="_Toc233147829"/>
+      <w:bookmarkStart w:id="26" w:name="_Toc233202766"/>
       <w:r>
         <w:t>Bonus: Lichtschranke und Notstoppfunktion</w:t>
       </w:r>
@@ -4738,7 +4753,7 @@
       <w:pPr>
         <w:pStyle w:val="berschrift2"/>
       </w:pPr>
-      <w:bookmarkStart w:id="27" w:name="_Toc233147830"/>
+      <w:bookmarkStart w:id="27" w:name="_Toc233202767"/>
       <w:r>
         <w:t>HMI-Anbindung und Visualisierung</w:t>
       </w:r>
@@ -4853,7 +4868,7 @@
         <w:lastRenderedPageBreak/>
         <w:t xml:space="preserve"> </w:t>
       </w:r>
-      <w:bookmarkStart w:id="29" w:name="_Toc233147831"/>
+      <w:bookmarkStart w:id="29" w:name="_Toc233202768"/>
       <w:r>
         <w:t xml:space="preserve">Testen, Bugfixes und Zusammenführung der </w:t>
       </w:r>
@@ -4991,7 +5006,7 @@
       <w:pPr>
         <w:pStyle w:val="berschrift1"/>
       </w:pPr>
-      <w:bookmarkStart w:id="31" w:name="_Toc233147832"/>
+      <w:bookmarkStart w:id="31" w:name="_Toc233202769"/>
       <w:r>
         <w:lastRenderedPageBreak/>
         <w:t>Schlussteil</w:t>
@@ -5043,7 +5058,7 @@
       <w:pPr>
         <w:pStyle w:val="berschrift2"/>
       </w:pPr>
-      <w:bookmarkStart w:id="32" w:name="_Toc233147833"/>
+      <w:bookmarkStart w:id="32" w:name="_Toc233202770"/>
       <w:r>
         <w:t>Niklaus</w:t>
       </w:r>
@@ -5069,7 +5084,7 @@
       <w:pPr>
         <w:pStyle w:val="berschrift2"/>
       </w:pPr>
-      <w:bookmarkStart w:id="33" w:name="_Toc233147834"/>
+      <w:bookmarkStart w:id="33" w:name="_Toc233202771"/>
       <w:r>
         <w:lastRenderedPageBreak/>
         <w:t>Hassan</w:t>
@@ -5155,7 +5170,7 @@
         </w:numPr>
         <w:ind w:left="454" w:hanging="454"/>
       </w:pPr>
-      <w:bookmarkStart w:id="34" w:name="_Toc233147835"/>
+      <w:bookmarkStart w:id="34" w:name="_Toc233202772"/>
       <w:r>
         <w:lastRenderedPageBreak/>
         <w:t>Aufwandsübersicht</w:t>
@@ -5289,7 +5304,10 @@
               <w:cnfStyle w:val="000000100000" w:firstRow="0" w:lastRow="0" w:firstColumn="0" w:lastColumn="0" w:oddVBand="0" w:evenVBand="0" w:oddHBand="1" w:evenHBand="0" w:firstRowFirstColumn="0" w:firstRowLastColumn="0" w:lastRowFirstColumn="0" w:lastRowLastColumn="0"/>
             </w:pPr>
             <w:r>
-              <w:t>Ca 1-2h</w:t>
+              <w:t>1</w:t>
+            </w:r>
+            <w:r>
+              <w:t>h</w:t>
             </w:r>
           </w:p>
         </w:tc>
@@ -6709,6 +6727,9 @@
             <w:pPr>
               <w:cnfStyle w:val="000000000000" w:firstRow="0" w:lastRow="0" w:firstColumn="0" w:lastColumn="0" w:oddVBand="0" w:evenVBand="0" w:oddHBand="0" w:evenHBand="0" w:firstRowFirstColumn="0" w:firstRowLastColumn="0" w:lastRowFirstColumn="0" w:lastRowLastColumn="0"/>
             </w:pPr>
+            <w:r>
+              <w:t>2h</w:t>
+            </w:r>
           </w:p>
         </w:tc>
       </w:tr>
@@ -6871,6 +6892,9 @@
             <w:pPr>
               <w:cnfStyle w:val="000000100000" w:firstRow="0" w:lastRow="0" w:firstColumn="0" w:lastColumn="0" w:oddVBand="0" w:evenVBand="0" w:oddHBand="1" w:evenHBand="0" w:firstRowFirstColumn="0" w:firstRowLastColumn="0" w:lastRowFirstColumn="0" w:lastRowLastColumn="0"/>
             </w:pPr>
+            <w:r>
+              <w:t>1h</w:t>
+            </w:r>
           </w:p>
         </w:tc>
       </w:tr>
@@ -6917,6 +6941,9 @@
             <w:pPr>
               <w:cnfStyle w:val="000000000000" w:firstRow="0" w:lastRow="0" w:firstColumn="0" w:lastColumn="0" w:oddVBand="0" w:evenVBand="0" w:oddHBand="0" w:evenHBand="0" w:firstRowFirstColumn="0" w:firstRowLastColumn="0" w:lastRowFirstColumn="0" w:lastRowLastColumn="0"/>
             </w:pPr>
+            <w:r>
+              <w:t>1h</w:t>
+            </w:r>
           </w:p>
         </w:tc>
       </w:tr>
@@ -7031,6 +7058,9 @@
             <w:pPr>
               <w:cnfStyle w:val="000000000000" w:firstRow="0" w:lastRow="0" w:firstColumn="0" w:lastColumn="0" w:oddVBand="0" w:evenVBand="0" w:oddHBand="0" w:evenHBand="0" w:firstRowFirstColumn="0" w:firstRowLastColumn="0" w:lastRowFirstColumn="0" w:lastRowLastColumn="0"/>
             </w:pPr>
+            <w:r>
+              <w:t>2h</w:t>
+            </w:r>
           </w:p>
         </w:tc>
       </w:tr>
@@ -7436,6 +7466,12 @@
                 <w:lang w:val="en-GB"/>
               </w:rPr>
             </w:pPr>
+            <w:r>
+              <w:rPr>
+                <w:lang w:val="en-GB"/>
+              </w:rPr>
+              <w:t>1h</w:t>
+            </w:r>
           </w:p>
         </w:tc>
       </w:tr>
@@ -7505,6 +7541,9 @@
             <w:pPr>
               <w:cnfStyle w:val="000000000000" w:firstRow="0" w:lastRow="0" w:firstColumn="0" w:lastColumn="0" w:oddVBand="0" w:evenVBand="0" w:oddHBand="0" w:evenHBand="0" w:firstRowFirstColumn="0" w:firstRowLastColumn="0" w:lastRowFirstColumn="0" w:lastRowLastColumn="0"/>
             </w:pPr>
+            <w:r>
+              <w:t>2h</w:t>
+            </w:r>
           </w:p>
         </w:tc>
       </w:tr>
@@ -7563,6 +7602,9 @@
             <w:pPr>
               <w:cnfStyle w:val="000000100000" w:firstRow="0" w:lastRow="0" w:firstColumn="0" w:lastColumn="0" w:oddVBand="0" w:evenVBand="0" w:oddHBand="1" w:evenHBand="0" w:firstRowFirstColumn="0" w:firstRowLastColumn="0" w:lastRowFirstColumn="0" w:lastRowLastColumn="0"/>
             </w:pPr>
+            <w:r>
+              <w:t>1h</w:t>
+            </w:r>
           </w:p>
         </w:tc>
       </w:tr>
@@ -7618,6 +7660,9 @@
             <w:pPr>
               <w:cnfStyle w:val="000000000000" w:firstRow="0" w:lastRow="0" w:firstColumn="0" w:lastColumn="0" w:oddVBand="0" w:evenVBand="0" w:oddHBand="0" w:evenHBand="0" w:firstRowFirstColumn="0" w:firstRowLastColumn="0" w:lastRowFirstColumn="0" w:lastRowLastColumn="0"/>
             </w:pPr>
+            <w:r>
+              <w:t>2h</w:t>
+            </w:r>
           </w:p>
         </w:tc>
       </w:tr>
@@ -7716,6 +7761,9 @@
             <w:pPr>
               <w:cnfStyle w:val="000000000000" w:firstRow="0" w:lastRow="0" w:firstColumn="0" w:lastColumn="0" w:oddVBand="0" w:evenVBand="0" w:oddHBand="0" w:evenHBand="0" w:firstRowFirstColumn="0" w:firstRowLastColumn="0" w:lastRowFirstColumn="0" w:lastRowLastColumn="0"/>
             </w:pPr>
+            <w:r>
+              <w:t>1h</w:t>
+            </w:r>
           </w:p>
         </w:tc>
       </w:tr>
@@ -7774,6 +7822,9 @@
             <w:pPr>
               <w:cnfStyle w:val="000000100000" w:firstRow="0" w:lastRow="0" w:firstColumn="0" w:lastColumn="0" w:oddVBand="0" w:evenVBand="0" w:oddHBand="1" w:evenHBand="0" w:firstRowFirstColumn="0" w:firstRowLastColumn="0" w:lastRowFirstColumn="0" w:lastRowLastColumn="0"/>
             </w:pPr>
+            <w:r>
+              <w:t>1h</w:t>
+            </w:r>
           </w:p>
         </w:tc>
       </w:tr>
@@ -7820,6 +7871,9 @@
             <w:pPr>
               <w:cnfStyle w:val="000000000000" w:firstRow="0" w:lastRow="0" w:firstColumn="0" w:lastColumn="0" w:oddVBand="0" w:evenVBand="0" w:oddHBand="0" w:evenHBand="0" w:firstRowFirstColumn="0" w:firstRowLastColumn="0" w:lastRowFirstColumn="0" w:lastRowLastColumn="0"/>
             </w:pPr>
+            <w:r>
+              <w:t>2h</w:t>
+            </w:r>
           </w:p>
         </w:tc>
       </w:tr>
@@ -7869,6 +7923,9 @@
             <w:pPr>
               <w:cnfStyle w:val="000000100000" w:firstRow="0" w:lastRow="0" w:firstColumn="0" w:lastColumn="0" w:oddVBand="0" w:evenVBand="0" w:oddHBand="1" w:evenHBand="0" w:firstRowFirstColumn="0" w:firstRowLastColumn="0" w:lastRowFirstColumn="0" w:lastRowLastColumn="0"/>
             </w:pPr>
+            <w:r>
+              <w:t>1h</w:t>
+            </w:r>
           </w:p>
         </w:tc>
       </w:tr>
@@ -7915,6 +7972,9 @@
             <w:pPr>
               <w:cnfStyle w:val="000000000000" w:firstRow="0" w:lastRow="0" w:firstColumn="0" w:lastColumn="0" w:oddVBand="0" w:evenVBand="0" w:oddHBand="0" w:evenHBand="0" w:firstRowFirstColumn="0" w:firstRowLastColumn="0" w:lastRowFirstColumn="0" w:lastRowLastColumn="0"/>
             </w:pPr>
+            <w:r>
+              <w:t>1h</w:t>
+            </w:r>
           </w:p>
         </w:tc>
       </w:tr>
@@ -7980,6 +8040,9 @@
             <w:pPr>
               <w:cnfStyle w:val="000000100000" w:firstRow="0" w:lastRow="0" w:firstColumn="0" w:lastColumn="0" w:oddVBand="0" w:evenVBand="0" w:oddHBand="1" w:evenHBand="0" w:firstRowFirstColumn="0" w:firstRowLastColumn="0" w:lastRowFirstColumn="0" w:lastRowLastColumn="0"/>
             </w:pPr>
+            <w:r>
+              <w:t>1h</w:t>
+            </w:r>
           </w:p>
         </w:tc>
       </w:tr>
@@ -8457,7 +8520,7 @@
               <w:cnfStyle w:val="000000000000" w:firstRow="0" w:lastRow="0" w:firstColumn="0" w:lastColumn="0" w:oddVBand="0" w:evenVBand="0" w:oddHBand="0" w:evenHBand="0" w:firstRowFirstColumn="0" w:firstRowLastColumn="0" w:lastRowFirstColumn="0" w:lastRowLastColumn="0"/>
             </w:pPr>
             <w:r>
-              <w:t>18</w:t>
+              <w:t>20</w:t>
             </w:r>
             <w:r>
               <w:t>h bis jetzt</w:t>
@@ -8481,6 +8544,13 @@
         </w:rPr>
         <w:t xml:space="preserve">Gesamtaufwand in Stunden: </w:t>
       </w:r>
+      <w:r>
+        <w:rPr>
+          <w:b/>
+          <w:bCs/>
+        </w:rPr>
+        <w:t>90h</w:t>
+      </w:r>
     </w:p>
     <w:p/>
     <w:p/>
@@ -8510,7 +8580,7 @@
           <w:numId w:val="0"/>
         </w:numPr>
       </w:pPr>
-      <w:bookmarkStart w:id="35" w:name="_Toc233147836"/>
+      <w:bookmarkStart w:id="35" w:name="_Toc233202773"/>
       <w:r>
         <w:lastRenderedPageBreak/>
         <w:t>Selbständigkeitserklärung</w:t>
@@ -8558,7 +8628,10 @@
         <w:t xml:space="preserve">Landquart, </w:t>
       </w:r>
       <w:r>
-        <w:t>23</w:t>
+        <w:t>2</w:t>
+      </w:r>
+      <w:r>
+        <w:t>4</w:t>
       </w:r>
       <w:r>
         <w:t>.</w:t>
@@ -8703,7 +8776,7 @@
         </w:numPr>
         <w:ind w:left="454" w:hanging="454"/>
       </w:pPr>
-      <w:bookmarkStart w:id="36" w:name="_Toc233147837"/>
+      <w:bookmarkStart w:id="36" w:name="_Toc233202774"/>
       <w:r>
         <w:lastRenderedPageBreak/>
         <w:t>Abbildungsverzeichnis</w:t>
@@ -9424,7 +9497,7 @@
           <w:numId w:val="0"/>
         </w:numPr>
       </w:pPr>
-      <w:bookmarkStart w:id="37" w:name="_Toc233147838"/>
+      <w:bookmarkStart w:id="37" w:name="_Toc233202775"/>
       <w:r>
         <w:lastRenderedPageBreak/>
         <w:t>Quellenverzeichnis</w:t>
@@ -9576,7 +9649,7 @@
         </w:numPr>
         <w:ind w:left="454" w:hanging="454"/>
       </w:pPr>
-      <w:bookmarkStart w:id="38" w:name="_Toc233147839"/>
+      <w:bookmarkStart w:id="38" w:name="_Toc233202776"/>
       <w:r>
         <w:lastRenderedPageBreak/>
         <w:t>Einsatz von KI-Tools</w:t>
@@ -9617,7 +9690,7 @@
         </w:numPr>
         <w:ind w:left="454" w:hanging="454"/>
       </w:pPr>
-      <w:bookmarkStart w:id="39" w:name="_Toc233147840"/>
+      <w:bookmarkStart w:id="39" w:name="_Toc233202777"/>
       <w:r>
         <w:t>Verwendete KI-Prompts</w:t>
       </w:r>
@@ -12433,7 +12506,9 @@
     <w:rsid w:val="004D67E1"/>
     <w:rsid w:val="004D79EA"/>
     <w:rsid w:val="004E098E"/>
+    <w:rsid w:val="004F002D"/>
     <w:rsid w:val="004F05FE"/>
+    <w:rsid w:val="004F0CCD"/>
     <w:rsid w:val="0052296B"/>
     <w:rsid w:val="005440A0"/>
     <w:rsid w:val="005648AA"/>
@@ -13206,6 +13281,10 @@
 </file>
 
 <file path=customXml/item1.xml><?xml version="1.0" encoding="utf-8"?>
+<b:Sources xmlns:b="http://schemas.openxmlformats.org/officeDocument/2006/bibliography" xmlns="http://schemas.openxmlformats.org/officeDocument/2006/bibliography" SelectedStyle="\APASixthEditionOfficeOnline.xsl" StyleName="APA" Version="6"/>
+</file>
+
+<file path=customXml/item2.xml><?xml version="1.0" encoding="utf-8"?>
 <?mso-contentType ?>
 <FormTemplates xmlns="http://schemas.microsoft.com/sharepoint/v3/contenttype/forms">
   <Display>DocumentLibraryForm</Display>
@@ -13214,11 +13293,18 @@
 </FormTemplates>
 </file>
 
-<file path=customXml/item2.xml><?xml version="1.0" encoding="utf-8"?>
-<b:Sources xmlns:b="http://schemas.openxmlformats.org/officeDocument/2006/bibliography" xmlns="http://schemas.openxmlformats.org/officeDocument/2006/bibliography" SelectedStyle="\APASixthEditionOfficeOnline.xsl" StyleName="APA" Version="6"/>
+<file path=customXml/item3.xml><?xml version="1.0" encoding="utf-8"?>
+<p:properties xmlns:p="http://schemas.microsoft.com/office/2006/metadata/properties" xmlns:xsi="http://www.w3.org/2001/XMLSchema-instance" xmlns:pc="http://schemas.microsoft.com/office/infopath/2007/PartnerControls">
+  <documentManagement>
+    <TaxCatchAll xmlns="e32c9bb7-34f5-44bb-800b-35798843376c" xsi:nil="true"/>
+    <lcf76f155ced4ddcb4097134ff3c332f xmlns="22aa7da5-41f5-464e-85e6-b2dd1761cd70">
+      <Terms xmlns="http://schemas.microsoft.com/office/infopath/2007/PartnerControls"/>
+    </lcf76f155ced4ddcb4097134ff3c332f>
+  </documentManagement>
+</p:properties>
 </file>
 
-<file path=customXml/item3.xml><?xml version="1.0" encoding="utf-8"?>
+<file path=customXml/item4.xml><?xml version="1.0" encoding="utf-8"?>
 <ct:contentTypeSchema xmlns:ct="http://schemas.microsoft.com/office/2006/metadata/contentType" xmlns:ma="http://schemas.microsoft.com/office/2006/metadata/properties/metaAttributes" ct:_="" ma:_="" ma:contentTypeName="Dokument" ma:contentTypeID="0x010100D827C1AAE83348469185F4DE8D8E42AA" ma:contentTypeVersion="18" ma:contentTypeDescription="Ein neues Dokument erstellen." ma:contentTypeScope="" ma:versionID="618348fa32be16a474572d476ed91d7d">
   <xsd:schema xmlns:xsd="http://www.w3.org/2001/XMLSchema" xmlns:xs="http://www.w3.org/2001/XMLSchema" xmlns:p="http://schemas.microsoft.com/office/2006/metadata/properties" xmlns:ns2="22aa7da5-41f5-464e-85e6-b2dd1761cd70" xmlns:ns3="e32c9bb7-34f5-44bb-800b-35798843376c" targetNamespace="http://schemas.microsoft.com/office/2006/metadata/properties" ma:root="true" ma:fieldsID="348e17a0368de80907a02c9ddfbbbd22" ns2:_="" ns3:_="">
     <xsd:import namespace="22aa7da5-41f5-464e-85e6-b2dd1761cd70"/>
@@ -13473,18 +13559,15 @@
 </ct:contentTypeSchema>
 </file>
 
-<file path=customXml/item4.xml><?xml version="1.0" encoding="utf-8"?>
-<p:properties xmlns:p="http://schemas.microsoft.com/office/2006/metadata/properties" xmlns:xsi="http://www.w3.org/2001/XMLSchema-instance" xmlns:pc="http://schemas.microsoft.com/office/infopath/2007/PartnerControls">
-  <documentManagement>
-    <TaxCatchAll xmlns="e32c9bb7-34f5-44bb-800b-35798843376c" xsi:nil="true"/>
-    <lcf76f155ced4ddcb4097134ff3c332f xmlns="22aa7da5-41f5-464e-85e6-b2dd1761cd70">
-      <Terms xmlns="http://schemas.microsoft.com/office/infopath/2007/PartnerControls"/>
-    </lcf76f155ced4ddcb4097134ff3c332f>
-  </documentManagement>
-</p:properties>
+<file path=customXml/itemProps1.xml><?xml version="1.0" encoding="utf-8"?>
+<ds:datastoreItem xmlns:ds="http://schemas.openxmlformats.org/officeDocument/2006/customXml" ds:itemID="{84661881-BC85-4481-9F58-A76FBE332CB1}">
+  <ds:schemaRefs>
+    <ds:schemaRef ds:uri="http://schemas.openxmlformats.org/officeDocument/2006/bibliography"/>
+  </ds:schemaRefs>
+</ds:datastoreItem>
 </file>
 
-<file path=customXml/itemProps1.xml><?xml version="1.0" encoding="utf-8"?>
+<file path=customXml/itemProps2.xml><?xml version="1.0" encoding="utf-8"?>
 <ds:datastoreItem xmlns:ds="http://schemas.openxmlformats.org/officeDocument/2006/customXml" ds:itemID="{B8133326-A9D9-4C20-AED2-57D8DB38EE3B}">
   <ds:schemaRefs>
     <ds:schemaRef ds:uri="http://schemas.microsoft.com/sharepoint/v3/contenttype/forms"/>
@@ -13492,15 +13575,18 @@
 </ds:datastoreItem>
 </file>
 
-<file path=customXml/itemProps2.xml><?xml version="1.0" encoding="utf-8"?>
-<ds:datastoreItem xmlns:ds="http://schemas.openxmlformats.org/officeDocument/2006/customXml" ds:itemID="{84661881-BC85-4481-9F58-A76FBE332CB1}">
+<file path=customXml/itemProps3.xml><?xml version="1.0" encoding="utf-8"?>
+<ds:datastoreItem xmlns:ds="http://schemas.openxmlformats.org/officeDocument/2006/customXml" ds:itemID="{AEB5EB03-E1DB-4DE6-8456-3A44BE197CDE}">
   <ds:schemaRefs>
-    <ds:schemaRef ds:uri="http://schemas.openxmlformats.org/officeDocument/2006/bibliography"/>
+    <ds:schemaRef ds:uri="http://schemas.microsoft.com/office/2006/metadata/properties"/>
+    <ds:schemaRef ds:uri="http://schemas.microsoft.com/office/infopath/2007/PartnerControls"/>
+    <ds:schemaRef ds:uri="e32c9bb7-34f5-44bb-800b-35798843376c"/>
+    <ds:schemaRef ds:uri="22aa7da5-41f5-464e-85e6-b2dd1761cd70"/>
   </ds:schemaRefs>
 </ds:datastoreItem>
 </file>
 
-<file path=customXml/itemProps3.xml><?xml version="1.0" encoding="utf-8"?>
+<file path=customXml/itemProps4.xml><?xml version="1.0" encoding="utf-8"?>
 <ds:datastoreItem xmlns:ds="http://schemas.openxmlformats.org/officeDocument/2006/customXml" ds:itemID="{60D544C4-8D4D-481D-B00F-1F09332EE222}">
   <ds:schemaRefs>
     <ds:schemaRef ds:uri="http://schemas.microsoft.com/office/2006/metadata/contentType"/>
@@ -13517,15 +13603,4 @@
     <ds:schemaRef ds:uri="http://schemas.microsoft.com/internal/obd"/>
   </ds:schemaRefs>
 </ds:datastoreItem>
-</file>
-
-<file path=customXml/itemProps4.xml><?xml version="1.0" encoding="utf-8"?>
-<ds:datastoreItem xmlns:ds="http://schemas.openxmlformats.org/officeDocument/2006/customXml" ds:itemID="{AEB5EB03-E1DB-4DE6-8456-3A44BE197CDE}">
-  <ds:schemaRefs>
-    <ds:schemaRef ds:uri="http://schemas.microsoft.com/office/2006/metadata/properties"/>
-    <ds:schemaRef ds:uri="http://schemas.microsoft.com/office/infopath/2007/PartnerControls"/>
-    <ds:schemaRef ds:uri="e32c9bb7-34f5-44bb-800b-35798843376c"/>
-    <ds:schemaRef ds:uri="22aa7da5-41f5-464e-85e6-b2dd1761cd70"/>
-  </ds:schemaRefs>
-</ds:datastoreItem>
 </file>
</xml_diff>

<commit_message>
Hauptteil erhgaenzun Kapitel 4
</commit_message>
<xml_diff>
--- a/Doc/Dokumentation/Case Study Doku.docx
+++ b/Doc/Dokumentation/Case Study Doku.docx
@@ -1,6 +1,6 @@
 
 <file path=word/document.xml><?xml version="1.0" encoding="utf-8"?>
-<w:document xmlns:wpc="http://schemas.microsoft.com/office/word/2010/wordprocessingCanvas" xmlns:cx="http://schemas.microsoft.com/office/drawing/2014/chartex" xmlns:cx1="http://schemas.microsoft.com/office/drawing/2015/9/8/chartex" xmlns:cx2="http://schemas.microsoft.com/office/drawing/2015/10/21/chartex" xmlns:cx3="http://schemas.microsoft.com/office/drawing/2016/5/9/chartex" xmlns:cx4="http://schemas.microsoft.com/office/drawing/2016/5/10/chartex" xmlns:cx5="http://schemas.microsoft.com/office/drawing/2016/5/11/chartex" xmlns:cx6="http://schemas.microsoft.com/office/drawing/2016/5/12/chartex" xmlns:cx7="http://schemas.microsoft.com/office/drawing/2016/5/13/chartex" xmlns:cx8="http://schemas.microsoft.com/office/drawing/2016/5/14/chartex" xmlns:mc="http://schemas.openxmlformats.org/markup-compatibility/2006" xmlns:m="http://schemas.openxmlformats.org/officeDocument/2006/math" xmlns:aink="http://schemas.microsoft.com/office/drawing/2016/ink" xmlns:am3d="http://schemas.microsoft.com/office/drawing/2017/model3d" xmlns:oel="http://schemas.microsoft.com/office/2019/extlst" xmlns:r="http://schemas.openxmlformats.org/officeDocument/2006/relationships" xmlns:wp14="http://schemas.microsoft.com/office/word/2010/wordprocessingDrawing" xmlns:wp="http://schemas.openxmlformats.org/drawingml/2006/wordprocessingDrawing" xmlns:wpg="http://schemas.microsoft.com/office/word/2010/wordprocessingGroup" xmlns:wpi="http://schemas.microsoft.com/office/word/2010/wordprocessingInk" xmlns:wps="http://schemas.microsoft.com/office/word/2010/wordprocessingShape" xmlns:o="urn:schemas-microsoft-com:office:office" xmlns:v="urn:schemas-microsoft-com:vml" xmlns:w10="urn:schemas-microsoft-com:office:word" xmlns:w="http://schemas.openxmlformats.org/wordprocessingml/2006/main" xmlns:w14="http://schemas.microsoft.com/office/word/2010/wordml" xmlns:w15="http://schemas.microsoft.com/office/word/2012/wordml" xmlns:w16cex="http://schemas.microsoft.com/office/word/2018/wordml/cex" xmlns:w16cid="http://schemas.microsoft.com/office/word/2016/wordml/cid" xmlns:w16="http://schemas.microsoft.com/office/word/2018/wordml" xmlns:w16sdtdh="http://schemas.microsoft.com/office/word/2020/wordml/sdtdatahash" xmlns:w16sdtfl="http://schemas.microsoft.com/office/word/2024/wordml/sdtformatlock" xmlns:w16se="http://schemas.microsoft.com/office/word/2015/wordml/symex" xmlns:w16du="http://schemas.microsoft.com/office/word/2023/wordml/word16du" xmlns:wne="http://schemas.microsoft.com/office/word/2006/wordml" mc:Ignorable="w14 w15 w16se w16cid w16 w16cex w16sdtdh w16sdtfl w16du wp14">
+<w:document xmlns:wpc="http://schemas.microsoft.com/office/word/2010/wordprocessingCanvas" xmlns:cx="http://schemas.microsoft.com/office/drawing/2014/chartex" xmlns:cx1="http://schemas.microsoft.com/office/drawing/2015/9/8/chartex" xmlns:cx2="http://schemas.microsoft.com/office/drawing/2015/10/21/chartex" xmlns:cx3="http://schemas.microsoft.com/office/drawing/2016/5/9/chartex" xmlns:cx4="http://schemas.microsoft.com/office/drawing/2016/5/10/chartex" xmlns:cx5="http://schemas.microsoft.com/office/drawing/2016/5/11/chartex" xmlns:cx6="http://schemas.microsoft.com/office/drawing/2016/5/12/chartex" xmlns:cx7="http://schemas.microsoft.com/office/drawing/2016/5/13/chartex" xmlns:cx8="http://schemas.microsoft.com/office/drawing/2016/5/14/chartex" xmlns:mc="http://schemas.openxmlformats.org/markup-compatibility/2006" xmlns:aink="http://schemas.microsoft.com/office/drawing/2016/ink" xmlns:am3d="http://schemas.microsoft.com/office/drawing/2017/model3d" xmlns:o="urn:schemas-microsoft-com:office:office" xmlns:oel="http://schemas.microsoft.com/office/2019/extlst" xmlns:r="http://schemas.openxmlformats.org/officeDocument/2006/relationships" xmlns:m="http://schemas.openxmlformats.org/officeDocument/2006/math" xmlns:v="urn:schemas-microsoft-com:vml" xmlns:wp14="http://schemas.microsoft.com/office/word/2010/wordprocessingDrawing" xmlns:wp="http://schemas.openxmlformats.org/drawingml/2006/wordprocessingDrawing" xmlns:w10="urn:schemas-microsoft-com:office:word" xmlns:w="http://schemas.openxmlformats.org/wordprocessingml/2006/main" xmlns:w14="http://schemas.microsoft.com/office/word/2010/wordml" xmlns:w15="http://schemas.microsoft.com/office/word/2012/wordml" xmlns:w16cex="http://schemas.microsoft.com/office/word/2018/wordml/cex" xmlns:w16cid="http://schemas.microsoft.com/office/word/2016/wordml/cid" xmlns:w16="http://schemas.microsoft.com/office/word/2018/wordml" xmlns:w16du="http://schemas.microsoft.com/office/word/2023/wordml/word16du" xmlns:w16sdtdh="http://schemas.microsoft.com/office/word/2020/wordml/sdtdatahash" xmlns:w16sdtfl="http://schemas.microsoft.com/office/word/2024/wordml/sdtformatlock" xmlns:w16se="http://schemas.microsoft.com/office/word/2015/wordml/symex" xmlns:wpg="http://schemas.microsoft.com/office/word/2010/wordprocessingGroup" xmlns:wpi="http://schemas.microsoft.com/office/word/2010/wordprocessingInk" xmlns:wne="http://schemas.microsoft.com/office/word/2006/wordml" xmlns:wps="http://schemas.microsoft.com/office/word/2010/wordprocessingShape" mc:Ignorable="w14 w15 w16se w16cid w16 w16cex w16sdtdh w16sdtfl w16du wp14">
   <w:body>
     <w:p>
       <w:pPr>
@@ -350,8 +350,12 @@
           <w:szCs w:val="28"/>
         </w:rPr>
         <w:sectPr>
-          <w:footerReference w:type="default" r:id="rId13"/>
-          <w:footerReference w:type="first" r:id="rId14"/>
+          <w:headerReference w:type="even" r:id="rId13"/>
+          <w:headerReference w:type="default" r:id="rId14"/>
+          <w:footerReference w:type="even" r:id="rId15"/>
+          <w:footerReference w:type="default" r:id="rId16"/>
+          <w:headerReference w:type="first" r:id="rId17"/>
+          <w:footerReference w:type="first" r:id="rId18"/>
           <w:pgSz w:w="11906" w:h="16838"/>
           <w:pgMar w:top="1418" w:right="1134" w:bottom="1134" w:left="1134" w:header="709" w:footer="709" w:gutter="0"/>
           <w:cols w:space="708"/>
@@ -462,15 +466,7 @@
     </w:p>
     <w:p>
       <w:r>
-        <w:t xml:space="preserve">Für die Umsetzung wurde zuerst ein technisches Konzept mit Flussdiagramm, Zustandsautomat, Architekturübersicht und HMI-Skizze erstellt. Auf dieser Grundlage entstand im LASAL </w:t>
-      </w:r>
-      <w:proofErr w:type="spellStart"/>
-      <w:r>
-        <w:t>Machine</w:t>
-      </w:r>
-      <w:proofErr w:type="spellEnd"/>
-      <w:r>
-        <w:t xml:space="preserve"> Manager ein strukturiertes SPS-Projekt mit getrennten Bereichen für Hauptablauf, Aufzugmodul, Sensorik, Türantrieb, Aufzugantrieb und Visualisierung. Die Bedienung und Zustandsanzeige wurden über das HMI umgesetzt, sodass aktuelle Etage, Zieletage, Fahrtrichtung, Türzustand sowie weitere Signale nachvollziehbar dargestellt werden konnten.</w:t>
+        <w:t>Für die Umsetzung wurde zuerst ein technisches Konzept mit Flussdiagramm, Zustandsautomat, Architekturübersicht und HMI-Skizze erstellt. Auf dieser Grundlage entstand im LASAL Machine Manager ein strukturiertes SPS-Projekt mit getrennten Bereichen für Hauptablauf, Aufzugmodul, Sensorik, Türantrieb, Aufzugantrieb und Visualisierung. Die Bedienung und Zustandsanzeige wurden über das HMI umgesetzt, sodass aktuelle Etage, Zieletage, Fahrtrichtung, Türzustand sowie weitere Signale nachvollziehbar dargestellt werden konnten.</w:t>
       </w:r>
     </w:p>
     <w:p>
@@ -517,7 +513,7 @@
       <w:sdtContent>
         <w:p>
           <w:pPr>
-            <w:pStyle w:val="Inhaltsverzeichnisberschrift"/>
+            <w:pStyle w:val="TOCHeading"/>
           </w:pPr>
           <w:r>
             <w:rPr>
@@ -528,7 +524,7 @@
         </w:p>
         <w:p>
           <w:pPr>
-            <w:pStyle w:val="Verzeichnis1"/>
+            <w:pStyle w:val="TOC1"/>
             <w:tabs>
               <w:tab w:val="left" w:pos="480"/>
               <w:tab w:val="right" w:leader="dot" w:pos="9628"/>
@@ -632,7 +628,7 @@
         </w:p>
         <w:p>
           <w:pPr>
-            <w:pStyle w:val="Verzeichnis1"/>
+            <w:pStyle w:val="TOC1"/>
             <w:tabs>
               <w:tab w:val="left" w:pos="480"/>
               <w:tab w:val="right" w:leader="dot" w:pos="9628"/>
@@ -727,7 +723,7 @@
         </w:p>
         <w:p>
           <w:pPr>
-            <w:pStyle w:val="Verzeichnis2"/>
+            <w:pStyle w:val="TOC2"/>
             <w:tabs>
               <w:tab w:val="left" w:pos="960"/>
               <w:tab w:val="right" w:leader="dot" w:pos="9628"/>
@@ -823,7 +819,7 @@
         </w:p>
         <w:p>
           <w:pPr>
-            <w:pStyle w:val="Verzeichnis2"/>
+            <w:pStyle w:val="TOC2"/>
             <w:tabs>
               <w:tab w:val="left" w:pos="960"/>
               <w:tab w:val="right" w:leader="dot" w:pos="9628"/>
@@ -919,7 +915,7 @@
         </w:p>
         <w:p>
           <w:pPr>
-            <w:pStyle w:val="Verzeichnis1"/>
+            <w:pStyle w:val="TOC1"/>
             <w:tabs>
               <w:tab w:val="left" w:pos="480"/>
               <w:tab w:val="right" w:leader="dot" w:pos="9628"/>
@@ -1014,7 +1010,7 @@
         </w:p>
         <w:p>
           <w:pPr>
-            <w:pStyle w:val="Verzeichnis2"/>
+            <w:pStyle w:val="TOC2"/>
             <w:tabs>
               <w:tab w:val="left" w:pos="960"/>
               <w:tab w:val="right" w:leader="dot" w:pos="9628"/>
@@ -1110,7 +1106,7 @@
         </w:p>
         <w:p>
           <w:pPr>
-            <w:pStyle w:val="Verzeichnis2"/>
+            <w:pStyle w:val="TOC2"/>
             <w:tabs>
               <w:tab w:val="left" w:pos="960"/>
               <w:tab w:val="right" w:leader="dot" w:pos="9628"/>
@@ -1206,7 +1202,7 @@
         </w:p>
         <w:p>
           <w:pPr>
-            <w:pStyle w:val="Verzeichnis2"/>
+            <w:pStyle w:val="TOC2"/>
             <w:tabs>
               <w:tab w:val="left" w:pos="960"/>
               <w:tab w:val="right" w:leader="dot" w:pos="9628"/>
@@ -1302,7 +1298,7 @@
         </w:p>
         <w:p>
           <w:pPr>
-            <w:pStyle w:val="Verzeichnis2"/>
+            <w:pStyle w:val="TOC2"/>
             <w:tabs>
               <w:tab w:val="left" w:pos="960"/>
               <w:tab w:val="right" w:leader="dot" w:pos="9628"/>
@@ -1398,7 +1394,7 @@
         </w:p>
         <w:p>
           <w:pPr>
-            <w:pStyle w:val="Verzeichnis2"/>
+            <w:pStyle w:val="TOC2"/>
             <w:tabs>
               <w:tab w:val="left" w:pos="960"/>
               <w:tab w:val="right" w:leader="dot" w:pos="9628"/>
@@ -1494,7 +1490,7 @@
         </w:p>
         <w:p>
           <w:pPr>
-            <w:pStyle w:val="Verzeichnis1"/>
+            <w:pStyle w:val="TOC1"/>
             <w:tabs>
               <w:tab w:val="left" w:pos="480"/>
               <w:tab w:val="right" w:leader="dot" w:pos="9628"/>
@@ -1589,7 +1585,7 @@
         </w:p>
         <w:p>
           <w:pPr>
-            <w:pStyle w:val="Verzeichnis2"/>
+            <w:pStyle w:val="TOC2"/>
             <w:tabs>
               <w:tab w:val="left" w:pos="960"/>
               <w:tab w:val="right" w:leader="dot" w:pos="9628"/>
@@ -1684,7 +1680,7 @@
         </w:p>
         <w:p>
           <w:pPr>
-            <w:pStyle w:val="Verzeichnis2"/>
+            <w:pStyle w:val="TOC2"/>
             <w:tabs>
               <w:tab w:val="left" w:pos="960"/>
               <w:tab w:val="right" w:leader="dot" w:pos="9628"/>
@@ -1779,7 +1775,7 @@
         </w:p>
         <w:p>
           <w:pPr>
-            <w:pStyle w:val="Verzeichnis2"/>
+            <w:pStyle w:val="TOC2"/>
             <w:tabs>
               <w:tab w:val="left" w:pos="960"/>
               <w:tab w:val="right" w:leader="dot" w:pos="9628"/>
@@ -1874,7 +1870,7 @@
         </w:p>
         <w:p>
           <w:pPr>
-            <w:pStyle w:val="Verzeichnis2"/>
+            <w:pStyle w:val="TOC2"/>
             <w:tabs>
               <w:tab w:val="left" w:pos="960"/>
               <w:tab w:val="right" w:leader="dot" w:pos="9628"/>
@@ -1969,7 +1965,7 @@
         </w:p>
         <w:p>
           <w:pPr>
-            <w:pStyle w:val="Verzeichnis2"/>
+            <w:pStyle w:val="TOC2"/>
             <w:tabs>
               <w:tab w:val="left" w:pos="960"/>
               <w:tab w:val="right" w:leader="dot" w:pos="9628"/>
@@ -2064,7 +2060,7 @@
         </w:p>
         <w:p>
           <w:pPr>
-            <w:pStyle w:val="Verzeichnis2"/>
+            <w:pStyle w:val="TOC2"/>
             <w:tabs>
               <w:tab w:val="left" w:pos="960"/>
               <w:tab w:val="right" w:leader="dot" w:pos="9628"/>
@@ -2159,7 +2155,7 @@
         </w:p>
         <w:p>
           <w:pPr>
-            <w:pStyle w:val="Verzeichnis2"/>
+            <w:pStyle w:val="TOC2"/>
             <w:tabs>
               <w:tab w:val="left" w:pos="960"/>
               <w:tab w:val="right" w:leader="dot" w:pos="9628"/>
@@ -2254,7 +2250,7 @@
         </w:p>
         <w:p>
           <w:pPr>
-            <w:pStyle w:val="Verzeichnis2"/>
+            <w:pStyle w:val="TOC2"/>
             <w:tabs>
               <w:tab w:val="left" w:pos="960"/>
               <w:tab w:val="right" w:leader="dot" w:pos="9628"/>
@@ -2349,7 +2345,7 @@
         </w:p>
         <w:p>
           <w:pPr>
-            <w:pStyle w:val="Verzeichnis2"/>
+            <w:pStyle w:val="TOC2"/>
             <w:tabs>
               <w:tab w:val="left" w:pos="960"/>
               <w:tab w:val="right" w:leader="dot" w:pos="9628"/>
@@ -2444,7 +2440,7 @@
         </w:p>
         <w:p>
           <w:pPr>
-            <w:pStyle w:val="Verzeichnis2"/>
+            <w:pStyle w:val="TOC2"/>
             <w:tabs>
               <w:tab w:val="left" w:pos="960"/>
               <w:tab w:val="right" w:leader="dot" w:pos="9628"/>
@@ -2539,7 +2535,7 @@
         </w:p>
         <w:p>
           <w:pPr>
-            <w:pStyle w:val="Verzeichnis2"/>
+            <w:pStyle w:val="TOC2"/>
             <w:tabs>
               <w:tab w:val="left" w:pos="960"/>
               <w:tab w:val="right" w:leader="dot" w:pos="9628"/>
@@ -2634,7 +2630,7 @@
         </w:p>
         <w:p>
           <w:pPr>
-            <w:pStyle w:val="Verzeichnis1"/>
+            <w:pStyle w:val="TOC1"/>
             <w:tabs>
               <w:tab w:val="left" w:pos="480"/>
               <w:tab w:val="right" w:leader="dot" w:pos="9628"/>
@@ -2729,7 +2725,7 @@
         </w:p>
         <w:p>
           <w:pPr>
-            <w:pStyle w:val="Verzeichnis2"/>
+            <w:pStyle w:val="TOC2"/>
             <w:tabs>
               <w:tab w:val="left" w:pos="960"/>
               <w:tab w:val="right" w:leader="dot" w:pos="9628"/>
@@ -2824,7 +2820,7 @@
         </w:p>
         <w:p>
           <w:pPr>
-            <w:pStyle w:val="Verzeichnis2"/>
+            <w:pStyle w:val="TOC2"/>
             <w:tabs>
               <w:tab w:val="left" w:pos="960"/>
               <w:tab w:val="right" w:leader="dot" w:pos="9628"/>
@@ -2919,7 +2915,7 @@
         </w:p>
         <w:p>
           <w:pPr>
-            <w:pStyle w:val="Verzeichnis1"/>
+            <w:pStyle w:val="TOC1"/>
             <w:tabs>
               <w:tab w:val="right" w:leader="dot" w:pos="9628"/>
             </w:tabs>
@@ -2993,7 +2989,7 @@
         </w:p>
         <w:p>
           <w:pPr>
-            <w:pStyle w:val="Verzeichnis1"/>
+            <w:pStyle w:val="TOC1"/>
             <w:tabs>
               <w:tab w:val="right" w:leader="dot" w:pos="9628"/>
             </w:tabs>
@@ -3067,7 +3063,7 @@
         </w:p>
         <w:p>
           <w:pPr>
-            <w:pStyle w:val="Verzeichnis1"/>
+            <w:pStyle w:val="TOC1"/>
             <w:tabs>
               <w:tab w:val="right" w:leader="dot" w:pos="9628"/>
             </w:tabs>
@@ -3141,7 +3137,7 @@
         </w:p>
         <w:p>
           <w:pPr>
-            <w:pStyle w:val="Verzeichnis1"/>
+            <w:pStyle w:val="TOC1"/>
             <w:tabs>
               <w:tab w:val="right" w:leader="dot" w:pos="9628"/>
             </w:tabs>
@@ -3215,7 +3211,7 @@
         </w:p>
         <w:p>
           <w:pPr>
-            <w:pStyle w:val="Verzeichnis1"/>
+            <w:pStyle w:val="TOC1"/>
             <w:tabs>
               <w:tab w:val="right" w:leader="dot" w:pos="9628"/>
             </w:tabs>
@@ -3289,7 +3285,7 @@
         </w:p>
         <w:p>
           <w:pPr>
-            <w:pStyle w:val="Verzeichnis1"/>
+            <w:pStyle w:val="TOC1"/>
             <w:tabs>
               <w:tab w:val="right" w:leader="dot" w:pos="9628"/>
             </w:tabs>
@@ -3363,7 +3359,7 @@
         </w:p>
         <w:p>
           <w:pPr>
-            <w:pStyle w:val="Verzeichnis2"/>
+            <w:pStyle w:val="TOC2"/>
             <w:tabs>
               <w:tab w:val="right" w:leader="dot" w:pos="9615"/>
             </w:tabs>
@@ -3391,7 +3387,7 @@
     </w:sdt>
     <w:p>
       <w:pPr>
-        <w:pStyle w:val="berschrift1"/>
+        <w:pStyle w:val="Heading1"/>
       </w:pPr>
       <w:bookmarkStart w:id="0" w:name="_Toc233202747"/>
       <w:r>
@@ -3419,7 +3415,7 @@
     </w:p>
     <w:p>
       <w:pPr>
-        <w:pStyle w:val="berschrift1"/>
+        <w:pStyle w:val="Heading1"/>
       </w:pPr>
       <w:bookmarkStart w:id="1" w:name="_Toc233202748"/>
       <w:r>
@@ -3453,7 +3449,7 @@
     </w:p>
     <w:p>
       <w:pPr>
-        <w:pStyle w:val="berschrift2"/>
+        <w:pStyle w:val="Heading2"/>
         <w:rPr>
           <w:b w:val="0"/>
           <w:bCs/>
@@ -3500,7 +3496,7 @@
     <w:p/>
     <w:p>
       <w:pPr>
-        <w:pStyle w:val="berschrift2"/>
+        <w:pStyle w:val="Heading2"/>
         <w:rPr>
           <w:b w:val="0"/>
           <w:bCs/>
@@ -3541,7 +3537,7 @@
     </w:p>
     <w:p>
       <w:pPr>
-        <w:pStyle w:val="berschrift1"/>
+        <w:pStyle w:val="Heading1"/>
       </w:pPr>
       <w:bookmarkStart w:id="4" w:name="_Toc233202751"/>
       <w:r>
@@ -3562,7 +3558,7 @@
     </w:p>
     <w:p>
       <w:pPr>
-        <w:pStyle w:val="berschrift2"/>
+        <w:pStyle w:val="Heading2"/>
         <w:rPr>
           <w:b w:val="0"/>
           <w:bCs/>
@@ -3620,7 +3616,7 @@
                     <pic:cNvPicPr/>
                   </pic:nvPicPr>
                   <pic:blipFill>
-                    <a:blip r:embed="rId15">
+                    <a:blip r:embed="rId19">
                       <a:extLst>
                         <a:ext uri="{28A0092B-C50C-407E-A947-70E740481C1C}">
                           <a14:useLocalDpi xmlns:a14="http://schemas.microsoft.com/office/drawing/2010/main" val="0"/>
@@ -3649,7 +3645,7 @@
     </w:p>
     <w:p>
       <w:pPr>
-        <w:pStyle w:val="Beschriftung"/>
+        <w:pStyle w:val="Caption"/>
         <w:jc w:val="center"/>
       </w:pPr>
       <w:bookmarkStart w:id="6" w:name="_Toc233046549"/>
@@ -3680,7 +3676,7 @@
     </w:p>
     <w:p>
       <w:pPr>
-        <w:pStyle w:val="berschrift2"/>
+        <w:pStyle w:val="Heading2"/>
         <w:rPr>
           <w:b w:val="0"/>
           <w:bCs/>
@@ -3737,7 +3733,7 @@
                     <pic:cNvPicPr/>
                   </pic:nvPicPr>
                   <pic:blipFill>
-                    <a:blip r:embed="rId16">
+                    <a:blip r:embed="rId20">
                       <a:extLst>
                         <a:ext uri="{28A0092B-C50C-407E-A947-70E740481C1C}">
                           <a14:useLocalDpi xmlns:a14="http://schemas.microsoft.com/office/drawing/2010/main" val="0"/>
@@ -3766,7 +3762,7 @@
     </w:p>
     <w:p>
       <w:pPr>
-        <w:pStyle w:val="Beschriftung"/>
+        <w:pStyle w:val="Caption"/>
         <w:jc w:val="center"/>
       </w:pPr>
       <w:bookmarkStart w:id="8" w:name="_Toc233046550"/>
@@ -3802,7 +3798,7 @@
     </w:p>
     <w:p>
       <w:pPr>
-        <w:pStyle w:val="berschrift2"/>
+        <w:pStyle w:val="Heading2"/>
         <w:rPr>
           <w:b w:val="0"/>
           <w:bCs/>
@@ -3822,15 +3818,7 @@
     </w:p>
     <w:p>
       <w:r>
-        <w:t xml:space="preserve">Neben dem Ablauf wurde auch die Architektur der Steuerung geplant. Die Architekturzeichnung zeigt, welche Hauptkomponenten im System vorhanden sind und wie sie miteinander verbunden sind. Dabei wird zwischen Hauptablauf, HMI, Aufzug-Modul, Türantrieb, Aufzugantrieb sowie Etagen- und </w:t>
-      </w:r>
-      <w:proofErr w:type="spellStart"/>
-      <w:r>
-        <w:t>Türsensorik</w:t>
-      </w:r>
-      <w:proofErr w:type="spellEnd"/>
-      <w:r>
-        <w:t xml:space="preserve"> unterschieden.</w:t>
+        <w:t>Neben dem Ablauf wurde auch die Architektur der Steuerung geplant. Die Architekturzeichnung zeigt, welche Hauptkomponenten im System vorhanden sind und wie sie miteinander verbunden sind. Dabei wird zwischen Hauptablauf, HMI, Aufzug-Modul, Türantrieb, Aufzugantrieb sowie Etagen- und Türsensorik unterschieden.</w:t>
       </w:r>
     </w:p>
     <w:p>
@@ -3857,7 +3845,7 @@
                     <pic:cNvPicPr/>
                   </pic:nvPicPr>
                   <pic:blipFill rotWithShape="1">
-                    <a:blip r:embed="rId17">
+                    <a:blip r:embed="rId21">
                       <a:extLst>
                         <a:ext uri="{28A0092B-C50C-407E-A947-70E740481C1C}">
                           <a14:useLocalDpi xmlns:a14="http://schemas.microsoft.com/office/drawing/2010/main" val="0"/>
@@ -3895,7 +3883,7 @@
     </w:p>
     <w:p>
       <w:pPr>
-        <w:pStyle w:val="Beschriftung"/>
+        <w:pStyle w:val="Caption"/>
         <w:jc w:val="center"/>
       </w:pPr>
       <w:bookmarkStart w:id="10" w:name="_Toc233046551"/>
@@ -3932,7 +3920,7 @@
     <w:p/>
     <w:p>
       <w:pPr>
-        <w:pStyle w:val="berschrift2"/>
+        <w:pStyle w:val="Heading2"/>
         <w:rPr>
           <w:b w:val="0"/>
           <w:bCs/>
@@ -3962,7 +3950,7 @@
     </w:p>
     <w:p>
       <w:pPr>
-        <w:pStyle w:val="Listenabsatz"/>
+        <w:pStyle w:val="ListParagraph"/>
         <w:numPr>
           <w:ilvl w:val="0"/>
           <w:numId w:val="4"/>
@@ -3974,7 +3962,7 @@
     </w:p>
     <w:p>
       <w:pPr>
-        <w:pStyle w:val="Listenabsatz"/>
+        <w:pStyle w:val="ListParagraph"/>
         <w:numPr>
           <w:ilvl w:val="0"/>
           <w:numId w:val="4"/>
@@ -3986,7 +3974,7 @@
     </w:p>
     <w:p>
       <w:pPr>
-        <w:pStyle w:val="Listenabsatz"/>
+        <w:pStyle w:val="ListParagraph"/>
         <w:numPr>
           <w:ilvl w:val="0"/>
           <w:numId w:val="4"/>
@@ -3998,7 +3986,7 @@
     </w:p>
     <w:p>
       <w:pPr>
-        <w:pStyle w:val="Listenabsatz"/>
+        <w:pStyle w:val="ListParagraph"/>
         <w:numPr>
           <w:ilvl w:val="0"/>
           <w:numId w:val="4"/>
@@ -4010,7 +3998,7 @@
     </w:p>
     <w:p>
       <w:pPr>
-        <w:pStyle w:val="Listenabsatz"/>
+        <w:pStyle w:val="ListParagraph"/>
         <w:numPr>
           <w:ilvl w:val="0"/>
           <w:numId w:val="4"/>
@@ -4022,7 +4010,7 @@
     </w:p>
     <w:p>
       <w:pPr>
-        <w:pStyle w:val="Listenabsatz"/>
+        <w:pStyle w:val="ListParagraph"/>
         <w:numPr>
           <w:ilvl w:val="0"/>
           <w:numId w:val="4"/>
@@ -4034,7 +4022,7 @@
     </w:p>
     <w:p>
       <w:pPr>
-        <w:pStyle w:val="Listenabsatz"/>
+        <w:pStyle w:val="ListParagraph"/>
         <w:numPr>
           <w:ilvl w:val="0"/>
           <w:numId w:val="4"/>
@@ -4068,7 +4056,7 @@
                     <pic:cNvPicPr/>
                   </pic:nvPicPr>
                   <pic:blipFill>
-                    <a:blip r:embed="rId18">
+                    <a:blip r:embed="rId22">
                       <a:extLst>
                         <a:ext uri="{28A0092B-C50C-407E-A947-70E740481C1C}">
                           <a14:useLocalDpi xmlns:a14="http://schemas.microsoft.com/office/drawing/2010/main" val="0"/>
@@ -4097,7 +4085,7 @@
     </w:p>
     <w:p>
       <w:pPr>
-        <w:pStyle w:val="Beschriftung"/>
+        <w:pStyle w:val="Caption"/>
         <w:jc w:val="center"/>
       </w:pPr>
       <w:bookmarkStart w:id="12" w:name="_Toc233046552"/>
@@ -4126,7 +4114,7 @@
     <w:p/>
     <w:p>
       <w:pPr>
-        <w:pStyle w:val="berschrift2"/>
+        <w:pStyle w:val="Heading2"/>
         <w:rPr>
           <w:b w:val="0"/>
           <w:bCs/>
@@ -4155,7 +4143,7 @@
     </w:p>
     <w:p>
       <w:pPr>
-        <w:pStyle w:val="Listenabsatz"/>
+        <w:pStyle w:val="ListParagraph"/>
         <w:numPr>
           <w:ilvl w:val="0"/>
           <w:numId w:val="8"/>
@@ -4167,7 +4155,7 @@
     </w:p>
     <w:p>
       <w:pPr>
-        <w:pStyle w:val="Listenabsatz"/>
+        <w:pStyle w:val="ListParagraph"/>
         <w:numPr>
           <w:ilvl w:val="0"/>
           <w:numId w:val="8"/>
@@ -4179,7 +4167,7 @@
     </w:p>
     <w:p>
       <w:pPr>
-        <w:pStyle w:val="Listenabsatz"/>
+        <w:pStyle w:val="ListParagraph"/>
         <w:numPr>
           <w:ilvl w:val="0"/>
           <w:numId w:val="8"/>
@@ -4191,7 +4179,7 @@
     </w:p>
     <w:p>
       <w:pPr>
-        <w:pStyle w:val="Listenabsatz"/>
+        <w:pStyle w:val="ListParagraph"/>
         <w:numPr>
           <w:ilvl w:val="0"/>
           <w:numId w:val="8"/>
@@ -4203,7 +4191,7 @@
     </w:p>
     <w:p>
       <w:pPr>
-        <w:pStyle w:val="Listenabsatz"/>
+        <w:pStyle w:val="ListParagraph"/>
         <w:numPr>
           <w:ilvl w:val="0"/>
           <w:numId w:val="8"/>
@@ -4215,7 +4203,7 @@
     </w:p>
     <w:p>
       <w:pPr>
-        <w:pStyle w:val="Listenabsatz"/>
+        <w:pStyle w:val="ListParagraph"/>
         <w:numPr>
           <w:ilvl w:val="0"/>
           <w:numId w:val="8"/>
@@ -4227,7 +4215,7 @@
     </w:p>
     <w:p>
       <w:pPr>
-        <w:pStyle w:val="Listenabsatz"/>
+        <w:pStyle w:val="ListParagraph"/>
         <w:numPr>
           <w:ilvl w:val="0"/>
           <w:numId w:val="8"/>
@@ -4239,7 +4227,7 @@
     </w:p>
     <w:p>
       <w:pPr>
-        <w:pStyle w:val="Listenabsatz"/>
+        <w:pStyle w:val="ListParagraph"/>
         <w:numPr>
           <w:ilvl w:val="0"/>
           <w:numId w:val="8"/>
@@ -4251,7 +4239,7 @@
     </w:p>
     <w:p>
       <w:pPr>
-        <w:pStyle w:val="Listenabsatz"/>
+        <w:pStyle w:val="ListParagraph"/>
         <w:numPr>
           <w:ilvl w:val="0"/>
           <w:numId w:val="8"/>
@@ -4269,7 +4257,7 @@
     </w:p>
     <w:p>
       <w:pPr>
-        <w:pStyle w:val="berschrift1"/>
+        <w:pStyle w:val="Heading1"/>
       </w:pPr>
       <w:bookmarkStart w:id="14" w:name="_Toc233202757"/>
       <w:r>
@@ -4279,7 +4267,7 @@
     </w:p>
     <w:p>
       <w:pPr>
-        <w:pStyle w:val="berschrift2"/>
+        <w:pStyle w:val="Heading2"/>
       </w:pPr>
       <w:bookmarkStart w:id="15" w:name="_Toc233202758"/>
       <w:r>
@@ -4289,45 +4277,13 @@
     </w:p>
     <w:p>
       <w:r>
-        <w:t xml:space="preserve">Nachdem die Analyse und die Planung abgeschlossen waren, wurde als erster Umsetzungsschritt das SPS-Projekt aufgebaut. Dafür wurde im LASAL </w:t>
-      </w:r>
-      <w:proofErr w:type="spellStart"/>
-      <w:r>
-        <w:t>Machine</w:t>
-      </w:r>
-      <w:proofErr w:type="spellEnd"/>
-      <w:r>
-        <w:t xml:space="preserve"> Manager eine neue Solution erstellt, in der die CP112-Steuerung und das HMI gemeinsam verwaltet werden. Damit war die Grundstruktur vorhanden, um später die SPS-Logik, die Antriebe und die Visualisierung im gleichen Projekt weiterzuentwickeln.</w:t>
-      </w:r>
-    </w:p>
-    <w:p/>
-    <w:p>
-      <w:r>
-        <w:t xml:space="preserve">Anschliessend wurde das Projekt in das gemeinsame GitHub-Repository hochgeladen, auf das beide Projektmitglieder Zugriff hatten. Die Repository-Struktur wurde in die Ordner Doc und </w:t>
-      </w:r>
-      <w:proofErr w:type="spellStart"/>
-      <w:r>
-        <w:t>src</w:t>
-      </w:r>
-      <w:proofErr w:type="spellEnd"/>
-      <w:r>
-        <w:t xml:space="preserve"> aufgeteilt. Im Ordner Doc wurden die Dokumentation, Aufgabenstellung und Analyse abgelegt. Im Ordner </w:t>
-      </w:r>
-      <w:proofErr w:type="spellStart"/>
-      <w:r>
-        <w:t>src</w:t>
-      </w:r>
-      <w:proofErr w:type="spellEnd"/>
-      <w:r>
-        <w:t xml:space="preserve"> befanden sich die LASAL-Projektdateien für SPS und HMI. Zusätzlich wurden eine .gitignore- und eine .</w:t>
-      </w:r>
-      <w:proofErr w:type="spellStart"/>
-      <w:r>
-        <w:t>gitattributes</w:t>
-      </w:r>
-      <w:proofErr w:type="spellEnd"/>
-      <w:r>
-        <w:t>-Datei ergänzt, damit die LASAL-Dateien sauber versioniert werden konnten.</w:t>
+        <w:t>Nachdem die Analyse und die Planung abgeschlossen waren, wurde als erster Umsetzungsschritt das SPS-Projekt aufgebaut. Dafür wurde im LASAL Machine Manager eine neue Solution erstellt, in der die CP112-Steuerung und das HMI gemeinsam verwaltet werden. Damit war die Grundstruktur vorhanden, um später die SPS-Logik, die Antriebe und die Visualisierung im gleichen Projekt weiterzuentwickeln.</w:t>
+      </w:r>
+    </w:p>
+    <w:p/>
+    <w:p>
+      <w:r>
+        <w:t>Anschliessend wurde das Projekt in das gemeinsame GitHub-Repository hochgeladen, auf das beide Projektmitglieder Zugriff hatten. Die Repository-Struktur wurde in die Ordner Doc und src aufgeteilt. Im Ordner Doc wurden die Dokumentation, Aufgabenstellung und Analyse abgelegt. Im Ordner src befanden sich die LASAL-Projektdateien für SPS und HMI. Zusätzlich wurden eine .gitignore- und eine .gitattributes-Datei ergänzt, damit die LASAL-Dateien sauber versioniert werden konnten.</w:t>
       </w:r>
     </w:p>
     <w:p/>
@@ -4343,7 +4299,7 @@
         </w:rPr>
         <w:lastRenderedPageBreak/>
         <w:drawing>
-          <wp:inline distT="0" distB="0" distL="0" distR="0" wp14:anchorId="54625FE5" wp14:editId="307D0D68">
+          <wp:inline distT="0" distB="0" distL="0" distR="0" wp14:anchorId="54625FE5" wp14:editId="1F011E6D">
             <wp:extent cx="6120130" cy="1140460"/>
             <wp:effectExtent l="0" t="0" r="1270" b="2540"/>
             <wp:docPr id="1795454183" name="Grafik 2" descr="Benutzeranhang"/>
@@ -4360,7 +4316,7 @@
                     </pic:cNvPicPr>
                   </pic:nvPicPr>
                   <pic:blipFill>
-                    <a:blip r:embed="rId19" cstate="print">
+                    <a:blip r:embed="rId23" cstate="print">
                       <a:extLst>
                         <a:ext uri="{28A0092B-C50C-407E-A947-70E740481C1C}">
                           <a14:useLocalDpi xmlns:a14="http://schemas.microsoft.com/office/drawing/2010/main" val="0"/>
@@ -4394,7 +4350,7 @@
     </w:p>
     <w:p>
       <w:pPr>
-        <w:pStyle w:val="Beschriftung"/>
+        <w:pStyle w:val="Caption"/>
         <w:jc w:val="center"/>
       </w:pPr>
       <w:bookmarkStart w:id="16" w:name="_Toc233046553"/>
@@ -4413,18 +4369,13 @@
         <w:t xml:space="preserve">: </w:t>
       </w:r>
       <w:r>
-        <w:t>Ordnerstruktur des GitHub-</w:t>
-      </w:r>
-      <w:proofErr w:type="spellStart"/>
-      <w:r>
-        <w:t>Repositorys</w:t>
+        <w:t>Ordnerstruktur des GitHub-Repositorys</w:t>
       </w:r>
       <w:bookmarkEnd w:id="16"/>
-      <w:proofErr w:type="spellEnd"/>
-    </w:p>
-    <w:p>
-      <w:pPr>
-        <w:pStyle w:val="berschrift2"/>
+    </w:p>
+    <w:p>
+      <w:pPr>
+        <w:pStyle w:val="Heading2"/>
       </w:pPr>
       <w:bookmarkStart w:id="17" w:name="_Toc233202759"/>
       <w:r>
@@ -4434,20 +4385,12 @@
     </w:p>
     <w:p>
       <w:r>
-        <w:t xml:space="preserve">Nachdem das Repository erstellt war, wurde es auf den verschiedenen Arbeitsrechnern sowie auf einer Virtual </w:t>
-      </w:r>
-      <w:proofErr w:type="spellStart"/>
-      <w:r>
-        <w:t>Machine</w:t>
-      </w:r>
-      <w:proofErr w:type="spellEnd"/>
-      <w:r>
-        <w:t xml:space="preserve"> geklont. Damit wurde überprüft, ob alle Projektdateien korrekt heruntergeladen werden und ob die Zusammenarbeit über Git funktioniert. Der Test war erfolgreich, sodass beide Projektmitglieder mit dem gleichen Projektstand weiterarbeiten konnten.</w:t>
-      </w:r>
-    </w:p>
-    <w:p>
-      <w:pPr>
-        <w:pStyle w:val="berschrift2"/>
+        <w:t>Nachdem das Repository erstellt war, wurde es auf den verschiedenen Arbeitsrechnern sowie auf einer Virtual Machine geklont. Damit wurde überprüft, ob alle Projektdateien korrekt heruntergeladen werden und ob die Zusammenarbeit über Git funktioniert. Der Test war erfolgreich, sodass beide Projektmitglieder mit dem gleichen Projektstand weiterarbeiten konnten.</w:t>
+      </w:r>
+    </w:p>
+    <w:p>
+      <w:pPr>
+        <w:pStyle w:val="Heading2"/>
       </w:pPr>
       <w:bookmarkStart w:id="18" w:name="_Toc233202760"/>
       <w:r>
@@ -4457,15 +4400,7 @@
     </w:p>
     <w:p>
       <w:r>
-        <w:t xml:space="preserve">nach dem erfolgreichen Git-Test wurde die in der Analyse geplante Softwarearchitektur in LASAL übernommen. Dafür wurden die grundlegenden Klassen des SPS-Projekts erstellt und im Hauptnetzwerk miteinander verbunden. Dazu gehörten unter anderem die HMI-Klasse, der Hauptablauf, das Aufzugmodul, die Etagen- und </w:t>
-      </w:r>
-      <w:proofErr w:type="spellStart"/>
-      <w:r>
-        <w:t>Türsensorik</w:t>
-      </w:r>
-      <w:proofErr w:type="spellEnd"/>
-      <w:r>
-        <w:t xml:space="preserve"> sowie die Antriebe.</w:t>
+        <w:t>nach dem erfolgreichen Git-Test wurde die in der Analyse geplante Softwarearchitektur in LASAL übernommen. Dafür wurden die grundlegenden Klassen des SPS-Projekts erstellt und im Hauptnetzwerk miteinander verbunden. Dazu gehörten unter anderem die HMI-Klasse, der Hauptablauf, das Aufzugmodul, die Etagen- und Türsensorik sowie die Antriebe.</w:t>
       </w:r>
     </w:p>
     <w:p/>
@@ -4517,7 +4452,7 @@
                     </pic:cNvPicPr>
                   </pic:nvPicPr>
                   <pic:blipFill>
-                    <a:blip r:embed="rId20" cstate="print">
+                    <a:blip r:embed="rId24" cstate="print">
                       <a:extLst>
                         <a:ext uri="{28A0092B-C50C-407E-A947-70E740481C1C}">
                           <a14:useLocalDpi xmlns:a14="http://schemas.microsoft.com/office/drawing/2010/main" val="0"/>
@@ -4551,7 +4486,7 @@
     </w:p>
     <w:p>
       <w:pPr>
-        <w:pStyle w:val="Beschriftung"/>
+        <w:pStyle w:val="Caption"/>
         <w:jc w:val="center"/>
       </w:pPr>
       <w:bookmarkStart w:id="19" w:name="_Toc233046554"/>
@@ -4576,7 +4511,7 @@
     </w:p>
     <w:p>
       <w:pPr>
-        <w:pStyle w:val="berschrift2"/>
+        <w:pStyle w:val="Heading2"/>
       </w:pPr>
       <w:bookmarkStart w:id="20" w:name="_Toc233202761"/>
       <w:r>
@@ -4633,7 +4568,7 @@
                     <pic:cNvPicPr/>
                   </pic:nvPicPr>
                   <pic:blipFill rotWithShape="1">
-                    <a:blip r:embed="rId21"/>
+                    <a:blip r:embed="rId25"/>
                     <a:srcRect r="3809"/>
                     <a:stretch>
                       <a:fillRect/>
@@ -4665,7 +4600,7 @@
     </w:p>
     <w:p>
       <w:pPr>
-        <w:pStyle w:val="Beschriftung"/>
+        <w:pStyle w:val="Caption"/>
         <w:jc w:val="center"/>
       </w:pPr>
       <w:bookmarkStart w:id="21" w:name="_Toc233046555"/>
@@ -4692,7 +4627,7 @@
     <w:p/>
     <w:p>
       <w:pPr>
-        <w:pStyle w:val="berschrift2"/>
+        <w:pStyle w:val="Heading2"/>
       </w:pPr>
       <w:bookmarkStart w:id="22" w:name="_Toc233202762"/>
       <w:r>
@@ -4701,57 +4636,648 @@
       </w:r>
       <w:bookmarkEnd w:id="22"/>
     </w:p>
-    <w:p/>
-    <w:p>
-      <w:pPr>
-        <w:pStyle w:val="berschrift2"/>
+    <w:p>
+      <w:pPr>
+        <w:pStyle w:val="NormalWeb"/>
+        <w:rPr>
+          <w:rFonts w:ascii="Arial" w:hAnsi="Arial" w:cs="Arial"/>
+        </w:rPr>
       </w:pPr>
       <w:bookmarkStart w:id="23" w:name="_Toc233202763"/>
       <w:r>
+        <w:rPr>
+          <w:rFonts w:ascii="Arial" w:hAnsi="Arial" w:cs="Arial"/>
+        </w:rPr>
+        <w:t>Für die Simulation der Rückmeldungen wurden eigene Sensorikklassen erstellt. Dabei wurde zwischen der Türsensorik und der Etagensensorik unterschieden, damit die Sensorik sauber von der eigentlichen Ablaufsteuerung getrennt bleibt.</w:t>
+      </w:r>
+    </w:p>
+    <w:p>
+      <w:pPr>
+        <w:pStyle w:val="NormalWeb"/>
+        <w:rPr>
+          <w:rFonts w:ascii="Arial" w:hAnsi="Arial" w:cs="Arial"/>
+        </w:rPr>
+      </w:pPr>
+      <w:r>
+        <w:rPr>
+          <w:rFonts w:ascii="Arial" w:hAnsi="Arial" w:cs="Arial"/>
+        </w:rPr>
+        <w:t xml:space="preserve">Für die Türsensorik wurde die Klasse </w:t>
+      </w:r>
+      <w:r>
+        <w:rPr>
+          <w:rStyle w:val="HTMLCode"/>
+          <w:rFonts w:ascii="Arial" w:hAnsi="Arial" w:cs="Arial"/>
+        </w:rPr>
+        <w:t>clsTuersensorik</w:t>
+      </w:r>
+      <w:r>
+        <w:rPr>
+          <w:rFonts w:ascii="Arial" w:hAnsi="Arial" w:cs="Arial"/>
+        </w:rPr>
+        <w:t xml:space="preserve"> erstellt. Diese simuliert die Endlagen „Tür offen“ und „Tür geschlossen“. Da keine echten Endlagensensoren verwendet wurden, wird die Verfahrzeit mit einem </w:t>
+      </w:r>
+      <w:r>
+        <w:rPr>
+          <w:rStyle w:val="HTMLCode"/>
+          <w:rFonts w:ascii="Arial" w:hAnsi="Arial" w:cs="Arial"/>
+        </w:rPr>
+        <w:t>clsTimer</w:t>
+      </w:r>
+      <w:r>
+        <w:rPr>
+          <w:rFonts w:ascii="Arial" w:hAnsi="Arial" w:cs="Arial"/>
+        </w:rPr>
+        <w:t xml:space="preserve"> nachgebildet. Beim Methodenaufruf wird jeweils eine boolesche Variable für die Bewegung „auf“ oder „zu“ übergeben.</w:t>
+      </w:r>
+    </w:p>
+    <w:p>
+      <w:pPr>
+        <w:pStyle w:val="NormalWeb"/>
+        <w:rPr>
+          <w:rFonts w:ascii="Arial" w:hAnsi="Arial" w:cs="Arial"/>
+        </w:rPr>
+      </w:pPr>
+      <w:r>
+        <w:rPr>
+          <w:rFonts w:ascii="Arial" w:hAnsi="Arial" w:cs="Arial"/>
+        </w:rPr>
+        <w:t xml:space="preserve">Für die Etagenrückmeldung wurde die Klasse </w:t>
+      </w:r>
+      <w:r>
+        <w:rPr>
+          <w:rStyle w:val="HTMLCode"/>
+          <w:rFonts w:ascii="Arial" w:hAnsi="Arial" w:cs="Arial"/>
+        </w:rPr>
+        <w:t>clsEtagensensorik</w:t>
+      </w:r>
+      <w:r>
+        <w:rPr>
+          <w:rFonts w:ascii="Arial" w:hAnsi="Arial" w:cs="Arial"/>
+        </w:rPr>
+        <w:t xml:space="preserve"> umgesetzt. Auch hier wird ein </w:t>
+      </w:r>
+      <w:r>
+        <w:rPr>
+          <w:rStyle w:val="HTMLCode"/>
+          <w:rFonts w:ascii="Arial" w:hAnsi="Arial" w:cs="Arial"/>
+        </w:rPr>
+        <w:t>clsTimer</w:t>
+      </w:r>
+      <w:r>
+        <w:rPr>
+          <w:rFonts w:ascii="Arial" w:hAnsi="Arial" w:cs="Arial"/>
+        </w:rPr>
+        <w:t xml:space="preserve"> verwendet, um das Erreichen einer Etage nach einer definierten Fahrzeit zu simulieren. Die Verfahrzeit ist als Client parametrierbar und kann dadurch ohne Änderung der Programmlogik angepasst werden.</w:t>
+      </w:r>
+    </w:p>
+    <w:p>
+      <w:pPr>
+        <w:pStyle w:val="NormalWeb"/>
+        <w:rPr>
+          <w:rFonts w:ascii="Arial" w:hAnsi="Arial" w:cs="Arial"/>
+        </w:rPr>
+      </w:pPr>
+      <w:r>
+        <w:rPr>
+          <w:rFonts w:ascii="Arial" w:hAnsi="Arial" w:cs="Arial"/>
+        </w:rPr>
+        <w:t>Damit erhält die Hauptsteuerung klare Rückmeldungen wie „Tür offen“, „Tür geschlossen“ oder „Etage erreicht“.</w:t>
+      </w:r>
+    </w:p>
+    <w:p>
+      <w:pPr>
+        <w:pStyle w:val="Heading2"/>
+        <w:rPr>
+          <w:rFonts w:cs="Arial"/>
+        </w:rPr>
+      </w:pPr>
+      <w:r>
+        <w:rPr>
+          <w:rFonts w:cs="Arial"/>
+        </w:rPr>
         <w:t>Umsetzung der Hauptsteuerung</w:t>
       </w:r>
       <w:bookmarkEnd w:id="23"/>
     </w:p>
-    <w:p/>
-    <w:p>
-      <w:pPr>
-        <w:pStyle w:val="berschrift2"/>
+    <w:p>
+      <w:pPr>
+        <w:pStyle w:val="NormalWeb"/>
+        <w:rPr>
+          <w:rFonts w:ascii="Arial" w:hAnsi="Arial" w:cs="Arial"/>
+        </w:rPr>
+      </w:pPr>
+      <w:r>
+        <w:rPr>
+          <w:rFonts w:ascii="Arial" w:hAnsi="Arial" w:cs="Arial"/>
+        </w:rPr>
+        <w:t xml:space="preserve">Der </w:t>
+      </w:r>
+      <w:r>
+        <w:rPr>
+          <w:rStyle w:val="HTMLCode"/>
+          <w:rFonts w:ascii="Arial" w:hAnsi="Arial" w:cs="Arial"/>
+        </w:rPr>
+        <w:t>clsHauptablauf</w:t>
+      </w:r>
+      <w:r>
+        <w:rPr>
+          <w:rFonts w:ascii="Arial" w:hAnsi="Arial" w:cs="Arial"/>
+        </w:rPr>
+        <w:t xml:space="preserve"> wurde als zentraler Datenknotenpunkt zwischen HMI und Aufzugmodul umgesetzt. In dieser Klasse werden die Etagenanforderungen gespeichert, abgefragt und bei Bedarf gelöscht.</w:t>
+      </w:r>
+    </w:p>
+    <w:p>
+      <w:pPr>
+        <w:pStyle w:val="NormalWeb"/>
+        <w:rPr>
+          <w:rFonts w:ascii="Arial" w:hAnsi="Arial" w:cs="Arial"/>
+        </w:rPr>
+      </w:pPr>
+      <w:r>
+        <w:rPr>
+          <w:rFonts w:ascii="Arial" w:hAnsi="Arial" w:cs="Arial"/>
+        </w:rPr>
+        <w:t xml:space="preserve">Die Anforderungen werden über Methoden abgefragt. Dabei wird jeweils ein boolescher Parameter übergeben. Ist dieser Parameter </w:t>
+      </w:r>
+      <w:r>
+        <w:rPr>
+          <w:rStyle w:val="HTMLCode"/>
+          <w:rFonts w:ascii="Arial" w:hAnsi="Arial" w:cs="Arial"/>
+        </w:rPr>
+        <w:t>FALSE</w:t>
+      </w:r>
+      <w:r>
+        <w:rPr>
+          <w:rFonts w:ascii="Arial" w:hAnsi="Arial" w:cs="Arial"/>
+        </w:rPr>
+        <w:t xml:space="preserve">, wird die Anforderung nur gelesen. Ist er </w:t>
+      </w:r>
+      <w:r>
+        <w:rPr>
+          <w:rStyle w:val="HTMLCode"/>
+          <w:rFonts w:ascii="Arial" w:hAnsi="Arial" w:cs="Arial"/>
+        </w:rPr>
+        <w:t>TRUE</w:t>
+      </w:r>
+      <w:r>
+        <w:rPr>
+          <w:rFonts w:ascii="Arial" w:hAnsi="Arial" w:cs="Arial"/>
+        </w:rPr>
+        <w:t>, wird die entsprechende Anforderung nach der Abfrage zurückgesetzt.</w:t>
+      </w:r>
+    </w:p>
+    <w:p>
+      <w:pPr>
+        <w:pStyle w:val="NormalWeb"/>
+        <w:rPr>
+          <w:rFonts w:ascii="Arial" w:hAnsi="Arial" w:cs="Arial"/>
+        </w:rPr>
+      </w:pPr>
+      <w:r>
+        <w:rPr>
+          <w:rFonts w:ascii="Arial" w:hAnsi="Arial" w:cs="Arial"/>
+        </w:rPr>
+        <w:t xml:space="preserve">Das Setzen der Anforderungen erfolgt über die Klasse </w:t>
+      </w:r>
+      <w:r>
+        <w:rPr>
+          <w:rStyle w:val="HTMLCode"/>
+          <w:rFonts w:ascii="Arial" w:hAnsi="Arial" w:cs="Arial"/>
+        </w:rPr>
+        <w:t>clsHMI</w:t>
+      </w:r>
+      <w:r>
+        <w:rPr>
+          <w:rFonts w:ascii="Arial" w:hAnsi="Arial" w:cs="Arial"/>
+        </w:rPr>
+        <w:t>. Dort werden die Taster im zyklischen Task über eine Flankenerkennung ausgewertet und anschliessend an den Hauptablauf weitergegeben.</w:t>
+      </w:r>
+    </w:p>
+    <w:p>
+      <w:pPr>
+        <w:pStyle w:val="Heading2"/>
+        <w:rPr>
+          <w:rFonts w:cs="Arial"/>
+        </w:rPr>
       </w:pPr>
       <w:bookmarkStart w:id="24" w:name="_Toc233202764"/>
       <w:r>
+        <w:rPr>
+          <w:rFonts w:cs="Arial"/>
+        </w:rPr>
         <w:t>Schrittkette der Aufzugsteuerung</w:t>
       </w:r>
       <w:bookmarkEnd w:id="24"/>
     </w:p>
-    <w:p/>
-    <w:p>
-      <w:pPr>
-        <w:pStyle w:val="berschrift2"/>
+    <w:p>
+      <w:pPr>
+        <w:pStyle w:val="NormalWeb"/>
+        <w:rPr>
+          <w:rFonts w:ascii="Arial" w:hAnsi="Arial" w:cs="Arial"/>
+        </w:rPr>
+      </w:pPr>
+      <w:r>
+        <w:rPr>
+          <w:rFonts w:ascii="Arial" w:hAnsi="Arial" w:cs="Arial"/>
+        </w:rPr>
+        <w:t xml:space="preserve">Die eigentliche Ablaufsteuerung des Aufzugs wurde als Schrittkette umgesetzt. Dabei wird der aktuelle Zustand über eine Schrittvariable verwaltet und in einer </w:t>
+      </w:r>
+      <w:r>
+        <w:rPr>
+          <w:rStyle w:val="HTMLCode"/>
+          <w:rFonts w:ascii="Arial" w:hAnsi="Arial" w:cs="Arial"/>
+        </w:rPr>
+        <w:t>CASE</w:t>
+      </w:r>
+      <w:r>
+        <w:rPr>
+          <w:rFonts w:ascii="Arial" w:hAnsi="Arial" w:cs="Arial"/>
+        </w:rPr>
+        <w:t>-Struktur verarbeitet. Dadurch bleibt klar ersichtlich, in welchem Zustand sich die Anlage gerade befindet.</w:t>
+      </w:r>
+    </w:p>
+    <w:p>
+      <w:pPr>
+        <w:pStyle w:val="NormalWeb"/>
+        <w:rPr>
+          <w:rFonts w:ascii="Arial" w:hAnsi="Arial" w:cs="Arial"/>
+        </w:rPr>
+      </w:pPr>
+      <w:r>
+        <w:rPr>
+          <w:rFonts w:ascii="Arial" w:hAnsi="Arial" w:cs="Arial"/>
+        </w:rPr>
+        <w:t>Die Schrittkette prüft zuerst, ob eine Etagenanforderung vorhanden ist. Danach wird die aktuelle Etage mit der Zieletage verglichen und die Fahrtrichtung bestimmt. Bevor der Aufzug fährt, wird geprüft, ob die Tür geschlossen ist. Erst danach wird der Aufzugantrieb gestartet.</w:t>
+      </w:r>
+    </w:p>
+    <w:p>
+      <w:pPr>
+        <w:pStyle w:val="NormalWeb"/>
+        <w:rPr>
+          <w:rFonts w:ascii="Arial" w:hAnsi="Arial" w:cs="Arial"/>
+        </w:rPr>
+      </w:pPr>
+      <w:r>
+        <w:rPr>
+          <w:rFonts w:ascii="Arial" w:hAnsi="Arial" w:cs="Arial"/>
+        </w:rPr>
+        <w:t>Sobald die gewünschte Etage erreicht ist, wird der Aufzug gestoppt und die Tür geöffnet. Nach der Offenhaltezeit wird die Tür wieder geschlossen. Erst nach erfolgreichem Schliessen der Tür wird die erledigte Etagenanforderung im Hauptablauf gelöscht.</w:t>
+      </w:r>
+    </w:p>
+    <w:p>
+      <w:pPr>
+        <w:pStyle w:val="NormalWeb"/>
+        <w:rPr>
+          <w:rFonts w:ascii="Arial" w:hAnsi="Arial" w:cs="Arial"/>
+        </w:rPr>
+      </w:pPr>
+      <w:r>
+        <w:rPr>
+          <w:rFonts w:ascii="Arial" w:hAnsi="Arial" w:cs="Arial"/>
+        </w:rPr>
+        <w:lastRenderedPageBreak/>
+        <w:t>Zusätzlich wurde in der Schrittkette bereits die Funktion „Tür auf“ integriert. Diese kann auch als Reaktion auf die Lichtschranke verwendet werden. Wird die Lichtschranke ausgelöst, kann damit das Schliessen der Tür unterbrochen und die Tür wieder geöffnet werden.</w:t>
+      </w:r>
+    </w:p>
+    <w:p>
+      <w:pPr>
+        <w:pStyle w:val="NormalWeb"/>
+        <w:rPr>
+          <w:rFonts w:ascii="Arial" w:hAnsi="Arial" w:cs="Arial"/>
+        </w:rPr>
+      </w:pPr>
+      <w:r>
+        <w:rPr>
+          <w:rFonts w:ascii="Arial" w:hAnsi="Arial" w:cs="Arial"/>
+        </w:rPr>
+        <w:t>Ein bekanntes Problem besteht bei der simulierten Türzeit. Da die Türbewegung über eine feste Simulationszeit abgebildet wird, wäre ein dynamisches Verkürzen oder direktes Abbrechen der laufenden Türbewegung aufwendig umzusetzen. Deshalb läuft die simulierte Türbewegung auch nach einem frühzeitigen Tür-auf-Befehl noch kurz nach, bevor der neue Zustand vollständig übernommen wird.</w:t>
+      </w:r>
+    </w:p>
+    <w:p>
+      <w:pPr>
+        <w:pStyle w:val="Heading2"/>
+        <w:rPr>
+          <w:rFonts w:cs="Arial"/>
+        </w:rPr>
       </w:pPr>
       <w:bookmarkStart w:id="25" w:name="_Toc233202765"/>
       <w:r>
-        <w:t>Ansteuerung von Aufzug- und Türantrieb</w:t>
+        <w:rPr>
+          <w:rFonts w:cs="Arial"/>
+        </w:rPr>
+        <w:t>Ansteuerung von Aufzug- und Türantri</w:t>
       </w:r>
       <w:bookmarkEnd w:id="25"/>
-    </w:p>
-    <w:p/>
-    <w:p>
-      <w:pPr>
-        <w:pStyle w:val="berschrift2"/>
-      </w:pPr>
-      <w:r>
+      <w:r>
+        <w:rPr>
+          <w:rFonts w:cs="Arial"/>
+        </w:rPr>
+        <w:t>eb</w:t>
+      </w:r>
+    </w:p>
+    <w:p>
+      <w:pPr>
+        <w:pStyle w:val="NormalWeb"/>
+        <w:rPr>
+          <w:rFonts w:ascii="Arial" w:hAnsi="Arial" w:cs="Arial"/>
+        </w:rPr>
+      </w:pPr>
+      <w:r>
+        <w:rPr>
+          <w:rFonts w:ascii="Arial" w:hAnsi="Arial" w:cs="Arial"/>
+        </w:rPr>
+        <w:t xml:space="preserve">Für die Ansteuerung der Antriebe wurde zuerst geprüft, ob die Fahrbewegung mit der Funktion </w:t>
+      </w:r>
+      <w:r>
+        <w:rPr>
+          <w:rStyle w:val="HTMLCode"/>
+          <w:rFonts w:ascii="Arial" w:hAnsi="Arial" w:cs="Arial"/>
+        </w:rPr>
+        <w:t>MOVE_INFINITE</w:t>
+      </w:r>
+      <w:r>
+        <w:rPr>
+          <w:rFonts w:ascii="Arial" w:hAnsi="Arial" w:cs="Arial"/>
+        </w:rPr>
+        <w:t xml:space="preserve"> umgesetzt werden kann. In der weiteren Umsetzung zeigte sich jedoch, dass die Arbeit mit </w:t>
+      </w:r>
+      <w:r>
+        <w:rPr>
+          <w:rStyle w:val="HTMLCode"/>
+          <w:rFonts w:ascii="Arial" w:hAnsi="Arial" w:cs="Arial"/>
+        </w:rPr>
+        <w:t>MOVE_ABS</w:t>
+      </w:r>
+      <w:r>
+        <w:rPr>
+          <w:rFonts w:ascii="Arial" w:hAnsi="Arial" w:cs="Arial"/>
+        </w:rPr>
+        <w:t xml:space="preserve"> und </w:t>
+      </w:r>
+      <w:r>
+        <w:rPr>
+          <w:rStyle w:val="HTMLCode"/>
+          <w:rFonts w:ascii="Arial" w:hAnsi="Arial" w:cs="Arial"/>
+        </w:rPr>
+        <w:t>MOVE_REL</w:t>
+      </w:r>
+      <w:r>
+        <w:rPr>
+          <w:rFonts w:ascii="Arial" w:hAnsi="Arial" w:cs="Arial"/>
+        </w:rPr>
+        <w:t xml:space="preserve"> einfacher in die bestehende Schrittkette integriert werden konnte.</w:t>
+      </w:r>
+    </w:p>
+    <w:p>
+      <w:pPr>
+        <w:pStyle w:val="NormalWeb"/>
+        <w:rPr>
+          <w:rFonts w:ascii="Arial" w:hAnsi="Arial" w:cs="Arial"/>
+        </w:rPr>
+      </w:pPr>
+      <w:r>
+        <w:rPr>
+          <w:rFonts w:ascii="Arial" w:hAnsi="Arial" w:cs="Arial"/>
+        </w:rPr>
+        <w:t xml:space="preserve">Während der Tests stellte sich heraus, dass </w:t>
+      </w:r>
+      <w:r>
+        <w:rPr>
+          <w:rStyle w:val="HTMLCode"/>
+          <w:rFonts w:ascii="Arial" w:hAnsi="Arial" w:cs="Arial"/>
+        </w:rPr>
+        <w:t>MOVE_REL</w:t>
+      </w:r>
+      <w:r>
+        <w:rPr>
+          <w:rFonts w:ascii="Arial" w:hAnsi="Arial" w:cs="Arial"/>
+        </w:rPr>
+        <w:t xml:space="preserve"> für diese Anwendung kritisch war. Bei vielen aufeinanderfolgenden Testfahrten konnte sich der Positionszähler verschieben beziehungsweise überlaufen. Dadurch blieb der Antrieb teilweise stehen oder reagierte nicht mehr zuverlässig. Aus diesem Grund wurde die Ansteuerung auf </w:t>
+      </w:r>
+      <w:r>
+        <w:rPr>
+          <w:rStyle w:val="HTMLCode"/>
+          <w:rFonts w:ascii="Arial" w:hAnsi="Arial" w:cs="Arial"/>
+        </w:rPr>
+        <w:t>MOVE_ABS</w:t>
+      </w:r>
+      <w:r>
+        <w:rPr>
+          <w:rFonts w:ascii="Arial" w:hAnsi="Arial" w:cs="Arial"/>
+        </w:rPr>
+        <w:t xml:space="preserve"> umgestellt. Für beide Fahrtrichtungen wurden feste absolute Zielpositionen verwendet, eine in positiver und eine in negativer Richtung.</w:t>
+      </w:r>
+    </w:p>
+    <w:p>
+      <w:pPr>
+        <w:pStyle w:val="NormalWeb"/>
+        <w:rPr>
+          <w:rFonts w:ascii="Arial" w:hAnsi="Arial" w:cs="Arial"/>
+        </w:rPr>
+      </w:pPr>
+      <w:r>
+        <w:rPr>
+          <w:rFonts w:ascii="Arial" w:hAnsi="Arial" w:cs="Arial"/>
+        </w:rPr>
+        <w:t xml:space="preserve">Die Antriebslogik wurde in der Klasse </w:t>
+      </w:r>
+      <w:r>
+        <w:rPr>
+          <w:rStyle w:val="HTMLCode"/>
+          <w:rFonts w:ascii="Arial" w:hAnsi="Arial" w:cs="Arial"/>
+        </w:rPr>
+        <w:t>clsAntrieb</w:t>
+      </w:r>
+      <w:r>
+        <w:rPr>
+          <w:rFonts w:ascii="Arial" w:hAnsi="Arial" w:cs="Arial"/>
+        </w:rPr>
+        <w:t xml:space="preserve"> umgesetzt. Daraus wurden zwei Objekte gebildet: eines für den Türantrieb und eines für den Aufzugantrieb. Diese Klasse wurde netzwerkübergreifend mit der </w:t>
+      </w:r>
+      <w:r>
+        <w:rPr>
+          <w:rStyle w:val="HTMLCode"/>
+          <w:rFonts w:ascii="Arial" w:hAnsi="Arial" w:cs="Arial"/>
+        </w:rPr>
+        <w:t>clsMotionControl</w:t>
+      </w:r>
+      <w:r>
+        <w:rPr>
+          <w:rFonts w:ascii="Arial" w:hAnsi="Arial" w:cs="Arial"/>
+        </w:rPr>
+        <w:t xml:space="preserve"> verbunden. Dadurch konnten beide Antriebe mit der gleichen Grundlogik angesteuert werden, während die Verwendung im Aufzugmodul getrennt blieb.</w:t>
+      </w:r>
+    </w:p>
+    <w:p>
+      <w:pPr>
+        <w:pStyle w:val="NormalWeb"/>
+        <w:rPr>
+          <w:rFonts w:ascii="Arial" w:hAnsi="Arial" w:cs="Arial"/>
+        </w:rPr>
+      </w:pPr>
+      <w:r>
+        <w:rPr>
+          <w:rFonts w:ascii="Arial" w:hAnsi="Arial" w:cs="Arial"/>
+        </w:rPr>
+        <w:t>Gleichzeitig wurde beim Fahrbefehl nicht nur der reale Antrieb angesteuert. Sobald der Befehl über einen Methodenaufruf ausgelöst wurde, wurde zusätzlich ein Methodenaufruf an die Simulationsklasse gesendet. Dadurch konnten die simulierten Rückmeldungen wie Türendlage oder Etage erreicht parallel zur Antriebsbewegung erzeugt werden.</w:t>
+      </w:r>
+    </w:p>
+    <w:p>
+      <w:pPr>
+        <w:rPr>
+          <w:rFonts w:cs="Arial"/>
+        </w:rPr>
+      </w:pPr>
+    </w:p>
+    <w:p>
+      <w:pPr>
+        <w:pStyle w:val="Heading2"/>
+        <w:rPr>
+          <w:rFonts w:cs="Arial"/>
+        </w:rPr>
+      </w:pPr>
+      <w:r>
+        <w:rPr>
+          <w:rFonts w:cs="Arial"/>
+        </w:rPr>
         <w:t xml:space="preserve"> </w:t>
       </w:r>
       <w:bookmarkStart w:id="26" w:name="_Toc233202766"/>
       <w:r>
+        <w:rPr>
+          <w:rFonts w:cs="Arial"/>
+        </w:rPr>
         <w:t>Bonus: Lichtschranke und Notstoppfunktion</w:t>
       </w:r>
       <w:bookmarkEnd w:id="26"/>
     </w:p>
-    <w:p/>
-    <w:p>
-      <w:pPr>
-        <w:pStyle w:val="berschrift2"/>
+    <w:p>
+      <w:pPr>
+        <w:pStyle w:val="NormalWeb"/>
+        <w:rPr>
+          <w:rFonts w:ascii="Arial" w:hAnsi="Arial" w:cs="Arial"/>
+        </w:rPr>
+      </w:pPr>
+      <w:r>
+        <w:rPr>
+          <w:rFonts w:ascii="Arial" w:hAnsi="Arial" w:cs="Arial"/>
+        </w:rPr>
+        <w:t xml:space="preserve">Die Bonusfunktionen Lichtschranke und Notstopp wurden nachträglich in die bestehende Steuerung integriert. Dabei entstand zunächst ein Fehler, weil Teile der Logik ursprünglich im </w:t>
+      </w:r>
+      <w:r>
+        <w:rPr>
+          <w:rStyle w:val="HTMLCode"/>
+          <w:rFonts w:ascii="Arial" w:hAnsi="Arial" w:cs="Arial"/>
+        </w:rPr>
+        <w:t>Cyclic Task</w:t>
+      </w:r>
+      <w:r>
+        <w:rPr>
+          <w:rFonts w:ascii="Arial" w:hAnsi="Arial" w:cs="Arial"/>
+        </w:rPr>
+        <w:t xml:space="preserve"> geschrieben wurden und anschliessend im </w:t>
+      </w:r>
+      <w:r>
+        <w:rPr>
+          <w:rStyle w:val="HTMLCode"/>
+          <w:rFonts w:ascii="Arial" w:hAnsi="Arial" w:cs="Arial"/>
+        </w:rPr>
+        <w:t>Realtime Task</w:t>
+      </w:r>
+      <w:r>
+        <w:rPr>
+          <w:rFonts w:ascii="Arial" w:hAnsi="Arial" w:cs="Arial"/>
+        </w:rPr>
+        <w:t xml:space="preserve"> aufgerufen werden mussten. Dadurch mussten die betroffenen Programmteile angepasst und sauber in den richtigen Task übernommen werden.</w:t>
+      </w:r>
+    </w:p>
+    <w:p>
+      <w:pPr>
+        <w:pStyle w:val="NormalWeb"/>
+        <w:rPr>
+          <w:rFonts w:ascii="Arial" w:hAnsi="Arial" w:cs="Arial"/>
+        </w:rPr>
+      </w:pPr>
+      <w:r>
+        <w:rPr>
+          <w:rFonts w:ascii="Arial" w:hAnsi="Arial" w:cs="Arial"/>
+        </w:rPr>
+        <w:t xml:space="preserve">Die Lichtschranke wurde nicht als Safety-Funktion im </w:t>
+      </w:r>
+      <w:r>
+        <w:rPr>
+          <w:rStyle w:val="HTMLCode"/>
+          <w:rFonts w:ascii="Arial" w:hAnsi="Arial" w:cs="Arial"/>
+        </w:rPr>
+        <w:t>Realtime Task</w:t>
+      </w:r>
+      <w:r>
+        <w:rPr>
+          <w:rFonts w:ascii="Arial" w:hAnsi="Arial" w:cs="Arial"/>
+        </w:rPr>
+        <w:t xml:space="preserve"> umgesetzt, da dafür auch die Eingänge der Safety-Card hätten umverdrahtet werden müssen. Stattdessen wurde sie parallel zur Funktion „Tür auf“ eingebunden. Die Lichtschranke wirkt damit wie ein zusätzlicher Tür-auf-Befehl und ist logisch über eine ODER-Verknüpfung mit dem Tür-auf-Taster verbunden.</w:t>
+      </w:r>
+    </w:p>
+    <w:p>
+      <w:pPr>
+        <w:pStyle w:val="NormalWeb"/>
+        <w:rPr>
+          <w:rFonts w:ascii="Arial" w:hAnsi="Arial" w:cs="Arial"/>
+        </w:rPr>
+      </w:pPr>
+      <w:r>
+        <w:rPr>
+          <w:rFonts w:ascii="Arial" w:hAnsi="Arial" w:cs="Arial"/>
+        </w:rPr>
+        <w:lastRenderedPageBreak/>
+        <w:t xml:space="preserve">Für den Notstopp wurde das Stoppverhalten in </w:t>
+      </w:r>
+      <w:r>
+        <w:rPr>
+          <w:rStyle w:val="HTMLCode"/>
+          <w:rFonts w:ascii="Arial" w:hAnsi="Arial" w:cs="Arial"/>
+        </w:rPr>
+        <w:t>clsAntrieb</w:t>
+      </w:r>
+      <w:r>
+        <w:rPr>
+          <w:rFonts w:ascii="Arial" w:hAnsi="Arial" w:cs="Arial"/>
+        </w:rPr>
+        <w:t xml:space="preserve"> und </w:t>
+      </w:r>
+      <w:r>
+        <w:rPr>
+          <w:rStyle w:val="HTMLCode"/>
+          <w:rFonts w:ascii="Arial" w:hAnsi="Arial" w:cs="Arial"/>
+        </w:rPr>
+        <w:t>clsMotionControl</w:t>
+      </w:r>
+      <w:r>
+        <w:rPr>
+          <w:rFonts w:ascii="Arial" w:hAnsi="Arial" w:cs="Arial"/>
+        </w:rPr>
+        <w:t xml:space="preserve"> erweitert. Dafür wurde eine zusätzliche Stoppfunktion erstellt, bei der der Bremsparameter sehr hoch gesetzt wurde. Dadurch wird ein schneller Stopp der Bewegung erreicht, vergleichbar mit einem Sofortstopp mit Bremsung.</w:t>
+      </w:r>
+    </w:p>
+    <w:p>
+      <w:pPr>
+        <w:pStyle w:val="NormalWeb"/>
+        <w:rPr>
+          <w:rFonts w:ascii="Arial" w:hAnsi="Arial" w:cs="Arial"/>
+        </w:rPr>
+      </w:pPr>
+      <w:r>
+        <w:rPr>
+          <w:rFonts w:ascii="Arial" w:hAnsi="Arial" w:cs="Arial"/>
+        </w:rPr>
+        <w:t>Nach der Anpassung der Zyklusaufrufe konnte die Funktion am Modell getestet werden. Wird der Notstopp ausgelöst, stoppt der Lift. Nach dem Entrasten des Notstopps fährt der Lift direkt weiter, da keine separate Quittierfunktion umgesetzt wurde.</w:t>
+      </w:r>
+    </w:p>
+    <w:p/>
+    <w:p>
+      <w:pPr>
+        <w:pStyle w:val="Heading2"/>
       </w:pPr>
       <w:bookmarkStart w:id="27" w:name="_Toc233202767"/>
       <w:r>
@@ -4767,29 +5293,13 @@
     <w:p/>
     <w:p>
       <w:r>
-        <w:t xml:space="preserve">Die Visualisierung wurde laufend an den aktuellen Stand der Steuerung angepasst. Sobald neue Funktionen in der SPS vorhanden waren, wurde gemeinsam besprochen, welche Werte und Schnittstellen für das HMI benötigt werden. Danach wurden die entsprechenden Server und Variablen erstellt und in der Visualisierung verwendet. Dazu </w:t>
-      </w:r>
-      <w:proofErr w:type="gramStart"/>
-      <w:r>
-        <w:t>gehörten</w:t>
-      </w:r>
-      <w:proofErr w:type="gramEnd"/>
-      <w:r>
-        <w:t xml:space="preserve"> unter anderem die Etagenwahl, die aktuelle Etage, die Fahrtrichtung, der Türstatus sowie die Bedienung für Tür auf und Tür zu.</w:t>
-      </w:r>
-    </w:p>
-    <w:p/>
-    <w:p>
-      <w:r>
-        <w:t xml:space="preserve">Da noch wenig Erfahrung mit dem HMI-Design vorhanden war, mussten viele Elemente zuerst ausprobiert und getestet werden. Besonders die Anbindung der Variablen, </w:t>
-      </w:r>
-      <w:proofErr w:type="spellStart"/>
-      <w:r>
-        <w:t>Textschemes</w:t>
-      </w:r>
-      <w:proofErr w:type="spellEnd"/>
-      <w:r>
-        <w:t xml:space="preserve"> und Statusanzeigen wurde schrittweise aufgebaut. Durch dieses Vorgehen konnte die Visualisierung nach und nach erweitert werden, bis die wichtigsten Zustände der Aufzugsteuerung am HMI sichtbar und bedienbar waren.</w:t>
+        <w:t>Die Visualisierung wurde laufend an den aktuellen Stand der Steuerung angepasst. Sobald neue Funktionen in der SPS vorhanden waren, wurde gemeinsam besprochen, welche Werte und Schnittstellen für das HMI benötigt werden. Danach wurden die entsprechenden Server und Variablen erstellt und in der Visualisierung verwendet. Dazu gehörten unter anderem die Etagenwahl, die aktuelle Etage, die Fahrtrichtung, der Türstatus sowie die Bedienung für Tür auf und Tür zu.</w:t>
+      </w:r>
+    </w:p>
+    <w:p/>
+    <w:p>
+      <w:r>
+        <w:t>Da noch wenig Erfahrung mit dem HMI-Design vorhanden war, mussten viele Elemente zuerst ausprobiert und getestet werden. Besonders die Anbindung der Variablen, Textschemes und Statusanzeigen wurde schrittweise aufgebaut. Durch dieses Vorgehen konnte die Visualisierung nach und nach erweitert werden, bis die wichtigsten Zustände der Aufzugsteuerung am HMI sichtbar und bedienbar waren.</w:t>
       </w:r>
     </w:p>
     <w:p>
@@ -4840,7 +5350,7 @@
     </w:p>
     <w:p>
       <w:pPr>
-        <w:pStyle w:val="Beschriftung"/>
+        <w:pStyle w:val="Caption"/>
         <w:jc w:val="center"/>
       </w:pPr>
       <w:bookmarkStart w:id="28" w:name="_Toc233046556"/>
@@ -4862,62 +5372,36 @@
     </w:p>
     <w:p>
       <w:pPr>
-        <w:pStyle w:val="berschrift2"/>
-      </w:pPr>
+        <w:pStyle w:val="Heading2"/>
+      </w:pPr>
+      <w:r>
+        <w:t xml:space="preserve"> </w:t>
+      </w:r>
+      <w:bookmarkStart w:id="29" w:name="_Toc233202768"/>
+      <w:r>
+        <w:t>Testen, Bugfixes und Zusammenführung der Branches</w:t>
+      </w:r>
+      <w:bookmarkEnd w:id="29"/>
+    </w:p>
+    <w:p>
+      <w:r>
+        <w:t xml:space="preserve">Zu Beginn wurde der Grundstand auf dem main-Branch erstellt. Danach wurden für die parallele Arbeit eigene Branches abgeleitet. Auf dem Branch feature/Janett wurde hauptsächlich die </w:t>
+      </w:r>
       <w:r>
         <w:lastRenderedPageBreak/>
-        <w:t xml:space="preserve"> </w:t>
-      </w:r>
-      <w:bookmarkStart w:id="29" w:name="_Toc233202768"/>
-      <w:r>
-        <w:t xml:space="preserve">Testen, Bugfixes und Zusammenführung der </w:t>
-      </w:r>
-      <w:proofErr w:type="spellStart"/>
-      <w:r>
-        <w:t>Branches</w:t>
-      </w:r>
-      <w:bookmarkEnd w:id="29"/>
-      <w:proofErr w:type="spellEnd"/>
-    </w:p>
-    <w:p>
-      <w:r>
-        <w:t xml:space="preserve">Zu Beginn wurde der Grundstand auf dem main-Branch erstellt. Danach wurden für die parallele Arbeit eigene </w:t>
-      </w:r>
-      <w:proofErr w:type="spellStart"/>
-      <w:r>
-        <w:t>Branches</w:t>
-      </w:r>
-      <w:proofErr w:type="spellEnd"/>
-      <w:r>
-        <w:t xml:space="preserve"> abgeleitet. Auf dem Branch feature/Janett wurde hauptsächlich die Steuerungslogik entwickelt. Auf dem Branch feature/VISU wurde die HMI-Visualisierung aufgebaut und angebunden. Dadurch konnten beide Projektmitglieder gleichzeitig am Projekt arbeiten, ohne sich gegenseitig direkt zu überschreiben.</w:t>
-      </w:r>
-    </w:p>
-    <w:p/>
-    <w:p>
-      <w:r>
-        <w:t xml:space="preserve">Damit die Visualisierung immer zum aktuellen Stand der Steuerung passte, wurden Änderungen aus feature/Janett regelmässig in feature/VISU übernommen. Dadurch konnten neue Funktionen der Steuerung direkt im HMI angebunden und getestet werden. Die Commit-Historie zeigt mehrere Merge-Schritte zwischen den beiden </w:t>
-      </w:r>
-      <w:proofErr w:type="spellStart"/>
-      <w:r>
-        <w:t>Branches</w:t>
-      </w:r>
-      <w:proofErr w:type="spellEnd"/>
-      <w:r>
-        <w:t>, weil Steuerung und HMI laufend aufeinander abgestimmt werden mussten.</w:t>
-      </w:r>
-    </w:p>
-    <w:p/>
-    <w:p>
-      <w:r>
-        <w:t xml:space="preserve">Nach dem Einbau neuer Funktionen wurde jeweils direkt getestet. Je nach Funktion erfolgte der Test entweder an der Steuerung, in der Simulation oder über das HMI. Dabei wurden zum Beispiel die Etagenwahl, die Fahrtrichtung, der Türstatus und die Reaktion auf Bedienbefehle überprüft. Gefundene Fehler wurden im Team besprochen und anschliessend direkt korrigiert. So konnten Bugfixes laufend in die Entwicklung einfliessen, bevor die </w:t>
-      </w:r>
-      <w:proofErr w:type="spellStart"/>
-      <w:r>
-        <w:t>Branches</w:t>
-      </w:r>
-      <w:proofErr w:type="spellEnd"/>
-      <w:r>
-        <w:t xml:space="preserve"> wieder zusammengeführt wurden.</w:t>
+        <w:t>Steuerungslogik entwickelt. Auf dem Branch feature/VISU wurde die HMI-Visualisierung aufgebaut und angebunden. Dadurch konnten beide Projektmitglieder gleichzeitig am Projekt arbeiten, ohne sich gegenseitig direkt zu überschreiben.</w:t>
+      </w:r>
+    </w:p>
+    <w:p/>
+    <w:p>
+      <w:r>
+        <w:t>Damit die Visualisierung immer zum aktuellen Stand der Steuerung passte, wurden Änderungen aus feature/Janett regelmässig in feature/VISU übernommen. Dadurch konnten neue Funktionen der Steuerung direkt im HMI angebunden und getestet werden. Die Commit-Historie zeigt mehrere Merge-Schritte zwischen den beiden Branches, weil Steuerung und HMI laufend aufeinander abgestimmt werden mussten.</w:t>
+      </w:r>
+    </w:p>
+    <w:p/>
+    <w:p>
+      <w:r>
+        <w:t>Nach dem Einbau neuer Funktionen wurde jeweils direkt getestet. Je nach Funktion erfolgte der Test entweder an der Steuerung, in der Simulation oder über das HMI. Dabei wurden zum Beispiel die Etagenwahl, die Fahrtrichtung, der Türstatus und die Reaktion auf Bedienbefehle überprüft. Gefundene Fehler wurden im Team besprochen und anschliessend direkt korrigiert. So konnten Bugfixes laufend in die Entwicklung einfliessen, bevor die Branches wieder zusammengeführt wurden.</w:t>
       </w:r>
     </w:p>
     <w:p>
@@ -4944,7 +5428,7 @@
                     <pic:cNvPicPr/>
                   </pic:nvPicPr>
                   <pic:blipFill rotWithShape="1">
-                    <a:blip r:embed="rId22"/>
+                    <a:blip r:embed="rId26"/>
                     <a:srcRect t="10512"/>
                     <a:stretch>
                       <a:fillRect/>
@@ -4976,7 +5460,7 @@
     </w:p>
     <w:p>
       <w:pPr>
-        <w:pStyle w:val="Beschriftung"/>
+        <w:pStyle w:val="Caption"/>
         <w:jc w:val="center"/>
       </w:pPr>
       <w:bookmarkStart w:id="30" w:name="_Toc233046557"/>
@@ -5004,48 +5488,27 @@
     <w:p/>
     <w:p>
       <w:pPr>
-        <w:pStyle w:val="berschrift1"/>
+        <w:pStyle w:val="Heading1"/>
       </w:pPr>
       <w:bookmarkStart w:id="31" w:name="_Toc233202769"/>
       <w:r>
+        <w:t>Schlussteil</w:t>
+      </w:r>
+      <w:bookmarkEnd w:id="31"/>
+    </w:p>
+    <w:p>
+      <w:r>
+        <w:t xml:space="preserve">Die Case Study war für uns sehr lehrreich, da wir eine komplette Steuerung von der Analyse bis zur Umsetzung gemeinsam entwickeln konnten. Besonders interessant war, dass wir das Wissen aus Steuerungstechnik 1 und 2 praktisch anwenden konnten. Dadurch konnten wir Schritt für </w:t>
+      </w:r>
+      <w:r>
         <w:lastRenderedPageBreak/>
-        <w:t>Schlussteil</w:t>
-      </w:r>
-      <w:bookmarkEnd w:id="31"/>
-    </w:p>
-    <w:p>
-      <w:r>
-        <w:t>Die Case Study war für uns sehr lehrreich, da wir eine komplette Steuerung von der Analyse bis zur Umsetzung gemeinsam entwickeln konnten. Besonders interessant war, dass wir das Wissen aus Steuerungstechnik 1 und 2 praktisch anwenden konnten. Dadurch konnten wir Schritt für Schritt nachvollziehen, wie aus einer geplanten Architektur eine funktionierende Steuerung entsteht.</w:t>
-      </w:r>
-    </w:p>
-    <w:p/>
-    <w:p>
-      <w:r>
-        <w:t xml:space="preserve">Die Zusammenarbeit im Team hat gut funktioniert, da wir die Aufgaben sinnvoll aufgeteilt und uns regelmässig abgesprochen haben. So konnten wir parallel an der Steuerung, der HMI-Visualisierung und der Dokumentation arbeiten. Auch die Zusammenarbeit mit Git war für uns ein wichtiger Bestandteil des Projekts. Obwohl es zwischendurch Probleme mit </w:t>
-      </w:r>
-      <w:proofErr w:type="spellStart"/>
-      <w:r>
-        <w:t>Branches</w:t>
-      </w:r>
-      <w:proofErr w:type="spellEnd"/>
-      <w:r>
-        <w:t xml:space="preserve">, </w:t>
-      </w:r>
-      <w:proofErr w:type="spellStart"/>
-      <w:r>
-        <w:t>Pulls</w:t>
-      </w:r>
-      <w:proofErr w:type="spellEnd"/>
-      <w:r>
-        <w:t xml:space="preserve">, </w:t>
-      </w:r>
-      <w:proofErr w:type="spellStart"/>
-      <w:r>
-        <w:t>Pushes</w:t>
-      </w:r>
-      <w:proofErr w:type="spellEnd"/>
-      <w:r>
-        <w:t xml:space="preserve"> und fehlenden Dateien gab, konnten wir diese gemeinsam lösen und daraus viel lernen.</w:t>
+        <w:t>Schritt nachvollziehen, wie aus einer geplanten Architektur eine funktionierende Steuerung entsteht.</w:t>
+      </w:r>
+    </w:p>
+    <w:p/>
+    <w:p>
+      <w:r>
+        <w:t>Die Zusammenarbeit im Team hat gut funktioniert, da wir die Aufgaben sinnvoll aufgeteilt und uns regelmässig abgesprochen haben. So konnten wir parallel an der Steuerung, der HMI-Visualisierung und der Dokumentation arbeiten. Auch die Zusammenarbeit mit Git war für uns ein wichtiger Bestandteil des Projekts. Obwohl es zwischendurch Probleme mit Branches, Pulls, Pushes und fehlenden Dateien gab, konnten wir diese gemeinsam lösen und daraus viel lernen.</w:t>
       </w:r>
     </w:p>
     <w:p/>
@@ -5056,7 +5519,7 @@
     </w:p>
     <w:p>
       <w:pPr>
-        <w:pStyle w:val="berschrift2"/>
+        <w:pStyle w:val="Heading2"/>
       </w:pPr>
       <w:bookmarkStart w:id="32" w:name="_Toc233202770"/>
       <w:r>
@@ -5082,11 +5545,10 @@
     <w:p/>
     <w:p>
       <w:pPr>
-        <w:pStyle w:val="berschrift2"/>
+        <w:pStyle w:val="Heading2"/>
       </w:pPr>
       <w:bookmarkStart w:id="33" w:name="_Toc233202771"/>
       <w:r>
-        <w:lastRenderedPageBreak/>
         <w:t>Hassan</w:t>
       </w:r>
       <w:bookmarkEnd w:id="33"/>
@@ -5163,7 +5625,7 @@
     <w:p/>
     <w:p>
       <w:pPr>
-        <w:pStyle w:val="berschrift1"/>
+        <w:pStyle w:val="Heading1"/>
         <w:numPr>
           <w:ilvl w:val="0"/>
           <w:numId w:val="0"/>
@@ -5172,14 +5634,13 @@
       </w:pPr>
       <w:bookmarkStart w:id="34" w:name="_Toc233202772"/>
       <w:r>
-        <w:lastRenderedPageBreak/>
         <w:t>Aufwandsübersicht</w:t>
       </w:r>
       <w:bookmarkEnd w:id="34"/>
     </w:p>
     <w:tbl>
       <w:tblPr>
-        <w:tblStyle w:val="Gitternetztabelle2"/>
+        <w:tblStyle w:val="GridTable2"/>
         <w:tblW w:w="0" w:type="auto"/>
         <w:tblBorders>
           <w:left w:val="single" w:sz="2" w:space="0" w:color="666666" w:themeColor="text1" w:themeTint="99"/>
@@ -5377,21 +5838,12 @@
                 <w:bCs w:val="0"/>
               </w:rPr>
             </w:pPr>
-            <w:proofErr w:type="spellStart"/>
             <w:r>
               <w:rPr>
                 <w:b w:val="0"/>
                 <w:bCs w:val="0"/>
               </w:rPr>
-              <w:t>Dokuvorlage</w:t>
-            </w:r>
-            <w:proofErr w:type="spellEnd"/>
-            <w:r>
-              <w:rPr>
-                <w:b w:val="0"/>
-                <w:bCs w:val="0"/>
-              </w:rPr>
-              <w:t xml:space="preserve"> erstellt</w:t>
+              <w:t>Dokuvorlage erstellt</w:t>
             </w:r>
           </w:p>
         </w:tc>
@@ -5501,6 +5953,7 @@
                 <w:b w:val="0"/>
                 <w:bCs w:val="0"/>
               </w:rPr>
+              <w:lastRenderedPageBreak/>
               <w:t>Zustandsautomat Vorlage erstellt</w:t>
             </w:r>
           </w:p>
@@ -5964,33 +6417,8 @@
                 <w:b w:val="0"/>
                 <w:bCs w:val="0"/>
               </w:rPr>
-              <w:t xml:space="preserve">Problematik </w:t>
-            </w:r>
-            <w:proofErr w:type="spellStart"/>
-            <w:r>
-              <w:rPr>
-                <w:b w:val="0"/>
-                <w:bCs w:val="0"/>
-              </w:rPr>
-              <w:t>Bibliothekenübergabe</w:t>
-            </w:r>
-            <w:proofErr w:type="spellEnd"/>
-            <w:r>
-              <w:rPr>
-                <w:b w:val="0"/>
-                <w:bCs w:val="0"/>
-              </w:rPr>
-              <w:t xml:space="preserve"> </w:t>
-            </w:r>
-            <w:proofErr w:type="spellStart"/>
-            <w:r>
-              <w:rPr>
-                <w:b w:val="0"/>
-                <w:bCs w:val="0"/>
-              </w:rPr>
-              <w:t>git</w:t>
-            </w:r>
-            <w:proofErr w:type="spellEnd"/>
+              <w:t>Problematik Bibliothekenübergabe git</w:t>
+            </w:r>
           </w:p>
         </w:tc>
         <w:tc>
@@ -6041,23 +6469,7 @@
                 <w:b w:val="0"/>
                 <w:bCs w:val="0"/>
               </w:rPr>
-              <w:t xml:space="preserve">Git </w:t>
-            </w:r>
-            <w:proofErr w:type="spellStart"/>
-            <w:r>
-              <w:rPr>
-                <w:b w:val="0"/>
-                <w:bCs w:val="0"/>
-              </w:rPr>
-              <w:t>tests</w:t>
-            </w:r>
-            <w:proofErr w:type="spellEnd"/>
-            <w:r>
-              <w:rPr>
-                <w:b w:val="0"/>
-                <w:bCs w:val="0"/>
-              </w:rPr>
-              <w:t xml:space="preserve"> und testen Steuerung</w:t>
+              <w:t>Git tests und testen Steuerung</w:t>
             </w:r>
           </w:p>
         </w:tc>
@@ -6158,23 +6570,7 @@
                 <w:b w:val="0"/>
                 <w:bCs w:val="0"/>
               </w:rPr>
-              <w:t xml:space="preserve">IO </w:t>
-            </w:r>
-            <w:proofErr w:type="spellStart"/>
-            <w:r>
-              <w:rPr>
-                <w:b w:val="0"/>
-                <w:bCs w:val="0"/>
-              </w:rPr>
-              <w:t>übergabe</w:t>
-            </w:r>
-            <w:proofErr w:type="spellEnd"/>
-            <w:r>
-              <w:rPr>
-                <w:b w:val="0"/>
-                <w:bCs w:val="0"/>
-              </w:rPr>
-              <w:t xml:space="preserve"> von HMI auf Aufzugmodul</w:t>
+              <w:t>IO übergabe von HMI auf Aufzugmodul</w:t>
             </w:r>
           </w:p>
         </w:tc>
@@ -6319,31 +6715,13 @@
                 <w:bCs w:val="0"/>
               </w:rPr>
             </w:pPr>
-            <w:proofErr w:type="spellStart"/>
             <w:r>
               <w:rPr>
                 <w:b w:val="0"/>
                 <w:bCs w:val="0"/>
               </w:rPr>
-              <w:t>Timerbug</w:t>
-            </w:r>
-            <w:proofErr w:type="spellEnd"/>
-            <w:r>
-              <w:rPr>
-                <w:b w:val="0"/>
-                <w:bCs w:val="0"/>
-              </w:rPr>
-              <w:t xml:space="preserve"> wegen </w:t>
-            </w:r>
-            <w:proofErr w:type="spellStart"/>
-            <w:r>
-              <w:rPr>
-                <w:b w:val="0"/>
-                <w:bCs w:val="0"/>
-              </w:rPr>
-              <w:t>Cyclictime</w:t>
-            </w:r>
-            <w:proofErr w:type="spellEnd"/>
+              <w:t>Timerbug wegen Cyclictime</w:t>
+            </w:r>
           </w:p>
         </w:tc>
         <w:tc>
@@ -6652,7 +7030,6 @@
                 <w:b w:val="0"/>
                 <w:bCs w:val="0"/>
               </w:rPr>
-              <w:lastRenderedPageBreak/>
               <w:t>VISU nach Skizze editiert und Knöpfe mit Server hinterlegt</w:t>
             </w:r>
           </w:p>
@@ -6754,17 +7131,8 @@
                 <w:b w:val="0"/>
                 <w:bCs w:val="0"/>
               </w:rPr>
-              <w:t xml:space="preserve">VISU knöpfe </w:t>
-            </w:r>
-            <w:proofErr w:type="spellStart"/>
-            <w:r>
-              <w:rPr>
-                <w:b w:val="0"/>
-                <w:bCs w:val="0"/>
-              </w:rPr>
-              <w:t>gefixed</w:t>
-            </w:r>
-            <w:proofErr w:type="spellEnd"/>
+              <w:t>VISU knöpfe gefixed</w:t>
+            </w:r>
           </w:p>
         </w:tc>
         <w:tc>
@@ -6867,6 +7235,7 @@
                 <w:b w:val="0"/>
                 <w:bCs w:val="0"/>
               </w:rPr>
+              <w:lastRenderedPageBreak/>
               <w:t>Antriebsansteuerung angepasst</w:t>
             </w:r>
           </w:p>
@@ -7017,23 +7386,7 @@
                 <w:b w:val="0"/>
                 <w:bCs w:val="0"/>
               </w:rPr>
-              <w:t xml:space="preserve">Neue </w:t>
-            </w:r>
-            <w:proofErr w:type="spellStart"/>
-            <w:r>
-              <w:rPr>
-                <w:b w:val="0"/>
-                <w:bCs w:val="0"/>
-              </w:rPr>
-              <w:t>statemachine</w:t>
-            </w:r>
-            <w:proofErr w:type="spellEnd"/>
-            <w:r>
-              <w:rPr>
-                <w:b w:val="0"/>
-                <w:bCs w:val="0"/>
-              </w:rPr>
-              <w:t xml:space="preserve"> für Motoren</w:t>
+              <w:t>Neue statemachine für Motoren</w:t>
             </w:r>
           </w:p>
         </w:tc>
@@ -7080,21 +7433,12 @@
                 <w:bCs w:val="0"/>
               </w:rPr>
             </w:pPr>
-            <w:proofErr w:type="spellStart"/>
             <w:r>
               <w:rPr>
                 <w:b w:val="0"/>
                 <w:bCs w:val="0"/>
               </w:rPr>
-              <w:t>Textscheme</w:t>
-            </w:r>
-            <w:proofErr w:type="spellEnd"/>
-            <w:r>
-              <w:rPr>
-                <w:b w:val="0"/>
-                <w:bCs w:val="0"/>
-              </w:rPr>
-              <w:t xml:space="preserve"> für Richtung</w:t>
+              <w:t>Textscheme für Richtung</w:t>
             </w:r>
           </w:p>
         </w:tc>
@@ -7488,21 +7832,12 @@
                 <w:bCs w:val="0"/>
               </w:rPr>
             </w:pPr>
-            <w:proofErr w:type="spellStart"/>
             <w:r>
               <w:rPr>
                 <w:b w:val="0"/>
                 <w:bCs w:val="0"/>
               </w:rPr>
-              <w:t>Enum</w:t>
-            </w:r>
-            <w:proofErr w:type="spellEnd"/>
-            <w:r>
-              <w:rPr>
-                <w:b w:val="0"/>
-                <w:bCs w:val="0"/>
-              </w:rPr>
-              <w:t xml:space="preserve"> Motor</w:t>
+              <w:t>Enum Motor</w:t>
             </w:r>
             <w:r>
               <w:rPr>
@@ -7568,75 +7903,57 @@
                 <w:b w:val="0"/>
                 <w:bCs w:val="0"/>
               </w:rPr>
-              <w:t xml:space="preserve">Neue </w:t>
-            </w:r>
-            <w:proofErr w:type="spellStart"/>
-            <w:r>
+              <w:t>Neue Visuanbindung</w:t>
+            </w:r>
+          </w:p>
+        </w:tc>
+        <w:tc>
+          <w:tcPr>
+            <w:tcW w:w="3209" w:type="dxa"/>
+          </w:tcPr>
+          <w:p>
+            <w:pPr>
+              <w:cnfStyle w:val="000000100000" w:firstRow="0" w:lastRow="0" w:firstColumn="0" w:lastColumn="0" w:oddVBand="0" w:evenVBand="0" w:oddHBand="1" w:evenHBand="0" w:firstRowFirstColumn="0" w:firstRowLastColumn="0" w:lastRowFirstColumn="0" w:lastRowLastColumn="0"/>
+            </w:pPr>
+            <w:r>
+              <w:t>Niki</w:t>
+            </w:r>
+          </w:p>
+        </w:tc>
+        <w:tc>
+          <w:tcPr>
+            <w:tcW w:w="3210" w:type="dxa"/>
+          </w:tcPr>
+          <w:p>
+            <w:pPr>
+              <w:cnfStyle w:val="000000100000" w:firstRow="0" w:lastRow="0" w:firstColumn="0" w:lastColumn="0" w:oddVBand="0" w:evenVBand="0" w:oddHBand="1" w:evenHBand="0" w:firstRowFirstColumn="0" w:firstRowLastColumn="0" w:lastRowFirstColumn="0" w:lastRowLastColumn="0"/>
+            </w:pPr>
+            <w:r>
+              <w:t>1h</w:t>
+            </w:r>
+          </w:p>
+        </w:tc>
+      </w:tr>
+      <w:tr>
+        <w:tc>
+          <w:tcPr>
+            <w:cnfStyle w:val="001000000000" w:firstRow="0" w:lastRow="0" w:firstColumn="1" w:lastColumn="0" w:oddVBand="0" w:evenVBand="0" w:oddHBand="0" w:evenHBand="0" w:firstRowFirstColumn="0" w:firstRowLastColumn="0" w:lastRowFirstColumn="0" w:lastRowLastColumn="0"/>
+            <w:tcW w:w="3209" w:type="dxa"/>
+          </w:tcPr>
+          <w:p>
+            <w:pPr>
               <w:rPr>
                 <w:b w:val="0"/>
                 <w:bCs w:val="0"/>
               </w:rPr>
-              <w:t>Visuanbindung</w:t>
-            </w:r>
-            <w:proofErr w:type="spellEnd"/>
-          </w:p>
-        </w:tc>
-        <w:tc>
-          <w:tcPr>
-            <w:tcW w:w="3209" w:type="dxa"/>
-          </w:tcPr>
-          <w:p>
-            <w:pPr>
-              <w:cnfStyle w:val="000000100000" w:firstRow="0" w:lastRow="0" w:firstColumn="0" w:lastColumn="0" w:oddVBand="0" w:evenVBand="0" w:oddHBand="1" w:evenHBand="0" w:firstRowFirstColumn="0" w:firstRowLastColumn="0" w:lastRowFirstColumn="0" w:lastRowLastColumn="0"/>
-            </w:pPr>
-            <w:r>
-              <w:t>Niki</w:t>
-            </w:r>
-          </w:p>
-        </w:tc>
-        <w:tc>
-          <w:tcPr>
-            <w:tcW w:w="3210" w:type="dxa"/>
-          </w:tcPr>
-          <w:p>
-            <w:pPr>
-              <w:cnfStyle w:val="000000100000" w:firstRow="0" w:lastRow="0" w:firstColumn="0" w:lastColumn="0" w:oddVBand="0" w:evenVBand="0" w:oddHBand="1" w:evenHBand="0" w:firstRowFirstColumn="0" w:firstRowLastColumn="0" w:lastRowFirstColumn="0" w:lastRowLastColumn="0"/>
-            </w:pPr>
-            <w:r>
-              <w:t>1h</w:t>
-            </w:r>
-          </w:p>
-        </w:tc>
-      </w:tr>
-      <w:tr>
-        <w:tc>
-          <w:tcPr>
-            <w:cnfStyle w:val="001000000000" w:firstRow="0" w:lastRow="0" w:firstColumn="1" w:lastColumn="0" w:oddVBand="0" w:evenVBand="0" w:oddHBand="0" w:evenHBand="0" w:firstRowFirstColumn="0" w:firstRowLastColumn="0" w:lastRowFirstColumn="0" w:lastRowLastColumn="0"/>
-            <w:tcW w:w="3209" w:type="dxa"/>
-          </w:tcPr>
-          <w:p>
-            <w:pPr>
+            </w:pPr>
+            <w:r>
               <w:rPr>
                 <w:b w:val="0"/>
                 <w:bCs w:val="0"/>
               </w:rPr>
-            </w:pPr>
-            <w:r>
-              <w:rPr>
-                <w:b w:val="0"/>
-                <w:bCs w:val="0"/>
-              </w:rPr>
-              <w:t xml:space="preserve">Anbindung Richtung an Klasse </w:t>
-            </w:r>
-            <w:proofErr w:type="spellStart"/>
-            <w:r>
-              <w:rPr>
-                <w:b w:val="0"/>
-                <w:bCs w:val="0"/>
-              </w:rPr>
-              <w:t>clsAntrieb</w:t>
-            </w:r>
-            <w:proofErr w:type="spellEnd"/>
+              <w:t>Anbindung Richtung an Klasse clsAntrieb</w:t>
+            </w:r>
           </w:p>
         </w:tc>
         <w:tc>
@@ -7788,17 +8105,8 @@
                 <w:b w:val="0"/>
                 <w:bCs w:val="0"/>
               </w:rPr>
-              <w:t xml:space="preserve">Bugfix </w:t>
-            </w:r>
-            <w:proofErr w:type="spellStart"/>
-            <w:r>
-              <w:rPr>
-                <w:b w:val="0"/>
-                <w:bCs w:val="0"/>
-              </w:rPr>
-              <w:t>clsHMI</w:t>
-            </w:r>
-            <w:proofErr w:type="spellEnd"/>
+              <w:t>Bugfix clsHMI</w:t>
+            </w:r>
           </w:p>
         </w:tc>
         <w:tc>
@@ -7999,82 +8307,56 @@
                 <w:b w:val="0"/>
                 <w:bCs w:val="0"/>
               </w:rPr>
-              <w:t xml:space="preserve">Bugfix </w:t>
-            </w:r>
-            <w:proofErr w:type="spellStart"/>
-            <w:r>
+              <w:t xml:space="preserve">Bugfix Cycletask </w:t>
+            </w:r>
+          </w:p>
+        </w:tc>
+        <w:tc>
+          <w:tcPr>
+            <w:tcW w:w="3209" w:type="dxa"/>
+          </w:tcPr>
+          <w:p>
+            <w:pPr>
+              <w:cnfStyle w:val="000000100000" w:firstRow="0" w:lastRow="0" w:firstColumn="0" w:lastColumn="0" w:oddVBand="0" w:evenVBand="0" w:oddHBand="1" w:evenHBand="0" w:firstRowFirstColumn="0" w:firstRowLastColumn="0" w:lastRowFirstColumn="0" w:lastRowLastColumn="0"/>
+            </w:pPr>
+            <w:r>
+              <w:t>Niki</w:t>
+            </w:r>
+          </w:p>
+        </w:tc>
+        <w:tc>
+          <w:tcPr>
+            <w:tcW w:w="3210" w:type="dxa"/>
+          </w:tcPr>
+          <w:p>
+            <w:pPr>
+              <w:cnfStyle w:val="000000100000" w:firstRow="0" w:lastRow="0" w:firstColumn="0" w:lastColumn="0" w:oddVBand="0" w:evenVBand="0" w:oddHBand="1" w:evenHBand="0" w:firstRowFirstColumn="0" w:firstRowLastColumn="0" w:lastRowFirstColumn="0" w:lastRowLastColumn="0"/>
+            </w:pPr>
+            <w:r>
+              <w:t>1h</w:t>
+            </w:r>
+          </w:p>
+        </w:tc>
+      </w:tr>
+      <w:tr>
+        <w:tc>
+          <w:tcPr>
+            <w:cnfStyle w:val="001000000000" w:firstRow="0" w:lastRow="0" w:firstColumn="1" w:lastColumn="0" w:oddVBand="0" w:evenVBand="0" w:oddHBand="0" w:evenHBand="0" w:firstRowFirstColumn="0" w:firstRowLastColumn="0" w:lastRowFirstColumn="0" w:lastRowLastColumn="0"/>
+            <w:tcW w:w="3209" w:type="dxa"/>
+          </w:tcPr>
+          <w:p>
+            <w:pPr>
               <w:rPr>
                 <w:b w:val="0"/>
                 <w:bCs w:val="0"/>
               </w:rPr>
-              <w:t>Cycletask</w:t>
-            </w:r>
-            <w:proofErr w:type="spellEnd"/>
+            </w:pPr>
             <w:r>
               <w:rPr>
                 <w:b w:val="0"/>
                 <w:bCs w:val="0"/>
               </w:rPr>
-              <w:t xml:space="preserve"> </w:t>
-            </w:r>
-          </w:p>
-        </w:tc>
-        <w:tc>
-          <w:tcPr>
-            <w:tcW w:w="3209" w:type="dxa"/>
-          </w:tcPr>
-          <w:p>
-            <w:pPr>
-              <w:cnfStyle w:val="000000100000" w:firstRow="0" w:lastRow="0" w:firstColumn="0" w:lastColumn="0" w:oddVBand="0" w:evenVBand="0" w:oddHBand="1" w:evenHBand="0" w:firstRowFirstColumn="0" w:firstRowLastColumn="0" w:lastRowFirstColumn="0" w:lastRowLastColumn="0"/>
-            </w:pPr>
-            <w:r>
-              <w:t>Niki</w:t>
-            </w:r>
-          </w:p>
-        </w:tc>
-        <w:tc>
-          <w:tcPr>
-            <w:tcW w:w="3210" w:type="dxa"/>
-          </w:tcPr>
-          <w:p>
-            <w:pPr>
-              <w:cnfStyle w:val="000000100000" w:firstRow="0" w:lastRow="0" w:firstColumn="0" w:lastColumn="0" w:oddVBand="0" w:evenVBand="0" w:oddHBand="1" w:evenHBand="0" w:firstRowFirstColumn="0" w:firstRowLastColumn="0" w:lastRowFirstColumn="0" w:lastRowLastColumn="0"/>
-            </w:pPr>
-            <w:r>
-              <w:t>1h</w:t>
-            </w:r>
-          </w:p>
-        </w:tc>
-      </w:tr>
-      <w:tr>
-        <w:tc>
-          <w:tcPr>
-            <w:cnfStyle w:val="001000000000" w:firstRow="0" w:lastRow="0" w:firstColumn="1" w:lastColumn="0" w:oddVBand="0" w:evenVBand="0" w:oddHBand="0" w:evenHBand="0" w:firstRowFirstColumn="0" w:firstRowLastColumn="0" w:lastRowFirstColumn="0" w:lastRowLastColumn="0"/>
-            <w:tcW w:w="3209" w:type="dxa"/>
-          </w:tcPr>
-          <w:p>
-            <w:pPr>
-              <w:rPr>
-                <w:b w:val="0"/>
-                <w:bCs w:val="0"/>
-              </w:rPr>
-            </w:pPr>
-            <w:proofErr w:type="spellStart"/>
-            <w:r>
-              <w:rPr>
-                <w:b w:val="0"/>
-                <w:bCs w:val="0"/>
-              </w:rPr>
-              <w:lastRenderedPageBreak/>
-              <w:t>sZieletage</w:t>
-            </w:r>
-            <w:proofErr w:type="spellEnd"/>
-            <w:r>
-              <w:rPr>
-                <w:b w:val="0"/>
-                <w:bCs w:val="0"/>
-              </w:rPr>
-              <w:t xml:space="preserve"> mit Logik und Visualisierung implementiert</w:t>
+              <w:t>sZieletage mit Logik und Visualisierung implementiert</w:t>
             </w:r>
           </w:p>
         </w:tc>
@@ -8175,23 +8457,7 @@
                 <w:b w:val="0"/>
                 <w:bCs w:val="0"/>
               </w:rPr>
-              <w:t xml:space="preserve">Debugging </w:t>
-            </w:r>
-            <w:proofErr w:type="spellStart"/>
-            <w:r>
-              <w:rPr>
-                <w:b w:val="0"/>
-                <w:bCs w:val="0"/>
-              </w:rPr>
-              <w:t>Safetycard</w:t>
-            </w:r>
-            <w:proofErr w:type="spellEnd"/>
-            <w:r>
-              <w:rPr>
-                <w:b w:val="0"/>
-                <w:bCs w:val="0"/>
-              </w:rPr>
-              <w:t xml:space="preserve"> und Lichtschranke</w:t>
+              <w:t>Debugging Safetycard und Lichtschranke</w:t>
             </w:r>
           </w:p>
         </w:tc>
@@ -8292,6 +8558,7 @@
                 <w:b w:val="0"/>
                 <w:bCs w:val="0"/>
               </w:rPr>
+              <w:lastRenderedPageBreak/>
               <w:t>Logik für die Status Leds verbessert</w:t>
             </w:r>
           </w:p>
@@ -8574,7 +8841,7 @@
     <w:p/>
     <w:p>
       <w:pPr>
-        <w:pStyle w:val="berschrift1"/>
+        <w:pStyle w:val="Heading1"/>
         <w:numPr>
           <w:ilvl w:val="0"/>
           <w:numId w:val="0"/>
@@ -8582,19 +8849,19 @@
       </w:pPr>
       <w:bookmarkStart w:id="35" w:name="_Toc233202773"/>
       <w:r>
+        <w:t>Selbständigkeitserklärung</w:t>
+      </w:r>
+      <w:bookmarkEnd w:id="35"/>
+    </w:p>
+    <w:p>
+      <w:r>
+        <w:t xml:space="preserve">Ich versichere, dass die vorliegende Arbeit selbständig und ohne Benutzung anderer als der angegebenen Hilfsmittel angefertigt wurde. Alle Inhalte dieser Arbeit, dazu gehören neben Texten auch Grafiken, Programmcode, etc., die wörtlich oder sinngemäss aus anderen Quellen stammen, sind als solche eindeutig kenntlich gemacht und korrekt im Quellenverzeichnis gelistet. Dies gilt auch für einzelne Auszüge aus fremden Quellen. </w:t>
+      </w:r>
+    </w:p>
+    <w:p/>
+    <w:p>
+      <w:r>
         <w:lastRenderedPageBreak/>
-        <w:t>Selbständigkeitserklärung</w:t>
-      </w:r>
-      <w:bookmarkEnd w:id="35"/>
-    </w:p>
-    <w:p>
-      <w:r>
-        <w:t xml:space="preserve">Ich versichere, dass die vorliegende Arbeit selbständig und ohne Benutzung anderer als der angegebenen Hilfsmittel angefertigt wurde. Alle Inhalte dieser Arbeit, dazu gehören neben Texten auch Grafiken, Programmcode, etc., die wörtlich oder sinngemäss aus anderen Quellen stammen, sind als solche eindeutig kenntlich gemacht und korrekt im Quellenverzeichnis gelistet. Dies gilt auch für einzelne Auszüge aus fremden Quellen. </w:t>
-      </w:r>
-    </w:p>
-    <w:p/>
-    <w:p>
-      <w:r>
         <w:t xml:space="preserve">Die Arbeit ist in gleicher oder ähnlicher Form noch nicht veröffentlicht und noch keiner Prüfungsbehörde vorgelegt worden. </w:t>
       </w:r>
     </w:p>
@@ -8680,7 +8947,7 @@
                     <pic:cNvPicPr/>
                   </pic:nvPicPr>
                   <pic:blipFill>
-                    <a:blip r:embed="rId23"/>
+                    <a:blip r:embed="rId27"/>
                     <a:stretch>
                       <a:fillRect/>
                     </a:stretch>
@@ -8726,7 +8993,7 @@
                     <pic:cNvPicPr/>
                   </pic:nvPicPr>
                   <pic:blipFill>
-                    <a:blip r:embed="rId24" cstate="print">
+                    <a:blip r:embed="rId28" cstate="print">
                       <a:extLst>
                         <a:ext uri="{28A0092B-C50C-407E-A947-70E740481C1C}">
                           <a14:useLocalDpi xmlns:a14="http://schemas.microsoft.com/office/drawing/2010/main" val="0"/>
@@ -8769,7 +9036,7 @@
     </w:p>
     <w:p>
       <w:pPr>
-        <w:pStyle w:val="berschrift1"/>
+        <w:pStyle w:val="Heading1"/>
         <w:numPr>
           <w:ilvl w:val="0"/>
           <w:numId w:val="0"/>
@@ -8778,14 +9045,13 @@
       </w:pPr>
       <w:bookmarkStart w:id="36" w:name="_Toc233202774"/>
       <w:r>
-        <w:lastRenderedPageBreak/>
         <w:t>Abbildungsverzeichnis</w:t>
       </w:r>
       <w:bookmarkEnd w:id="36"/>
     </w:p>
     <w:p>
       <w:pPr>
-        <w:pStyle w:val="Abbildungsverzeichnis"/>
+        <w:pStyle w:val="TableofFigures"/>
         <w:tabs>
           <w:tab w:val="right" w:leader="dot" w:pos="9628"/>
         </w:tabs>
@@ -8868,7 +9134,7 @@
     </w:p>
     <w:p>
       <w:pPr>
-        <w:pStyle w:val="Abbildungsverzeichnis"/>
+        <w:pStyle w:val="TableofFigures"/>
         <w:tabs>
           <w:tab w:val="right" w:leader="dot" w:pos="9628"/>
         </w:tabs>
@@ -8942,7 +9208,7 @@
     </w:p>
     <w:p>
       <w:pPr>
-        <w:pStyle w:val="Abbildungsverzeichnis"/>
+        <w:pStyle w:val="TableofFigures"/>
         <w:tabs>
           <w:tab w:val="right" w:leader="dot" w:pos="9628"/>
         </w:tabs>
@@ -9016,7 +9282,7 @@
     </w:p>
     <w:p>
       <w:pPr>
-        <w:pStyle w:val="Abbildungsverzeichnis"/>
+        <w:pStyle w:val="TableofFigures"/>
         <w:tabs>
           <w:tab w:val="right" w:leader="dot" w:pos="9628"/>
         </w:tabs>
@@ -9090,7 +9356,7 @@
     </w:p>
     <w:p>
       <w:pPr>
-        <w:pStyle w:val="Abbildungsverzeichnis"/>
+        <w:pStyle w:val="TableofFigures"/>
         <w:tabs>
           <w:tab w:val="right" w:leader="dot" w:pos="9628"/>
         </w:tabs>
@@ -9164,7 +9430,7 @@
     </w:p>
     <w:p>
       <w:pPr>
-        <w:pStyle w:val="Abbildungsverzeichnis"/>
+        <w:pStyle w:val="TableofFigures"/>
         <w:tabs>
           <w:tab w:val="right" w:leader="dot" w:pos="9628"/>
         </w:tabs>
@@ -9238,7 +9504,7 @@
     </w:p>
     <w:p>
       <w:pPr>
-        <w:pStyle w:val="Abbildungsverzeichnis"/>
+        <w:pStyle w:val="TableofFigures"/>
         <w:tabs>
           <w:tab w:val="right" w:leader="dot" w:pos="9628"/>
         </w:tabs>
@@ -9312,7 +9578,7 @@
     </w:p>
     <w:p>
       <w:pPr>
-        <w:pStyle w:val="Abbildungsverzeichnis"/>
+        <w:pStyle w:val="TableofFigures"/>
         <w:tabs>
           <w:tab w:val="right" w:leader="dot" w:pos="9628"/>
         </w:tabs>
@@ -9386,7 +9652,7 @@
     </w:p>
     <w:p>
       <w:pPr>
-        <w:pStyle w:val="Abbildungsverzeichnis"/>
+        <w:pStyle w:val="TableofFigures"/>
         <w:tabs>
           <w:tab w:val="right" w:leader="dot" w:pos="9628"/>
         </w:tabs>
@@ -9491,7 +9757,7 @@
     <w:p/>
     <w:p>
       <w:pPr>
-        <w:pStyle w:val="berschrift1"/>
+        <w:pStyle w:val="Heading1"/>
         <w:numPr>
           <w:ilvl w:val="0"/>
           <w:numId w:val="0"/>
@@ -9499,74 +9765,34 @@
       </w:pPr>
       <w:bookmarkStart w:id="37" w:name="_Toc233202775"/>
       <w:r>
+        <w:t>Quellenverzeichnis</w:t>
+      </w:r>
+      <w:bookmarkEnd w:id="37"/>
+    </w:p>
+    <w:p>
+      <w:r>
+        <w:t>[1] Modul Steuerungstechnik II: Wegleitung zu Case Study Steuerungstechnik, Case Study IV, 2026. Unterrichtsunterlage.</w:t>
+      </w:r>
+    </w:p>
+    <w:p>
+      <w:r>
+        <w:t>[2] Modul Steuerungstechnik II: Bewertung Case Study IV Steuerungstechnik II, Bewertungsraster zur Case Study IV, 20.05.2026. Unterrichtsunterlage.</w:t>
+      </w:r>
+    </w:p>
+    <w:p>
+      <w:r>
         <w:lastRenderedPageBreak/>
-        <w:t>Quellenverzeichnis</w:t>
-      </w:r>
-      <w:bookmarkEnd w:id="37"/>
-    </w:p>
-    <w:p>
-      <w:r>
-        <w:t>[1] Modul Steuerungstechnik II: Wegleitung zu Case Study Steuerungstechnik, Case Study IV, 2026. Unterrichtsunterlage.</w:t>
-      </w:r>
-    </w:p>
-    <w:p>
-      <w:r>
-        <w:t>[2] Modul Steuerungstechnik II: Bewertung Case Study IV Steuerungstechnik II, Bewertungsraster zur Case Study IV, 20.05.2026. Unterrichtsunterlage.</w:t>
-      </w:r>
-    </w:p>
-    <w:p>
-      <w:r>
-        <w:t xml:space="preserve">[3] Modul Steuerungstechnik II: </w:t>
-      </w:r>
-      <w:proofErr w:type="gramStart"/>
-      <w:r>
-        <w:t>SPS Namenskonventionen</w:t>
-      </w:r>
-      <w:proofErr w:type="gramEnd"/>
-      <w:r>
-        <w:t xml:space="preserve"> – </w:t>
-      </w:r>
-      <w:proofErr w:type="spellStart"/>
-      <w:r>
-        <w:t>Cheatsheet</w:t>
-      </w:r>
-      <w:proofErr w:type="spellEnd"/>
-      <w:r>
-        <w:t>, 2026. Unterrichtsunterlage.</w:t>
-      </w:r>
-    </w:p>
-    <w:p>
-      <w:r>
-        <w:t xml:space="preserve">[4] Modul Steuerungstechnik II: SCL / ST </w:t>
-      </w:r>
-      <w:proofErr w:type="spellStart"/>
-      <w:r>
-        <w:t>Cheatsheet</w:t>
-      </w:r>
-      <w:proofErr w:type="spellEnd"/>
-      <w:r>
-        <w:t xml:space="preserve"> – </w:t>
-      </w:r>
-      <w:proofErr w:type="spellStart"/>
-      <w:r>
-        <w:t>Sigmatek</w:t>
-      </w:r>
-      <w:proofErr w:type="spellEnd"/>
-      <w:r>
-        <w:t xml:space="preserve"> SPS, 2026. Unterrichtsunterlage.</w:t>
-      </w:r>
-    </w:p>
-    <w:p>
-      <w:r>
-        <w:t xml:space="preserve">[5] Modul Steuerungstechnik II: Datentypen </w:t>
-      </w:r>
-      <w:proofErr w:type="spellStart"/>
-      <w:r>
-        <w:t>Sigmatec</w:t>
-      </w:r>
-      <w:proofErr w:type="spellEnd"/>
-      <w:r>
-        <w:t xml:space="preserve"> Steuerungen, 2026. Unterrichtsunterlage.</w:t>
+        <w:t>[3] Modul Steuerungstechnik II: SPS Namenskonventionen – Cheatsheet, 2026. Unterrichtsunterlage.</w:t>
+      </w:r>
+    </w:p>
+    <w:p>
+      <w:r>
+        <w:t>[4] Modul Steuerungstechnik II: SCL / ST Cheatsheet – Sigmatek SPS, 2026. Unterrichtsunterlage.</w:t>
+      </w:r>
+    </w:p>
+    <w:p>
+      <w:r>
+        <w:t>[5] Modul Steuerungstechnik II: Datentypen Sigmatec Steuerungen, 2026. Unterrichtsunterlage.</w:t>
       </w:r>
     </w:p>
     <w:p>
@@ -9581,28 +9807,12 @@
     </w:p>
     <w:p>
       <w:r>
-        <w:t xml:space="preserve">[8] Modul Steuerungstechnik II: Anleitung – Debugger in LASAL / </w:t>
-      </w:r>
-      <w:proofErr w:type="spellStart"/>
-      <w:r>
-        <w:t>Sigmatec</w:t>
-      </w:r>
-      <w:proofErr w:type="spellEnd"/>
-      <w:r>
-        <w:t xml:space="preserve"> SCL, 2026. Unterrichtsunterlage.</w:t>
-      </w:r>
-    </w:p>
-    <w:p>
-      <w:r>
-        <w:t xml:space="preserve">[9] Modul Steuerungstechnik II: IBW </w:t>
-      </w:r>
-      <w:proofErr w:type="spellStart"/>
-      <w:r>
-        <w:t>Sigmatek</w:t>
-      </w:r>
-      <w:proofErr w:type="spellEnd"/>
-      <w:r>
-        <w:t xml:space="preserve"> Anleitung Motoren, 2026. Unterrichtsunterlage.</w:t>
+        <w:t>[8] Modul Steuerungstechnik II: Anleitung – Debugger in LASAL / Sigmatec SCL, 2026. Unterrichtsunterlage.</w:t>
+      </w:r>
+    </w:p>
+    <w:p>
+      <w:r>
+        <w:t>[9] Modul Steuerungstechnik II: IBW Sigmatek Anleitung Motoren, 2026. Unterrichtsunterlage.</w:t>
       </w:r>
     </w:p>
     <w:p>
@@ -9642,7 +9852,7 @@
     <w:p/>
     <w:p>
       <w:pPr>
-        <w:pStyle w:val="berschrift1"/>
+        <w:pStyle w:val="Heading1"/>
         <w:numPr>
           <w:ilvl w:val="0"/>
           <w:numId w:val="0"/>
@@ -9651,28 +9861,23 @@
       </w:pPr>
       <w:bookmarkStart w:id="38" w:name="_Toc233202776"/>
       <w:r>
+        <w:t>Einsatz von KI-Tools</w:t>
+      </w:r>
+      <w:bookmarkEnd w:id="38"/>
+    </w:p>
+    <w:p>
+      <w:r>
+        <w:t xml:space="preserve">Während der Bearbeitung wurden KI-Tools unterstützend eingesetzt. OpenAI ChatGPT wurde für die sprachliche Überarbeitung einzelner Dokumentationsabschnitte, die Strukturierung der Anforderungen sowie für Vorschläge zu Planung, Zustandsautomat, Architekturzeichnung und </w:t>
+      </w:r>
+      <w:r>
         <w:lastRenderedPageBreak/>
-        <w:t>Einsatz von KI-Tools</w:t>
-      </w:r>
-      <w:bookmarkEnd w:id="38"/>
-    </w:p>
-    <w:p>
-      <w:r>
-        <w:t>Während der Bearbeitung wurden KI-Tools unterstützend eingesetzt. OpenAI ChatGPT wurde für die sprachliche Überarbeitung einzelner Dokumentationsabschnitte, die Strukturierung der Anforderungen sowie für Vorschläge zu Planung, Zustandsautomat, Architekturzeichnung und HMI-Skizze verwendet. Die vorgeschlagenen Inhalte wurden überprüft, angepasst und mit der eigenen Aufgabenstellung abgeglichen.</w:t>
-      </w:r>
-    </w:p>
-    <w:p/>
-    <w:p>
-      <w:r>
-        <w:t xml:space="preserve">GitHub Copilot wurde unterstützend bei der Programmierung, bei Codevorschlägen und bei der Fehlersuche eingesetzt. Die Vorschläge wurden nicht unverändert übernommen, sondern geprüft und an die verwendete SIGMATEK-SPS, die geplante State </w:t>
-      </w:r>
-      <w:proofErr w:type="spellStart"/>
-      <w:r>
-        <w:t>Machine</w:t>
-      </w:r>
-      <w:proofErr w:type="spellEnd"/>
-      <w:r>
-        <w:t xml:space="preserve"> und die vorhandene Projektstruktur angepasst.</w:t>
+        <w:t>HMI-Skizze verwendet. Die vorgeschlagenen Inhalte wurden überprüft, angepasst und mit der eigenen Aufgabenstellung abgeglichen.</w:t>
+      </w:r>
+    </w:p>
+    <w:p/>
+    <w:p>
+      <w:r>
+        <w:t>GitHub Copilot wurde unterstützend bei der Programmierung, bei Codevorschlägen und bei der Fehlersuche eingesetzt. Die Vorschläge wurden nicht unverändert übernommen, sondern geprüft und an die verwendete SIGMATEK-SPS, die geplante State Machine und die vorhandene Projektstruktur angepasst.</w:t>
       </w:r>
     </w:p>
     <w:p/>
@@ -9683,7 +9888,7 @@
     </w:p>
     <w:p>
       <w:pPr>
-        <w:pStyle w:val="berschrift1"/>
+        <w:pStyle w:val="Heading1"/>
         <w:numPr>
           <w:ilvl w:val="0"/>
           <w:numId w:val="0"/>
@@ -9698,7 +9903,7 @@
     </w:p>
     <w:p>
       <w:pPr>
-        <w:pStyle w:val="Listenabsatz"/>
+        <w:pStyle w:val="ListParagraph"/>
         <w:numPr>
           <w:ilvl w:val="6"/>
           <w:numId w:val="1"/>
@@ -9733,8 +9938,8 @@
       </w:pPr>
     </w:p>
     <w:sectPr>
-      <w:headerReference w:type="first" r:id="rId25"/>
-      <w:footerReference w:type="first" r:id="rId26"/>
+      <w:headerReference w:type="first" r:id="rId29"/>
+      <w:footerReference w:type="first" r:id="rId30"/>
       <w:pgSz w:w="11906" w:h="16838"/>
       <w:pgMar w:top="1418" w:right="1134" w:bottom="1134" w:left="1134" w:header="709" w:footer="709" w:gutter="0"/>
       <w:pgNumType w:start="1"/>
@@ -9746,7 +9951,7 @@
 </file>
 
 <file path=word/endnotes.xml><?xml version="1.0" encoding="utf-8"?>
-<w:endnotes xmlns:wpc="http://schemas.microsoft.com/office/word/2010/wordprocessingCanvas" xmlns:cx="http://schemas.microsoft.com/office/drawing/2014/chartex" xmlns:cx1="http://schemas.microsoft.com/office/drawing/2015/9/8/chartex" xmlns:cx2="http://schemas.microsoft.com/office/drawing/2015/10/21/chartex" xmlns:cx3="http://schemas.microsoft.com/office/drawing/2016/5/9/chartex" xmlns:cx4="http://schemas.microsoft.com/office/drawing/2016/5/10/chartex" xmlns:cx5="http://schemas.microsoft.com/office/drawing/2016/5/11/chartex" xmlns:cx6="http://schemas.microsoft.com/office/drawing/2016/5/12/chartex" xmlns:cx7="http://schemas.microsoft.com/office/drawing/2016/5/13/chartex" xmlns:cx8="http://schemas.microsoft.com/office/drawing/2016/5/14/chartex" xmlns:mc="http://schemas.openxmlformats.org/markup-compatibility/2006" xmlns:m="http://schemas.openxmlformats.org/officeDocument/2006/math" xmlns:aink="http://schemas.microsoft.com/office/drawing/2016/ink" xmlns:am3d="http://schemas.microsoft.com/office/drawing/2017/model3d" xmlns:oel="http://schemas.microsoft.com/office/2019/extlst" xmlns:r="http://schemas.openxmlformats.org/officeDocument/2006/relationships" xmlns:wp14="http://schemas.microsoft.com/office/word/2010/wordprocessingDrawing" xmlns:wp="http://schemas.openxmlformats.org/drawingml/2006/wordprocessingDrawing" xmlns:wpg="http://schemas.microsoft.com/office/word/2010/wordprocessingGroup" xmlns:wpi="http://schemas.microsoft.com/office/word/2010/wordprocessingInk" xmlns:wps="http://schemas.microsoft.com/office/word/2010/wordprocessingShape" xmlns:o="urn:schemas-microsoft-com:office:office" xmlns:v="urn:schemas-microsoft-com:vml" xmlns:w10="urn:schemas-microsoft-com:office:word" xmlns:w="http://schemas.openxmlformats.org/wordprocessingml/2006/main" xmlns:w14="http://schemas.microsoft.com/office/word/2010/wordml" xmlns:w15="http://schemas.microsoft.com/office/word/2012/wordml" xmlns:w16cex="http://schemas.microsoft.com/office/word/2018/wordml/cex" xmlns:w16cid="http://schemas.microsoft.com/office/word/2016/wordml/cid" xmlns:w16="http://schemas.microsoft.com/office/word/2018/wordml" xmlns:w16sdtdh="http://schemas.microsoft.com/office/word/2020/wordml/sdtdatahash" xmlns:w16sdtfl="http://schemas.microsoft.com/office/word/2024/wordml/sdtformatlock" xmlns:w16se="http://schemas.microsoft.com/office/word/2015/wordml/symex" xmlns:w16du="http://schemas.microsoft.com/office/word/2023/wordml/word16du" xmlns:wne="http://schemas.microsoft.com/office/word/2006/wordml" mc:Ignorable="w14 w15 w16se w16cid w16 w16cex w16sdtdh w16sdtfl w16du wp14">
+<w:endnotes xmlns:wpc="http://schemas.microsoft.com/office/word/2010/wordprocessingCanvas" xmlns:cx="http://schemas.microsoft.com/office/drawing/2014/chartex" xmlns:cx1="http://schemas.microsoft.com/office/drawing/2015/9/8/chartex" xmlns:cx2="http://schemas.microsoft.com/office/drawing/2015/10/21/chartex" xmlns:cx3="http://schemas.microsoft.com/office/drawing/2016/5/9/chartex" xmlns:cx4="http://schemas.microsoft.com/office/drawing/2016/5/10/chartex" xmlns:cx5="http://schemas.microsoft.com/office/drawing/2016/5/11/chartex" xmlns:cx6="http://schemas.microsoft.com/office/drawing/2016/5/12/chartex" xmlns:cx7="http://schemas.microsoft.com/office/drawing/2016/5/13/chartex" xmlns:cx8="http://schemas.microsoft.com/office/drawing/2016/5/14/chartex" xmlns:mc="http://schemas.openxmlformats.org/markup-compatibility/2006" xmlns:aink="http://schemas.microsoft.com/office/drawing/2016/ink" xmlns:am3d="http://schemas.microsoft.com/office/drawing/2017/model3d" xmlns:o="urn:schemas-microsoft-com:office:office" xmlns:oel="http://schemas.microsoft.com/office/2019/extlst" xmlns:r="http://schemas.openxmlformats.org/officeDocument/2006/relationships" xmlns:m="http://schemas.openxmlformats.org/officeDocument/2006/math" xmlns:v="urn:schemas-microsoft-com:vml" xmlns:wp14="http://schemas.microsoft.com/office/word/2010/wordprocessingDrawing" xmlns:wp="http://schemas.openxmlformats.org/drawingml/2006/wordprocessingDrawing" xmlns:w10="urn:schemas-microsoft-com:office:word" xmlns:w="http://schemas.openxmlformats.org/wordprocessingml/2006/main" xmlns:w14="http://schemas.microsoft.com/office/word/2010/wordml" xmlns:w15="http://schemas.microsoft.com/office/word/2012/wordml" xmlns:w16cex="http://schemas.microsoft.com/office/word/2018/wordml/cex" xmlns:w16cid="http://schemas.microsoft.com/office/word/2016/wordml/cid" xmlns:w16="http://schemas.microsoft.com/office/word/2018/wordml" xmlns:w16du="http://schemas.microsoft.com/office/word/2023/wordml/word16du" xmlns:w16sdtdh="http://schemas.microsoft.com/office/word/2020/wordml/sdtdatahash" xmlns:w16sdtfl="http://schemas.microsoft.com/office/word/2024/wordml/sdtformatlock" xmlns:w16se="http://schemas.microsoft.com/office/word/2015/wordml/symex" xmlns:wpg="http://schemas.microsoft.com/office/word/2010/wordprocessingGroup" xmlns:wpi="http://schemas.microsoft.com/office/word/2010/wordprocessingInk" xmlns:wne="http://schemas.microsoft.com/office/word/2006/wordml" xmlns:wps="http://schemas.microsoft.com/office/word/2010/wordprocessingShape" mc:Ignorable="w14 w15 w16se w16cid w16 w16cex w16sdtdh w16sdtfl w16du wp14">
   <w:endnote w:type="separator" w:id="-1">
     <w:p>
       <w:pPr>
@@ -9778,10 +9983,20 @@
 </file>
 
 <file path=word/footer1.xml><?xml version="1.0" encoding="utf-8"?>
-<w:ftr xmlns:wpc="http://schemas.microsoft.com/office/word/2010/wordprocessingCanvas" xmlns:cx="http://schemas.microsoft.com/office/drawing/2014/chartex" xmlns:cx1="http://schemas.microsoft.com/office/drawing/2015/9/8/chartex" xmlns:cx2="http://schemas.microsoft.com/office/drawing/2015/10/21/chartex" xmlns:cx3="http://schemas.microsoft.com/office/drawing/2016/5/9/chartex" xmlns:cx4="http://schemas.microsoft.com/office/drawing/2016/5/10/chartex" xmlns:cx5="http://schemas.microsoft.com/office/drawing/2016/5/11/chartex" xmlns:cx6="http://schemas.microsoft.com/office/drawing/2016/5/12/chartex" xmlns:cx7="http://schemas.microsoft.com/office/drawing/2016/5/13/chartex" xmlns:cx8="http://schemas.microsoft.com/office/drawing/2016/5/14/chartex" xmlns:mc="http://schemas.openxmlformats.org/markup-compatibility/2006" xmlns:m="http://schemas.openxmlformats.org/officeDocument/2006/math" xmlns:aink="http://schemas.microsoft.com/office/drawing/2016/ink" xmlns:am3d="http://schemas.microsoft.com/office/drawing/2017/model3d" xmlns:oel="http://schemas.microsoft.com/office/2019/extlst" xmlns:r="http://schemas.openxmlformats.org/officeDocument/2006/relationships" xmlns:wp14="http://schemas.microsoft.com/office/word/2010/wordprocessingDrawing" xmlns:wp="http://schemas.openxmlformats.org/drawingml/2006/wordprocessingDrawing" xmlns:wpg="http://schemas.microsoft.com/office/word/2010/wordprocessingGroup" xmlns:wpi="http://schemas.microsoft.com/office/word/2010/wordprocessingInk" xmlns:wps="http://schemas.microsoft.com/office/word/2010/wordprocessingShape" xmlns:o="urn:schemas-microsoft-com:office:office" xmlns:v="urn:schemas-microsoft-com:vml" xmlns:w10="urn:schemas-microsoft-com:office:word" xmlns:w="http://schemas.openxmlformats.org/wordprocessingml/2006/main" xmlns:w14="http://schemas.microsoft.com/office/word/2010/wordml" xmlns:w15="http://schemas.microsoft.com/office/word/2012/wordml" xmlns:w16cex="http://schemas.microsoft.com/office/word/2018/wordml/cex" xmlns:w16cid="http://schemas.microsoft.com/office/word/2016/wordml/cid" xmlns:w16="http://schemas.microsoft.com/office/word/2018/wordml" xmlns:w16sdtdh="http://schemas.microsoft.com/office/word/2020/wordml/sdtdatahash" xmlns:w16sdtfl="http://schemas.microsoft.com/office/word/2024/wordml/sdtformatlock" xmlns:w16se="http://schemas.microsoft.com/office/word/2015/wordml/symex" xmlns:w16du="http://schemas.microsoft.com/office/word/2023/wordml/word16du" xmlns:wne="http://schemas.microsoft.com/office/word/2006/wordml" mc:Ignorable="w14 w15 w16se w16cid w16 w16cex w16sdtdh w16sdtfl w16du wp14">
+<w:ftr xmlns:wpc="http://schemas.microsoft.com/office/word/2010/wordprocessingCanvas" xmlns:cx="http://schemas.microsoft.com/office/drawing/2014/chartex" xmlns:cx1="http://schemas.microsoft.com/office/drawing/2015/9/8/chartex" xmlns:cx2="http://schemas.microsoft.com/office/drawing/2015/10/21/chartex" xmlns:cx3="http://schemas.microsoft.com/office/drawing/2016/5/9/chartex" xmlns:cx4="http://schemas.microsoft.com/office/drawing/2016/5/10/chartex" xmlns:cx5="http://schemas.microsoft.com/office/drawing/2016/5/11/chartex" xmlns:cx6="http://schemas.microsoft.com/office/drawing/2016/5/12/chartex" xmlns:cx7="http://schemas.microsoft.com/office/drawing/2016/5/13/chartex" xmlns:cx8="http://schemas.microsoft.com/office/drawing/2016/5/14/chartex" xmlns:mc="http://schemas.openxmlformats.org/markup-compatibility/2006" xmlns:aink="http://schemas.microsoft.com/office/drawing/2016/ink" xmlns:am3d="http://schemas.microsoft.com/office/drawing/2017/model3d" xmlns:o="urn:schemas-microsoft-com:office:office" xmlns:oel="http://schemas.microsoft.com/office/2019/extlst" xmlns:r="http://schemas.openxmlformats.org/officeDocument/2006/relationships" xmlns:m="http://schemas.openxmlformats.org/officeDocument/2006/math" xmlns:v="urn:schemas-microsoft-com:vml" xmlns:wp14="http://schemas.microsoft.com/office/word/2010/wordprocessingDrawing" xmlns:wp="http://schemas.openxmlformats.org/drawingml/2006/wordprocessingDrawing" xmlns:w10="urn:schemas-microsoft-com:office:word" xmlns:w="http://schemas.openxmlformats.org/wordprocessingml/2006/main" xmlns:w14="http://schemas.microsoft.com/office/word/2010/wordml" xmlns:w15="http://schemas.microsoft.com/office/word/2012/wordml" xmlns:w16cex="http://schemas.microsoft.com/office/word/2018/wordml/cex" xmlns:w16cid="http://schemas.microsoft.com/office/word/2016/wordml/cid" xmlns:w16="http://schemas.microsoft.com/office/word/2018/wordml" xmlns:w16du="http://schemas.microsoft.com/office/word/2023/wordml/word16du" xmlns:w16sdtdh="http://schemas.microsoft.com/office/word/2020/wordml/sdtdatahash" xmlns:w16sdtfl="http://schemas.microsoft.com/office/word/2024/wordml/sdtformatlock" xmlns:w16se="http://schemas.microsoft.com/office/word/2015/wordml/symex" xmlns:wpg="http://schemas.microsoft.com/office/word/2010/wordprocessingGroup" xmlns:wpi="http://schemas.microsoft.com/office/word/2010/wordprocessingInk" xmlns:wne="http://schemas.microsoft.com/office/word/2006/wordml" xmlns:wps="http://schemas.microsoft.com/office/word/2010/wordprocessingShape" mc:Ignorable="w14 w15 w16se w16cid w16 w16cex w16sdtdh w16sdtfl w16du wp14">
   <w:p>
     <w:pPr>
-      <w:pStyle w:val="Fuzeile"/>
+      <w:pStyle w:val="Footer"/>
+    </w:pPr>
+  </w:p>
+</w:ftr>
+</file>
+
+<file path=word/footer2.xml><?xml version="1.0" encoding="utf-8"?>
+<w:ftr xmlns:wpc="http://schemas.microsoft.com/office/word/2010/wordprocessingCanvas" xmlns:cx="http://schemas.microsoft.com/office/drawing/2014/chartex" xmlns:cx1="http://schemas.microsoft.com/office/drawing/2015/9/8/chartex" xmlns:cx2="http://schemas.microsoft.com/office/drawing/2015/10/21/chartex" xmlns:cx3="http://schemas.microsoft.com/office/drawing/2016/5/9/chartex" xmlns:cx4="http://schemas.microsoft.com/office/drawing/2016/5/10/chartex" xmlns:cx5="http://schemas.microsoft.com/office/drawing/2016/5/11/chartex" xmlns:cx6="http://schemas.microsoft.com/office/drawing/2016/5/12/chartex" xmlns:cx7="http://schemas.microsoft.com/office/drawing/2016/5/13/chartex" xmlns:cx8="http://schemas.microsoft.com/office/drawing/2016/5/14/chartex" xmlns:mc="http://schemas.openxmlformats.org/markup-compatibility/2006" xmlns:aink="http://schemas.microsoft.com/office/drawing/2016/ink" xmlns:am3d="http://schemas.microsoft.com/office/drawing/2017/model3d" xmlns:o="urn:schemas-microsoft-com:office:office" xmlns:oel="http://schemas.microsoft.com/office/2019/extlst" xmlns:r="http://schemas.openxmlformats.org/officeDocument/2006/relationships" xmlns:m="http://schemas.openxmlformats.org/officeDocument/2006/math" xmlns:v="urn:schemas-microsoft-com:vml" xmlns:wp14="http://schemas.microsoft.com/office/word/2010/wordprocessingDrawing" xmlns:wp="http://schemas.openxmlformats.org/drawingml/2006/wordprocessingDrawing" xmlns:w10="urn:schemas-microsoft-com:office:word" xmlns:w="http://schemas.openxmlformats.org/wordprocessingml/2006/main" xmlns:w14="http://schemas.microsoft.com/office/word/2010/wordml" xmlns:w15="http://schemas.microsoft.com/office/word/2012/wordml" xmlns:w16cex="http://schemas.microsoft.com/office/word/2018/wordml/cex" xmlns:w16cid="http://schemas.microsoft.com/office/word/2016/wordml/cid" xmlns:w16="http://schemas.microsoft.com/office/word/2018/wordml" xmlns:w16du="http://schemas.microsoft.com/office/word/2023/wordml/word16du" xmlns:w16sdtdh="http://schemas.microsoft.com/office/word/2020/wordml/sdtdatahash" xmlns:w16sdtfl="http://schemas.microsoft.com/office/word/2024/wordml/sdtformatlock" xmlns:w16se="http://schemas.microsoft.com/office/word/2015/wordml/symex" xmlns:wpg="http://schemas.microsoft.com/office/word/2010/wordprocessingGroup" xmlns:wpi="http://schemas.microsoft.com/office/word/2010/wordprocessingInk" xmlns:wne="http://schemas.microsoft.com/office/word/2006/wordml" xmlns:wps="http://schemas.microsoft.com/office/word/2010/wordprocessingShape" mc:Ignorable="w14 w15 w16se w16cid w16 w16cex w16sdtdh w16sdtfl w16du wp14">
+  <w:p>
+    <w:pPr>
+      <w:pStyle w:val="Footer"/>
     </w:pPr>
     <w:r>
       <w:t>Al Hassan Al Sebehawi</w:t>
@@ -9862,7 +10077,7 @@
                           <w:txbxContent>
                             <w:p>
                               <w:pPr>
-                                <w:pStyle w:val="Fuzeile"/>
+                                <w:pStyle w:val="Footer"/>
                                 <w:pBdr>
                                   <w:top w:val="single" w:sz="12" w:space="1" w:color="A5A5A5" w:themeColor="accent3"/>
                                   <w:bottom w:val="single" w:sz="48" w:space="1" w:color="A5A5A5" w:themeColor="accent3"/>
@@ -9933,12 +10148,12 @@
                   </v:formulas>
                   <v:path gradientshapeok="t" limo="10800,10800" o:connecttype="custom" o:connectlocs="@8,0;0,@9;@8,@7;@6,@9" textboxrect="@3,@3,@4,@5"/>
                 </v:shapetype>
-                <v:shape id="Flussdiagramm: Alternativer Prozess 8" o:spid="_x0000_s1026" type="#_x0000_t176" style="position:absolute;margin-left:0;margin-top:0;width:40.35pt;height:34.75pt;z-index:251658240;visibility:visible;mso-wrap-style:square;mso-width-percent:0;mso-height-percent:0;mso-wrap-distance-left:9pt;mso-wrap-distance-top:0;mso-wrap-distance-right:9pt;mso-wrap-distance-bottom:0;mso-position-horizontal:center;mso-position-horizontal-relative:right-margin-area;mso-position-vertical:center;mso-position-vertical-relative:bottom-margin-area;mso-width-percent:0;mso-height-percent:0;mso-width-relative:page;mso-height-relative:page;v-text-anchor:top" o:gfxdata="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" filled="f" fillcolor="#5c83b4" stroked="f" strokecolor="#737373">
+                <v:shape id="Flussdiagramm: Alternativer Prozess 8" o:spid="_x0000_s1026" type="#_x0000_t176" style="position:absolute;margin-left:0;margin-top:0;width:40.35pt;height:34.75pt;z-index:251658240;visibility:visible;mso-wrap-style:square;mso-width-percent:0;mso-height-percent:0;mso-wrap-distance-left:9pt;mso-wrap-distance-top:0;mso-wrap-distance-right:9pt;mso-wrap-distance-bottom:0;mso-position-horizontal:center;mso-position-horizontal-relative:right-margin-area;mso-position-vertical:center;mso-position-vertical-relative:bottom-margin-area;mso-width-percent:0;mso-height-percent:0;mso-width-relative:page;mso-height-relative:page;v-text-anchor:top" o:gfxdata="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" filled="f" fillcolor="#5c83b4" stroked="f" strokecolor="#737373">
                   <v:textbox>
                     <w:txbxContent>
                       <w:p>
                         <w:pPr>
-                          <w:pStyle w:val="Fuzeile"/>
+                          <w:pStyle w:val="Footer"/>
                           <w:pBdr>
                             <w:top w:val="single" w:sz="12" w:space="1" w:color="A5A5A5" w:themeColor="accent3"/>
                             <w:bottom w:val="single" w:sz="48" w:space="1" w:color="A5A5A5" w:themeColor="accent3"/>
@@ -9984,21 +10199,28 @@
         </w:r>
       </w:sdtContent>
     </w:sdt>
+    <w:r>
+      <w:tab/>
+    </w:r>
+    <w:r>
+      <w:tab/>
+      <w:t>Niklaus Janett</w:t>
+    </w:r>
   </w:p>
 </w:ftr>
 </file>
 
-<file path=word/footer2.xml><?xml version="1.0" encoding="utf-8"?>
-<w:ftr xmlns:wpc="http://schemas.microsoft.com/office/word/2010/wordprocessingCanvas" xmlns:cx="http://schemas.microsoft.com/office/drawing/2014/chartex" xmlns:cx1="http://schemas.microsoft.com/office/drawing/2015/9/8/chartex" xmlns:cx2="http://schemas.microsoft.com/office/drawing/2015/10/21/chartex" xmlns:cx3="http://schemas.microsoft.com/office/drawing/2016/5/9/chartex" xmlns:cx4="http://schemas.microsoft.com/office/drawing/2016/5/10/chartex" xmlns:cx5="http://schemas.microsoft.com/office/drawing/2016/5/11/chartex" xmlns:cx6="http://schemas.microsoft.com/office/drawing/2016/5/12/chartex" xmlns:cx7="http://schemas.microsoft.com/office/drawing/2016/5/13/chartex" xmlns:cx8="http://schemas.microsoft.com/office/drawing/2016/5/14/chartex" xmlns:mc="http://schemas.openxmlformats.org/markup-compatibility/2006" xmlns:m="http://schemas.openxmlformats.org/officeDocument/2006/math" xmlns:aink="http://schemas.microsoft.com/office/drawing/2016/ink" xmlns:am3d="http://schemas.microsoft.com/office/drawing/2017/model3d" xmlns:oel="http://schemas.microsoft.com/office/2019/extlst" xmlns:r="http://schemas.openxmlformats.org/officeDocument/2006/relationships" xmlns:wp14="http://schemas.microsoft.com/office/word/2010/wordprocessingDrawing" xmlns:wp="http://schemas.openxmlformats.org/drawingml/2006/wordprocessingDrawing" xmlns:wpg="http://schemas.microsoft.com/office/word/2010/wordprocessingGroup" xmlns:wpi="http://schemas.microsoft.com/office/word/2010/wordprocessingInk" xmlns:wps="http://schemas.microsoft.com/office/word/2010/wordprocessingShape" xmlns:o="urn:schemas-microsoft-com:office:office" xmlns:v="urn:schemas-microsoft-com:vml" xmlns:w10="urn:schemas-microsoft-com:office:word" xmlns:w="http://schemas.openxmlformats.org/wordprocessingml/2006/main" xmlns:w14="http://schemas.microsoft.com/office/word/2010/wordml" xmlns:w15="http://schemas.microsoft.com/office/word/2012/wordml" xmlns:w16cex="http://schemas.microsoft.com/office/word/2018/wordml/cex" xmlns:w16cid="http://schemas.microsoft.com/office/word/2016/wordml/cid" xmlns:w16="http://schemas.microsoft.com/office/word/2018/wordml" xmlns:w16sdtdh="http://schemas.microsoft.com/office/word/2020/wordml/sdtdatahash" xmlns:w16sdtfl="http://schemas.microsoft.com/office/word/2024/wordml/sdtformatlock" xmlns:w16se="http://schemas.microsoft.com/office/word/2015/wordml/symex" xmlns:w16du="http://schemas.microsoft.com/office/word/2023/wordml/word16du" xmlns:wne="http://schemas.microsoft.com/office/word/2006/wordml" mc:Ignorable="w14 w15 w16se w16cid w16 w16cex w16sdtdh w16sdtfl w16du wp14">
+<file path=word/footer3.xml><?xml version="1.0" encoding="utf-8"?>
+<w:ftr xmlns:wpc="http://schemas.microsoft.com/office/word/2010/wordprocessingCanvas" xmlns:cx="http://schemas.microsoft.com/office/drawing/2014/chartex" xmlns:cx1="http://schemas.microsoft.com/office/drawing/2015/9/8/chartex" xmlns:cx2="http://schemas.microsoft.com/office/drawing/2015/10/21/chartex" xmlns:cx3="http://schemas.microsoft.com/office/drawing/2016/5/9/chartex" xmlns:cx4="http://schemas.microsoft.com/office/drawing/2016/5/10/chartex" xmlns:cx5="http://schemas.microsoft.com/office/drawing/2016/5/11/chartex" xmlns:cx6="http://schemas.microsoft.com/office/drawing/2016/5/12/chartex" xmlns:cx7="http://schemas.microsoft.com/office/drawing/2016/5/13/chartex" xmlns:cx8="http://schemas.microsoft.com/office/drawing/2016/5/14/chartex" xmlns:mc="http://schemas.openxmlformats.org/markup-compatibility/2006" xmlns:aink="http://schemas.microsoft.com/office/drawing/2016/ink" xmlns:am3d="http://schemas.microsoft.com/office/drawing/2017/model3d" xmlns:o="urn:schemas-microsoft-com:office:office" xmlns:oel="http://schemas.microsoft.com/office/2019/extlst" xmlns:r="http://schemas.openxmlformats.org/officeDocument/2006/relationships" xmlns:m="http://schemas.openxmlformats.org/officeDocument/2006/math" xmlns:v="urn:schemas-microsoft-com:vml" xmlns:wp14="http://schemas.microsoft.com/office/word/2010/wordprocessingDrawing" xmlns:wp="http://schemas.openxmlformats.org/drawingml/2006/wordprocessingDrawing" xmlns:w10="urn:schemas-microsoft-com:office:word" xmlns:w="http://schemas.openxmlformats.org/wordprocessingml/2006/main" xmlns:w14="http://schemas.microsoft.com/office/word/2010/wordml" xmlns:w15="http://schemas.microsoft.com/office/word/2012/wordml" xmlns:w16cex="http://schemas.microsoft.com/office/word/2018/wordml/cex" xmlns:w16cid="http://schemas.microsoft.com/office/word/2016/wordml/cid" xmlns:w16="http://schemas.microsoft.com/office/word/2018/wordml" xmlns:w16du="http://schemas.microsoft.com/office/word/2023/wordml/word16du" xmlns:w16sdtdh="http://schemas.microsoft.com/office/word/2020/wordml/sdtdatahash" xmlns:w16sdtfl="http://schemas.microsoft.com/office/word/2024/wordml/sdtformatlock" xmlns:w16se="http://schemas.microsoft.com/office/word/2015/wordml/symex" xmlns:wpg="http://schemas.microsoft.com/office/word/2010/wordprocessingGroup" xmlns:wpi="http://schemas.microsoft.com/office/word/2010/wordprocessingInk" xmlns:wne="http://schemas.microsoft.com/office/word/2006/wordml" xmlns:wps="http://schemas.microsoft.com/office/word/2010/wordprocessingShape" mc:Ignorable="w14 w15 w16se w16cid w16 w16cex w16sdtdh w16sdtfl w16du wp14">
   <w:p>
     <w:pPr>
-      <w:pStyle w:val="Fuzeile"/>
+      <w:pStyle w:val="Footer"/>
       <w:jc w:val="right"/>
     </w:pPr>
   </w:p>
   <w:p>
     <w:pPr>
-      <w:pStyle w:val="Fuzeile"/>
+      <w:pStyle w:val="Footer"/>
       <w:tabs>
         <w:tab w:val="clear" w:pos="4536"/>
         <w:tab w:val="clear" w:pos="9072"/>
@@ -10009,17 +10231,17 @@
 </w:ftr>
 </file>
 
-<file path=word/footer3.xml><?xml version="1.0" encoding="utf-8"?>
-<w:ftr xmlns:wpc="http://schemas.microsoft.com/office/word/2010/wordprocessingCanvas" xmlns:cx="http://schemas.microsoft.com/office/drawing/2014/chartex" xmlns:cx1="http://schemas.microsoft.com/office/drawing/2015/9/8/chartex" xmlns:cx2="http://schemas.microsoft.com/office/drawing/2015/10/21/chartex" xmlns:cx3="http://schemas.microsoft.com/office/drawing/2016/5/9/chartex" xmlns:cx4="http://schemas.microsoft.com/office/drawing/2016/5/10/chartex" xmlns:cx5="http://schemas.microsoft.com/office/drawing/2016/5/11/chartex" xmlns:cx6="http://schemas.microsoft.com/office/drawing/2016/5/12/chartex" xmlns:cx7="http://schemas.microsoft.com/office/drawing/2016/5/13/chartex" xmlns:cx8="http://schemas.microsoft.com/office/drawing/2016/5/14/chartex" xmlns:mc="http://schemas.openxmlformats.org/markup-compatibility/2006" xmlns:m="http://schemas.openxmlformats.org/officeDocument/2006/math" xmlns:aink="http://schemas.microsoft.com/office/drawing/2016/ink" xmlns:am3d="http://schemas.microsoft.com/office/drawing/2017/model3d" xmlns:oel="http://schemas.microsoft.com/office/2019/extlst" xmlns:r="http://schemas.openxmlformats.org/officeDocument/2006/relationships" xmlns:wp14="http://schemas.microsoft.com/office/word/2010/wordprocessingDrawing" xmlns:wp="http://schemas.openxmlformats.org/drawingml/2006/wordprocessingDrawing" xmlns:wpg="http://schemas.microsoft.com/office/word/2010/wordprocessingGroup" xmlns:wpi="http://schemas.microsoft.com/office/word/2010/wordprocessingInk" xmlns:wps="http://schemas.microsoft.com/office/word/2010/wordprocessingShape" xmlns:o="urn:schemas-microsoft-com:office:office" xmlns:v="urn:schemas-microsoft-com:vml" xmlns:w10="urn:schemas-microsoft-com:office:word" xmlns:w="http://schemas.openxmlformats.org/wordprocessingml/2006/main" xmlns:w14="http://schemas.microsoft.com/office/word/2010/wordml" xmlns:w15="http://schemas.microsoft.com/office/word/2012/wordml" xmlns:w16cex="http://schemas.microsoft.com/office/word/2018/wordml/cex" xmlns:w16cid="http://schemas.microsoft.com/office/word/2016/wordml/cid" xmlns:w16="http://schemas.microsoft.com/office/word/2018/wordml" xmlns:w16sdtdh="http://schemas.microsoft.com/office/word/2020/wordml/sdtdatahash" xmlns:w16sdtfl="http://schemas.microsoft.com/office/word/2024/wordml/sdtformatlock" xmlns:w16se="http://schemas.microsoft.com/office/word/2015/wordml/symex" xmlns:w16du="http://schemas.microsoft.com/office/word/2023/wordml/word16du" xmlns:wne="http://schemas.microsoft.com/office/word/2006/wordml" mc:Ignorable="w14 w15 w16se w16cid w16 w16cex w16sdtdh w16sdtfl w16du wp14">
+<file path=word/footer4.xml><?xml version="1.0" encoding="utf-8"?>
+<w:ftr xmlns:wpc="http://schemas.microsoft.com/office/word/2010/wordprocessingCanvas" xmlns:cx="http://schemas.microsoft.com/office/drawing/2014/chartex" xmlns:cx1="http://schemas.microsoft.com/office/drawing/2015/9/8/chartex" xmlns:cx2="http://schemas.microsoft.com/office/drawing/2015/10/21/chartex" xmlns:cx3="http://schemas.microsoft.com/office/drawing/2016/5/9/chartex" xmlns:cx4="http://schemas.microsoft.com/office/drawing/2016/5/10/chartex" xmlns:cx5="http://schemas.microsoft.com/office/drawing/2016/5/11/chartex" xmlns:cx6="http://schemas.microsoft.com/office/drawing/2016/5/12/chartex" xmlns:cx7="http://schemas.microsoft.com/office/drawing/2016/5/13/chartex" xmlns:cx8="http://schemas.microsoft.com/office/drawing/2016/5/14/chartex" xmlns:mc="http://schemas.openxmlformats.org/markup-compatibility/2006" xmlns:aink="http://schemas.microsoft.com/office/drawing/2016/ink" xmlns:am3d="http://schemas.microsoft.com/office/drawing/2017/model3d" xmlns:o="urn:schemas-microsoft-com:office:office" xmlns:oel="http://schemas.microsoft.com/office/2019/extlst" xmlns:r="http://schemas.openxmlformats.org/officeDocument/2006/relationships" xmlns:m="http://schemas.openxmlformats.org/officeDocument/2006/math" xmlns:v="urn:schemas-microsoft-com:vml" xmlns:wp14="http://schemas.microsoft.com/office/word/2010/wordprocessingDrawing" xmlns:wp="http://schemas.openxmlformats.org/drawingml/2006/wordprocessingDrawing" xmlns:w10="urn:schemas-microsoft-com:office:word" xmlns:w="http://schemas.openxmlformats.org/wordprocessingml/2006/main" xmlns:w14="http://schemas.microsoft.com/office/word/2010/wordml" xmlns:w15="http://schemas.microsoft.com/office/word/2012/wordml" xmlns:w16cex="http://schemas.microsoft.com/office/word/2018/wordml/cex" xmlns:w16cid="http://schemas.microsoft.com/office/word/2016/wordml/cid" xmlns:w16="http://schemas.microsoft.com/office/word/2018/wordml" xmlns:w16du="http://schemas.microsoft.com/office/word/2023/wordml/word16du" xmlns:w16sdtdh="http://schemas.microsoft.com/office/word/2020/wordml/sdtdatahash" xmlns:w16sdtfl="http://schemas.microsoft.com/office/word/2024/wordml/sdtformatlock" xmlns:w16se="http://schemas.microsoft.com/office/word/2015/wordml/symex" xmlns:wpg="http://schemas.microsoft.com/office/word/2010/wordprocessingGroup" xmlns:wpi="http://schemas.microsoft.com/office/word/2010/wordprocessingInk" xmlns:wne="http://schemas.microsoft.com/office/word/2006/wordml" xmlns:wps="http://schemas.microsoft.com/office/word/2010/wordprocessingShape" mc:Ignorable="w14 w15 w16se w16cid w16 w16cex w16sdtdh w16sdtfl w16du wp14">
   <w:p>
     <w:pPr>
-      <w:pStyle w:val="Fuzeile"/>
+      <w:pStyle w:val="Footer"/>
       <w:jc w:val="right"/>
     </w:pPr>
   </w:p>
   <w:p>
     <w:pPr>
-      <w:pStyle w:val="Fuzeile"/>
+      <w:pStyle w:val="Footer"/>
       <w:tabs>
         <w:tab w:val="clear" w:pos="4536"/>
         <w:tab w:val="clear" w:pos="9072"/>
@@ -10031,7 +10253,7 @@
 </file>
 
 <file path=word/footnotes.xml><?xml version="1.0" encoding="utf-8"?>
-<w:footnotes xmlns:wpc="http://schemas.microsoft.com/office/word/2010/wordprocessingCanvas" xmlns:cx="http://schemas.microsoft.com/office/drawing/2014/chartex" xmlns:cx1="http://schemas.microsoft.com/office/drawing/2015/9/8/chartex" xmlns:cx2="http://schemas.microsoft.com/office/drawing/2015/10/21/chartex" xmlns:cx3="http://schemas.microsoft.com/office/drawing/2016/5/9/chartex" xmlns:cx4="http://schemas.microsoft.com/office/drawing/2016/5/10/chartex" xmlns:cx5="http://schemas.microsoft.com/office/drawing/2016/5/11/chartex" xmlns:cx6="http://schemas.microsoft.com/office/drawing/2016/5/12/chartex" xmlns:cx7="http://schemas.microsoft.com/office/drawing/2016/5/13/chartex" xmlns:cx8="http://schemas.microsoft.com/office/drawing/2016/5/14/chartex" xmlns:mc="http://schemas.openxmlformats.org/markup-compatibility/2006" xmlns:m="http://schemas.openxmlformats.org/officeDocument/2006/math" xmlns:aink="http://schemas.microsoft.com/office/drawing/2016/ink" xmlns:am3d="http://schemas.microsoft.com/office/drawing/2017/model3d" xmlns:oel="http://schemas.microsoft.com/office/2019/extlst" xmlns:r="http://schemas.openxmlformats.org/officeDocument/2006/relationships" xmlns:wp14="http://schemas.microsoft.com/office/word/2010/wordprocessingDrawing" xmlns:wp="http://schemas.openxmlformats.org/drawingml/2006/wordprocessingDrawing" xmlns:wpg="http://schemas.microsoft.com/office/word/2010/wordprocessingGroup" xmlns:wpi="http://schemas.microsoft.com/office/word/2010/wordprocessingInk" xmlns:wps="http://schemas.microsoft.com/office/word/2010/wordprocessingShape" xmlns:o="urn:schemas-microsoft-com:office:office" xmlns:v="urn:schemas-microsoft-com:vml" xmlns:w10="urn:schemas-microsoft-com:office:word" xmlns:w="http://schemas.openxmlformats.org/wordprocessingml/2006/main" xmlns:w14="http://schemas.microsoft.com/office/word/2010/wordml" xmlns:w15="http://schemas.microsoft.com/office/word/2012/wordml" xmlns:w16cex="http://schemas.microsoft.com/office/word/2018/wordml/cex" xmlns:w16cid="http://schemas.microsoft.com/office/word/2016/wordml/cid" xmlns:w16="http://schemas.microsoft.com/office/word/2018/wordml" xmlns:w16sdtdh="http://schemas.microsoft.com/office/word/2020/wordml/sdtdatahash" xmlns:w16sdtfl="http://schemas.microsoft.com/office/word/2024/wordml/sdtformatlock" xmlns:w16se="http://schemas.microsoft.com/office/word/2015/wordml/symex" xmlns:w16du="http://schemas.microsoft.com/office/word/2023/wordml/word16du" xmlns:wne="http://schemas.microsoft.com/office/word/2006/wordml" mc:Ignorable="w14 w15 w16se w16cid w16 w16cex w16sdtdh w16sdtfl w16du wp14">
+<w:footnotes xmlns:wpc="http://schemas.microsoft.com/office/word/2010/wordprocessingCanvas" xmlns:cx="http://schemas.microsoft.com/office/drawing/2014/chartex" xmlns:cx1="http://schemas.microsoft.com/office/drawing/2015/9/8/chartex" xmlns:cx2="http://schemas.microsoft.com/office/drawing/2015/10/21/chartex" xmlns:cx3="http://schemas.microsoft.com/office/drawing/2016/5/9/chartex" xmlns:cx4="http://schemas.microsoft.com/office/drawing/2016/5/10/chartex" xmlns:cx5="http://schemas.microsoft.com/office/drawing/2016/5/11/chartex" xmlns:cx6="http://schemas.microsoft.com/office/drawing/2016/5/12/chartex" xmlns:cx7="http://schemas.microsoft.com/office/drawing/2016/5/13/chartex" xmlns:cx8="http://schemas.microsoft.com/office/drawing/2016/5/14/chartex" xmlns:mc="http://schemas.openxmlformats.org/markup-compatibility/2006" xmlns:aink="http://schemas.microsoft.com/office/drawing/2016/ink" xmlns:am3d="http://schemas.microsoft.com/office/drawing/2017/model3d" xmlns:o="urn:schemas-microsoft-com:office:office" xmlns:oel="http://schemas.microsoft.com/office/2019/extlst" xmlns:r="http://schemas.openxmlformats.org/officeDocument/2006/relationships" xmlns:m="http://schemas.openxmlformats.org/officeDocument/2006/math" xmlns:v="urn:schemas-microsoft-com:vml" xmlns:wp14="http://schemas.microsoft.com/office/word/2010/wordprocessingDrawing" xmlns:wp="http://schemas.openxmlformats.org/drawingml/2006/wordprocessingDrawing" xmlns:w10="urn:schemas-microsoft-com:office:word" xmlns:w="http://schemas.openxmlformats.org/wordprocessingml/2006/main" xmlns:w14="http://schemas.microsoft.com/office/word/2010/wordml" xmlns:w15="http://schemas.microsoft.com/office/word/2012/wordml" xmlns:w16cex="http://schemas.microsoft.com/office/word/2018/wordml/cex" xmlns:w16cid="http://schemas.microsoft.com/office/word/2016/wordml/cid" xmlns:w16="http://schemas.microsoft.com/office/word/2018/wordml" xmlns:w16du="http://schemas.microsoft.com/office/word/2023/wordml/word16du" xmlns:w16sdtdh="http://schemas.microsoft.com/office/word/2020/wordml/sdtdatahash" xmlns:w16sdtfl="http://schemas.microsoft.com/office/word/2024/wordml/sdtformatlock" xmlns:w16se="http://schemas.microsoft.com/office/word/2015/wordml/symex" xmlns:wpg="http://schemas.microsoft.com/office/word/2010/wordprocessingGroup" xmlns:wpi="http://schemas.microsoft.com/office/word/2010/wordprocessingInk" xmlns:wne="http://schemas.microsoft.com/office/word/2006/wordml" xmlns:wps="http://schemas.microsoft.com/office/word/2010/wordprocessingShape" mc:Ignorable="w14 w15 w16se w16cid w16 w16cex w16sdtdh w16sdtfl w16du wp14">
   <w:footnote w:type="separator" w:id="-1">
     <w:p>
       <w:pPr>
@@ -10063,17 +10285,47 @@
 </file>
 
 <file path=word/header1.xml><?xml version="1.0" encoding="utf-8"?>
-<w:hdr xmlns:wpc="http://schemas.microsoft.com/office/word/2010/wordprocessingCanvas" xmlns:cx="http://schemas.microsoft.com/office/drawing/2014/chartex" xmlns:cx1="http://schemas.microsoft.com/office/drawing/2015/9/8/chartex" xmlns:cx2="http://schemas.microsoft.com/office/drawing/2015/10/21/chartex" xmlns:cx3="http://schemas.microsoft.com/office/drawing/2016/5/9/chartex" xmlns:cx4="http://schemas.microsoft.com/office/drawing/2016/5/10/chartex" xmlns:cx5="http://schemas.microsoft.com/office/drawing/2016/5/11/chartex" xmlns:cx6="http://schemas.microsoft.com/office/drawing/2016/5/12/chartex" xmlns:cx7="http://schemas.microsoft.com/office/drawing/2016/5/13/chartex" xmlns:cx8="http://schemas.microsoft.com/office/drawing/2016/5/14/chartex" xmlns:mc="http://schemas.openxmlformats.org/markup-compatibility/2006" xmlns:m="http://schemas.openxmlformats.org/officeDocument/2006/math" xmlns:aink="http://schemas.microsoft.com/office/drawing/2016/ink" xmlns:am3d="http://schemas.microsoft.com/office/drawing/2017/model3d" xmlns:oel="http://schemas.microsoft.com/office/2019/extlst" xmlns:r="http://schemas.openxmlformats.org/officeDocument/2006/relationships" xmlns:wp14="http://schemas.microsoft.com/office/word/2010/wordprocessingDrawing" xmlns:wp="http://schemas.openxmlformats.org/drawingml/2006/wordprocessingDrawing" xmlns:wpg="http://schemas.microsoft.com/office/word/2010/wordprocessingGroup" xmlns:wpi="http://schemas.microsoft.com/office/word/2010/wordprocessingInk" xmlns:wps="http://schemas.microsoft.com/office/word/2010/wordprocessingShape" xmlns:o="urn:schemas-microsoft-com:office:office" xmlns:v="urn:schemas-microsoft-com:vml" xmlns:w10="urn:schemas-microsoft-com:office:word" xmlns:w="http://schemas.openxmlformats.org/wordprocessingml/2006/main" xmlns:w14="http://schemas.microsoft.com/office/word/2010/wordml" xmlns:w15="http://schemas.microsoft.com/office/word/2012/wordml" xmlns:w16cex="http://schemas.microsoft.com/office/word/2018/wordml/cex" xmlns:w16cid="http://schemas.microsoft.com/office/word/2016/wordml/cid" xmlns:w16="http://schemas.microsoft.com/office/word/2018/wordml" xmlns:w16sdtdh="http://schemas.microsoft.com/office/word/2020/wordml/sdtdatahash" xmlns:w16sdtfl="http://schemas.microsoft.com/office/word/2024/wordml/sdtformatlock" xmlns:w16se="http://schemas.microsoft.com/office/word/2015/wordml/symex" xmlns:w16du="http://schemas.microsoft.com/office/word/2023/wordml/word16du" xmlns:wne="http://schemas.microsoft.com/office/word/2006/wordml" mc:Ignorable="w14 w15 w16se w16cid w16 w16cex w16sdtdh w16sdtfl w16du wp14">
+<w:hdr xmlns:wpc="http://schemas.microsoft.com/office/word/2010/wordprocessingCanvas" xmlns:cx="http://schemas.microsoft.com/office/drawing/2014/chartex" xmlns:cx1="http://schemas.microsoft.com/office/drawing/2015/9/8/chartex" xmlns:cx2="http://schemas.microsoft.com/office/drawing/2015/10/21/chartex" xmlns:cx3="http://schemas.microsoft.com/office/drawing/2016/5/9/chartex" xmlns:cx4="http://schemas.microsoft.com/office/drawing/2016/5/10/chartex" xmlns:cx5="http://schemas.microsoft.com/office/drawing/2016/5/11/chartex" xmlns:cx6="http://schemas.microsoft.com/office/drawing/2016/5/12/chartex" xmlns:cx7="http://schemas.microsoft.com/office/drawing/2016/5/13/chartex" xmlns:cx8="http://schemas.microsoft.com/office/drawing/2016/5/14/chartex" xmlns:mc="http://schemas.openxmlformats.org/markup-compatibility/2006" xmlns:aink="http://schemas.microsoft.com/office/drawing/2016/ink" xmlns:am3d="http://schemas.microsoft.com/office/drawing/2017/model3d" xmlns:o="urn:schemas-microsoft-com:office:office" xmlns:oel="http://schemas.microsoft.com/office/2019/extlst" xmlns:r="http://schemas.openxmlformats.org/officeDocument/2006/relationships" xmlns:m="http://schemas.openxmlformats.org/officeDocument/2006/math" xmlns:v="urn:schemas-microsoft-com:vml" xmlns:wp14="http://schemas.microsoft.com/office/word/2010/wordprocessingDrawing" xmlns:wp="http://schemas.openxmlformats.org/drawingml/2006/wordprocessingDrawing" xmlns:w10="urn:schemas-microsoft-com:office:word" xmlns:w="http://schemas.openxmlformats.org/wordprocessingml/2006/main" xmlns:w14="http://schemas.microsoft.com/office/word/2010/wordml" xmlns:w15="http://schemas.microsoft.com/office/word/2012/wordml" xmlns:w16cex="http://schemas.microsoft.com/office/word/2018/wordml/cex" xmlns:w16cid="http://schemas.microsoft.com/office/word/2016/wordml/cid" xmlns:w16="http://schemas.microsoft.com/office/word/2018/wordml" xmlns:w16du="http://schemas.microsoft.com/office/word/2023/wordml/word16du" xmlns:w16sdtdh="http://schemas.microsoft.com/office/word/2020/wordml/sdtdatahash" xmlns:w16sdtfl="http://schemas.microsoft.com/office/word/2024/wordml/sdtformatlock" xmlns:w16se="http://schemas.microsoft.com/office/word/2015/wordml/symex" xmlns:wpg="http://schemas.microsoft.com/office/word/2010/wordprocessingGroup" xmlns:wpi="http://schemas.microsoft.com/office/word/2010/wordprocessingInk" xmlns:wne="http://schemas.microsoft.com/office/word/2006/wordml" xmlns:wps="http://schemas.microsoft.com/office/word/2010/wordprocessingShape" mc:Ignorable="w14 w15 w16se w16cid w16 w16cex w16sdtdh w16sdtfl w16du wp14">
   <w:p>
     <w:pPr>
-      <w:pStyle w:val="Kopfzeile"/>
+      <w:pStyle w:val="Header"/>
+    </w:pPr>
+  </w:p>
+</w:hdr>
+</file>
+
+<file path=word/header2.xml><?xml version="1.0" encoding="utf-8"?>
+<w:hdr xmlns:wpc="http://schemas.microsoft.com/office/word/2010/wordprocessingCanvas" xmlns:cx="http://schemas.microsoft.com/office/drawing/2014/chartex" xmlns:cx1="http://schemas.microsoft.com/office/drawing/2015/9/8/chartex" xmlns:cx2="http://schemas.microsoft.com/office/drawing/2015/10/21/chartex" xmlns:cx3="http://schemas.microsoft.com/office/drawing/2016/5/9/chartex" xmlns:cx4="http://schemas.microsoft.com/office/drawing/2016/5/10/chartex" xmlns:cx5="http://schemas.microsoft.com/office/drawing/2016/5/11/chartex" xmlns:cx6="http://schemas.microsoft.com/office/drawing/2016/5/12/chartex" xmlns:cx7="http://schemas.microsoft.com/office/drawing/2016/5/13/chartex" xmlns:cx8="http://schemas.microsoft.com/office/drawing/2016/5/14/chartex" xmlns:mc="http://schemas.openxmlformats.org/markup-compatibility/2006" xmlns:aink="http://schemas.microsoft.com/office/drawing/2016/ink" xmlns:am3d="http://schemas.microsoft.com/office/drawing/2017/model3d" xmlns:o="urn:schemas-microsoft-com:office:office" xmlns:oel="http://schemas.microsoft.com/office/2019/extlst" xmlns:r="http://schemas.openxmlformats.org/officeDocument/2006/relationships" xmlns:m="http://schemas.openxmlformats.org/officeDocument/2006/math" xmlns:v="urn:schemas-microsoft-com:vml" xmlns:wp14="http://schemas.microsoft.com/office/word/2010/wordprocessingDrawing" xmlns:wp="http://schemas.openxmlformats.org/drawingml/2006/wordprocessingDrawing" xmlns:w10="urn:schemas-microsoft-com:office:word" xmlns:w="http://schemas.openxmlformats.org/wordprocessingml/2006/main" xmlns:w14="http://schemas.microsoft.com/office/word/2010/wordml" xmlns:w15="http://schemas.microsoft.com/office/word/2012/wordml" xmlns:w16cex="http://schemas.microsoft.com/office/word/2018/wordml/cex" xmlns:w16cid="http://schemas.microsoft.com/office/word/2016/wordml/cid" xmlns:w16="http://schemas.microsoft.com/office/word/2018/wordml" xmlns:w16du="http://schemas.microsoft.com/office/word/2023/wordml/word16du" xmlns:w16sdtdh="http://schemas.microsoft.com/office/word/2020/wordml/sdtdatahash" xmlns:w16sdtfl="http://schemas.microsoft.com/office/word/2024/wordml/sdtformatlock" xmlns:w16se="http://schemas.microsoft.com/office/word/2015/wordml/symex" xmlns:wpg="http://schemas.microsoft.com/office/word/2010/wordprocessingGroup" xmlns:wpi="http://schemas.microsoft.com/office/word/2010/wordprocessingInk" xmlns:wne="http://schemas.microsoft.com/office/word/2006/wordml" xmlns:wps="http://schemas.microsoft.com/office/word/2010/wordprocessingShape" mc:Ignorable="w14 w15 w16se w16cid w16 w16cex w16sdtdh w16sdtfl w16du wp14">
+  <w:p>
+    <w:pPr>
+      <w:pStyle w:val="Header"/>
+    </w:pPr>
+  </w:p>
+</w:hdr>
+</file>
+
+<file path=word/header3.xml><?xml version="1.0" encoding="utf-8"?>
+<w:hdr xmlns:wpc="http://schemas.microsoft.com/office/word/2010/wordprocessingCanvas" xmlns:cx="http://schemas.microsoft.com/office/drawing/2014/chartex" xmlns:cx1="http://schemas.microsoft.com/office/drawing/2015/9/8/chartex" xmlns:cx2="http://schemas.microsoft.com/office/drawing/2015/10/21/chartex" xmlns:cx3="http://schemas.microsoft.com/office/drawing/2016/5/9/chartex" xmlns:cx4="http://schemas.microsoft.com/office/drawing/2016/5/10/chartex" xmlns:cx5="http://schemas.microsoft.com/office/drawing/2016/5/11/chartex" xmlns:cx6="http://schemas.microsoft.com/office/drawing/2016/5/12/chartex" xmlns:cx7="http://schemas.microsoft.com/office/drawing/2016/5/13/chartex" xmlns:cx8="http://schemas.microsoft.com/office/drawing/2016/5/14/chartex" xmlns:mc="http://schemas.openxmlformats.org/markup-compatibility/2006" xmlns:aink="http://schemas.microsoft.com/office/drawing/2016/ink" xmlns:am3d="http://schemas.microsoft.com/office/drawing/2017/model3d" xmlns:o="urn:schemas-microsoft-com:office:office" xmlns:oel="http://schemas.microsoft.com/office/2019/extlst" xmlns:r="http://schemas.openxmlformats.org/officeDocument/2006/relationships" xmlns:m="http://schemas.openxmlformats.org/officeDocument/2006/math" xmlns:v="urn:schemas-microsoft-com:vml" xmlns:wp14="http://schemas.microsoft.com/office/word/2010/wordprocessingDrawing" xmlns:wp="http://schemas.openxmlformats.org/drawingml/2006/wordprocessingDrawing" xmlns:w10="urn:schemas-microsoft-com:office:word" xmlns:w="http://schemas.openxmlformats.org/wordprocessingml/2006/main" xmlns:w14="http://schemas.microsoft.com/office/word/2010/wordml" xmlns:w15="http://schemas.microsoft.com/office/word/2012/wordml" xmlns:w16cex="http://schemas.microsoft.com/office/word/2018/wordml/cex" xmlns:w16cid="http://schemas.microsoft.com/office/word/2016/wordml/cid" xmlns:w16="http://schemas.microsoft.com/office/word/2018/wordml" xmlns:w16du="http://schemas.microsoft.com/office/word/2023/wordml/word16du" xmlns:w16sdtdh="http://schemas.microsoft.com/office/word/2020/wordml/sdtdatahash" xmlns:w16sdtfl="http://schemas.microsoft.com/office/word/2024/wordml/sdtformatlock" xmlns:w16se="http://schemas.microsoft.com/office/word/2015/wordml/symex" xmlns:wpg="http://schemas.microsoft.com/office/word/2010/wordprocessingGroup" xmlns:wpi="http://schemas.microsoft.com/office/word/2010/wordprocessingInk" xmlns:wne="http://schemas.microsoft.com/office/word/2006/wordml" xmlns:wps="http://schemas.microsoft.com/office/word/2010/wordprocessingShape" mc:Ignorable="w14 w15 w16se w16cid w16 w16cex w16sdtdh w16sdtfl w16du wp14">
+  <w:p>
+    <w:pPr>
+      <w:pStyle w:val="Header"/>
+    </w:pPr>
+  </w:p>
+</w:hdr>
+</file>
+
+<file path=word/header4.xml><?xml version="1.0" encoding="utf-8"?>
+<w:hdr xmlns:wpc="http://schemas.microsoft.com/office/word/2010/wordprocessingCanvas" xmlns:cx="http://schemas.microsoft.com/office/drawing/2014/chartex" xmlns:cx1="http://schemas.microsoft.com/office/drawing/2015/9/8/chartex" xmlns:cx2="http://schemas.microsoft.com/office/drawing/2015/10/21/chartex" xmlns:cx3="http://schemas.microsoft.com/office/drawing/2016/5/9/chartex" xmlns:cx4="http://schemas.microsoft.com/office/drawing/2016/5/10/chartex" xmlns:cx5="http://schemas.microsoft.com/office/drawing/2016/5/11/chartex" xmlns:cx6="http://schemas.microsoft.com/office/drawing/2016/5/12/chartex" xmlns:cx7="http://schemas.microsoft.com/office/drawing/2016/5/13/chartex" xmlns:cx8="http://schemas.microsoft.com/office/drawing/2016/5/14/chartex" xmlns:mc="http://schemas.openxmlformats.org/markup-compatibility/2006" xmlns:aink="http://schemas.microsoft.com/office/drawing/2016/ink" xmlns:am3d="http://schemas.microsoft.com/office/drawing/2017/model3d" xmlns:o="urn:schemas-microsoft-com:office:office" xmlns:oel="http://schemas.microsoft.com/office/2019/extlst" xmlns:r="http://schemas.openxmlformats.org/officeDocument/2006/relationships" xmlns:m="http://schemas.openxmlformats.org/officeDocument/2006/math" xmlns:v="urn:schemas-microsoft-com:vml" xmlns:wp14="http://schemas.microsoft.com/office/word/2010/wordprocessingDrawing" xmlns:wp="http://schemas.openxmlformats.org/drawingml/2006/wordprocessingDrawing" xmlns:w10="urn:schemas-microsoft-com:office:word" xmlns:w="http://schemas.openxmlformats.org/wordprocessingml/2006/main" xmlns:w14="http://schemas.microsoft.com/office/word/2010/wordml" xmlns:w15="http://schemas.microsoft.com/office/word/2012/wordml" xmlns:w16cex="http://schemas.microsoft.com/office/word/2018/wordml/cex" xmlns:w16cid="http://schemas.microsoft.com/office/word/2016/wordml/cid" xmlns:w16="http://schemas.microsoft.com/office/word/2018/wordml" xmlns:w16du="http://schemas.microsoft.com/office/word/2023/wordml/word16du" xmlns:w16sdtdh="http://schemas.microsoft.com/office/word/2020/wordml/sdtdatahash" xmlns:w16sdtfl="http://schemas.microsoft.com/office/word/2024/wordml/sdtformatlock" xmlns:w16se="http://schemas.microsoft.com/office/word/2015/wordml/symex" xmlns:wpg="http://schemas.microsoft.com/office/word/2010/wordprocessingGroup" xmlns:wpi="http://schemas.microsoft.com/office/word/2010/wordprocessingInk" xmlns:wne="http://schemas.microsoft.com/office/word/2006/wordml" xmlns:wps="http://schemas.microsoft.com/office/word/2010/wordprocessingShape" mc:Ignorable="w14 w15 w16se w16cid w16 w16cex w16sdtdh w16sdtfl w16du wp14">
+  <w:p>
+    <w:pPr>
+      <w:pStyle w:val="Header"/>
     </w:pPr>
   </w:p>
 </w:hdr>
 </file>
 
 <file path=word/numbering.xml><?xml version="1.0" encoding="utf-8"?>
-<w:numbering xmlns:wpc="http://schemas.microsoft.com/office/word/2010/wordprocessingCanvas" xmlns:cx="http://schemas.microsoft.com/office/drawing/2014/chartex" xmlns:cx1="http://schemas.microsoft.com/office/drawing/2015/9/8/chartex" xmlns:cx2="http://schemas.microsoft.com/office/drawing/2015/10/21/chartex" xmlns:cx3="http://schemas.microsoft.com/office/drawing/2016/5/9/chartex" xmlns:cx4="http://schemas.microsoft.com/office/drawing/2016/5/10/chartex" xmlns:cx5="http://schemas.microsoft.com/office/drawing/2016/5/11/chartex" xmlns:cx6="http://schemas.microsoft.com/office/drawing/2016/5/12/chartex" xmlns:cx7="http://schemas.microsoft.com/office/drawing/2016/5/13/chartex" xmlns:cx8="http://schemas.microsoft.com/office/drawing/2016/5/14/chartex" xmlns:mc="http://schemas.openxmlformats.org/markup-compatibility/2006" xmlns:m="http://schemas.openxmlformats.org/officeDocument/2006/math" xmlns:aink="http://schemas.microsoft.com/office/drawing/2016/ink" xmlns:am3d="http://schemas.microsoft.com/office/drawing/2017/model3d" xmlns:oel="http://schemas.microsoft.com/office/2019/extlst" xmlns:r="http://schemas.openxmlformats.org/officeDocument/2006/relationships" xmlns:wp14="http://schemas.microsoft.com/office/word/2010/wordprocessingDrawing" xmlns:wp="http://schemas.openxmlformats.org/drawingml/2006/wordprocessingDrawing" xmlns:wpg="http://schemas.microsoft.com/office/word/2010/wordprocessingGroup" xmlns:wpi="http://schemas.microsoft.com/office/word/2010/wordprocessingInk" xmlns:wps="http://schemas.microsoft.com/office/word/2010/wordprocessingShape" xmlns:o="urn:schemas-microsoft-com:office:office" xmlns:v="urn:schemas-microsoft-com:vml" xmlns:w10="urn:schemas-microsoft-com:office:word" xmlns:w="http://schemas.openxmlformats.org/wordprocessingml/2006/main" xmlns:w14="http://schemas.microsoft.com/office/word/2010/wordml" xmlns:w15="http://schemas.microsoft.com/office/word/2012/wordml" xmlns:w16cex="http://schemas.microsoft.com/office/word/2018/wordml/cex" xmlns:w16cid="http://schemas.microsoft.com/office/word/2016/wordml/cid" xmlns:w16="http://schemas.microsoft.com/office/word/2018/wordml" xmlns:w16sdtdh="http://schemas.microsoft.com/office/word/2020/wordml/sdtdatahash" xmlns:w16sdtfl="http://schemas.microsoft.com/office/word/2024/wordml/sdtformatlock" xmlns:w16se="http://schemas.microsoft.com/office/word/2015/wordml/symex" xmlns:w16du="http://schemas.microsoft.com/office/word/2023/wordml/word16du" xmlns:wne="http://schemas.microsoft.com/office/word/2006/wordml" mc:Ignorable="w14 w15 w16se w16cid w16 w16cex w16sdtdh w16sdtfl w16du wp14">
+<w:numbering xmlns:wpc="http://schemas.microsoft.com/office/word/2010/wordprocessingCanvas" xmlns:cx="http://schemas.microsoft.com/office/drawing/2014/chartex" xmlns:cx1="http://schemas.microsoft.com/office/drawing/2015/9/8/chartex" xmlns:cx2="http://schemas.microsoft.com/office/drawing/2015/10/21/chartex" xmlns:cx3="http://schemas.microsoft.com/office/drawing/2016/5/9/chartex" xmlns:cx4="http://schemas.microsoft.com/office/drawing/2016/5/10/chartex" xmlns:cx5="http://schemas.microsoft.com/office/drawing/2016/5/11/chartex" xmlns:cx6="http://schemas.microsoft.com/office/drawing/2016/5/12/chartex" xmlns:cx7="http://schemas.microsoft.com/office/drawing/2016/5/13/chartex" xmlns:cx8="http://schemas.microsoft.com/office/drawing/2016/5/14/chartex" xmlns:mc="http://schemas.openxmlformats.org/markup-compatibility/2006" xmlns:aink="http://schemas.microsoft.com/office/drawing/2016/ink" xmlns:am3d="http://schemas.microsoft.com/office/drawing/2017/model3d" xmlns:o="urn:schemas-microsoft-com:office:office" xmlns:oel="http://schemas.microsoft.com/office/2019/extlst" xmlns:r="http://schemas.openxmlformats.org/officeDocument/2006/relationships" xmlns:m="http://schemas.openxmlformats.org/officeDocument/2006/math" xmlns:v="urn:schemas-microsoft-com:vml" xmlns:wp14="http://schemas.microsoft.com/office/word/2010/wordprocessingDrawing" xmlns:wp="http://schemas.openxmlformats.org/drawingml/2006/wordprocessingDrawing" xmlns:w10="urn:schemas-microsoft-com:office:word" xmlns:w="http://schemas.openxmlformats.org/wordprocessingml/2006/main" xmlns:w14="http://schemas.microsoft.com/office/word/2010/wordml" xmlns:w15="http://schemas.microsoft.com/office/word/2012/wordml" xmlns:w16cex="http://schemas.microsoft.com/office/word/2018/wordml/cex" xmlns:w16cid="http://schemas.microsoft.com/office/word/2016/wordml/cid" xmlns:w16="http://schemas.microsoft.com/office/word/2018/wordml" xmlns:w16du="http://schemas.microsoft.com/office/word/2023/wordml/word16du" xmlns:w16sdtdh="http://schemas.microsoft.com/office/word/2020/wordml/sdtdatahash" xmlns:w16sdtfl="http://schemas.microsoft.com/office/word/2024/wordml/sdtformatlock" xmlns:w16se="http://schemas.microsoft.com/office/word/2015/wordml/symex" xmlns:wpg="http://schemas.microsoft.com/office/word/2010/wordprocessingGroup" xmlns:wpi="http://schemas.microsoft.com/office/word/2010/wordprocessingInk" xmlns:wne="http://schemas.microsoft.com/office/word/2006/wordml" xmlns:wps="http://schemas.microsoft.com/office/word/2010/wordprocessingShape" mc:Ignorable="w14 w15 w16se w16cid w16 w16cex w16sdtdh w16sdtfl w16du wp14">
   <w:abstractNum w:abstractNumId="0" w15:restartNumberingAfterBreak="0">
     <w:nsid w:val="0DFC3FF3"/>
     <w:multiLevelType w:val="hybridMultilevel"/>
@@ -10597,7 +10849,7 @@
     <w:lvl w:ilvl="0">
       <w:start w:val="1"/>
       <w:numFmt w:val="decimal"/>
-      <w:pStyle w:val="berschrift1"/>
+      <w:pStyle w:val="Heading1"/>
       <w:lvlText w:val="%1. "/>
       <w:lvlJc w:val="left"/>
       <w:pPr>
@@ -10613,7 +10865,7 @@
     <w:lvl w:ilvl="1">
       <w:start w:val="1"/>
       <w:numFmt w:val="decimal"/>
-      <w:pStyle w:val="berschrift2"/>
+      <w:pStyle w:val="Heading2"/>
       <w:lvlText w:val="%1.%2."/>
       <w:lvlJc w:val="left"/>
       <w:pPr>
@@ -11116,7 +11368,7 @@
 </file>
 
 <file path=word/styles.xml><?xml version="1.0" encoding="utf-8"?>
-<w:styles xmlns:mc="http://schemas.openxmlformats.org/markup-compatibility/2006" xmlns:r="http://schemas.openxmlformats.org/officeDocument/2006/relationships" xmlns:w="http://schemas.openxmlformats.org/wordprocessingml/2006/main" xmlns:w14="http://schemas.microsoft.com/office/word/2010/wordml" xmlns:w15="http://schemas.microsoft.com/office/word/2012/wordml" xmlns:w16cex="http://schemas.microsoft.com/office/word/2018/wordml/cex" xmlns:w16cid="http://schemas.microsoft.com/office/word/2016/wordml/cid" xmlns:w16="http://schemas.microsoft.com/office/word/2018/wordml" xmlns:w16sdtdh="http://schemas.microsoft.com/office/word/2020/wordml/sdtdatahash" xmlns:w16sdtfl="http://schemas.microsoft.com/office/word/2024/wordml/sdtformatlock" xmlns:w16se="http://schemas.microsoft.com/office/word/2015/wordml/symex" xmlns:w16du="http://schemas.microsoft.com/office/word/2023/wordml/word16du" mc:Ignorable="w14 w15 w16se w16cid w16 w16cex w16sdtdh w16sdtfl w16du">
+<w:styles xmlns:mc="http://schemas.openxmlformats.org/markup-compatibility/2006" xmlns:r="http://schemas.openxmlformats.org/officeDocument/2006/relationships" xmlns:w="http://schemas.openxmlformats.org/wordprocessingml/2006/main" xmlns:w14="http://schemas.microsoft.com/office/word/2010/wordml" xmlns:w15="http://schemas.microsoft.com/office/word/2012/wordml" xmlns:w16cex="http://schemas.microsoft.com/office/word/2018/wordml/cex" xmlns:w16cid="http://schemas.microsoft.com/office/word/2016/wordml/cid" xmlns:w16="http://schemas.microsoft.com/office/word/2018/wordml" xmlns:w16du="http://schemas.microsoft.com/office/word/2023/wordml/word16du" xmlns:w16sdtdh="http://schemas.microsoft.com/office/word/2020/wordml/sdtdatahash" xmlns:w16sdtfl="http://schemas.microsoft.com/office/word/2024/wordml/sdtformatlock" xmlns:w16se="http://schemas.microsoft.com/office/word/2015/wordml/symex" mc:Ignorable="w14 w15 w16se w16cid w16 w16cex w16sdtdh w16sdtfl w16du">
   <w:docDefaults>
     <w:rPrDefault>
       <w:rPr>
@@ -11510,7 +11762,7 @@
     <w:lsdException w:name="Unresolved Mention" w:semiHidden="1" w:unhideWhenUsed="1"/>
     <w:lsdException w:name="Smart Link" w:semiHidden="1" w:unhideWhenUsed="1"/>
   </w:latentStyles>
-  <w:style w:type="paragraph" w:default="1" w:styleId="Standard">
+  <w:style w:type="paragraph" w:default="1" w:styleId="Normal">
     <w:name w:val="Normal"/>
     <w:qFormat/>
     <w:rsid w:val="00172D2C"/>
@@ -11521,11 +11773,11 @@
       <w:rFonts w:ascii="Arial" w:hAnsi="Arial"/>
     </w:rPr>
   </w:style>
-  <w:style w:type="paragraph" w:styleId="berschrift1">
+  <w:style w:type="paragraph" w:styleId="Heading1">
     <w:name w:val="heading 1"/>
-    <w:basedOn w:val="Standard"/>
-    <w:next w:val="Standard"/>
-    <w:link w:val="berschrift1Zchn"/>
+    <w:basedOn w:val="Normal"/>
+    <w:next w:val="Normal"/>
+    <w:link w:val="Heading1Char"/>
     <w:autoRedefine/>
     <w:uiPriority w:val="9"/>
     <w:qFormat/>
@@ -11547,11 +11799,11 @@
       <w:szCs w:val="32"/>
     </w:rPr>
   </w:style>
-  <w:style w:type="paragraph" w:styleId="berschrift2">
+  <w:style w:type="paragraph" w:styleId="Heading2">
     <w:name w:val="heading 2"/>
-    <w:basedOn w:val="Standard"/>
-    <w:next w:val="Standard"/>
-    <w:link w:val="berschrift2Zchn"/>
+    <w:basedOn w:val="Normal"/>
+    <w:next w:val="Normal"/>
+    <w:link w:val="Heading2Char"/>
     <w:uiPriority w:val="9"/>
     <w:unhideWhenUsed/>
     <w:qFormat/>
@@ -11574,11 +11826,11 @@
       <w:szCs w:val="26"/>
     </w:rPr>
   </w:style>
-  <w:style w:type="paragraph" w:styleId="berschrift3">
+  <w:style w:type="paragraph" w:styleId="Heading3">
     <w:name w:val="heading 3"/>
-    <w:basedOn w:val="Standard"/>
-    <w:next w:val="Standard"/>
-    <w:link w:val="berschrift3Zchn"/>
+    <w:basedOn w:val="Normal"/>
+    <w:next w:val="Normal"/>
+    <w:link w:val="Heading3Char"/>
     <w:uiPriority w:val="9"/>
     <w:semiHidden/>
     <w:unhideWhenUsed/>
@@ -11597,13 +11849,13 @@
       <w:szCs w:val="24"/>
     </w:rPr>
   </w:style>
-  <w:style w:type="character" w:default="1" w:styleId="Absatz-Standardschriftart">
+  <w:style w:type="character" w:default="1" w:styleId="DefaultParagraphFont">
     <w:name w:val="Default Paragraph Font"/>
     <w:uiPriority w:val="1"/>
     <w:semiHidden/>
     <w:unhideWhenUsed/>
   </w:style>
-  <w:style w:type="table" w:default="1" w:styleId="NormaleTabelle">
+  <w:style w:type="table" w:default="1" w:styleId="TableNormal">
     <w:name w:val="Normal Table"/>
     <w:uiPriority w:val="99"/>
     <w:semiHidden/>
@@ -11618,16 +11870,16 @@
       </w:tblCellMar>
     </w:tblPr>
   </w:style>
-  <w:style w:type="numbering" w:default="1" w:styleId="KeineListe">
+  <w:style w:type="numbering" w:default="1" w:styleId="NoList">
     <w:name w:val="No List"/>
     <w:uiPriority w:val="99"/>
     <w:semiHidden/>
     <w:unhideWhenUsed/>
   </w:style>
-  <w:style w:type="paragraph" w:styleId="Kopfzeile">
+  <w:style w:type="paragraph" w:styleId="Header">
     <w:name w:val="header"/>
-    <w:basedOn w:val="Standard"/>
-    <w:link w:val="KopfzeileZchn"/>
+    <w:basedOn w:val="Normal"/>
+    <w:link w:val="HeaderChar"/>
     <w:uiPriority w:val="99"/>
     <w:unhideWhenUsed/>
     <w:rsid w:val="00905571"/>
@@ -11639,17 +11891,17 @@
       <w:spacing w:line="240" w:lineRule="auto"/>
     </w:pPr>
   </w:style>
-  <w:style w:type="character" w:customStyle="1" w:styleId="KopfzeileZchn">
-    <w:name w:val="Kopfzeile Zchn"/>
-    <w:basedOn w:val="Absatz-Standardschriftart"/>
-    <w:link w:val="Kopfzeile"/>
+  <w:style w:type="character" w:customStyle="1" w:styleId="HeaderChar">
+    <w:name w:val="Header Char"/>
+    <w:basedOn w:val="DefaultParagraphFont"/>
+    <w:link w:val="Header"/>
     <w:uiPriority w:val="99"/>
     <w:rsid w:val="00905571"/>
   </w:style>
-  <w:style w:type="paragraph" w:styleId="Fuzeile">
+  <w:style w:type="paragraph" w:styleId="Footer">
     <w:name w:val="footer"/>
-    <w:basedOn w:val="Standard"/>
-    <w:link w:val="FuzeileZchn"/>
+    <w:basedOn w:val="Normal"/>
+    <w:link w:val="FooterChar"/>
     <w:uiPriority w:val="99"/>
     <w:unhideWhenUsed/>
     <w:rsid w:val="00905571"/>
@@ -11661,16 +11913,16 @@
       <w:spacing w:line="240" w:lineRule="auto"/>
     </w:pPr>
   </w:style>
-  <w:style w:type="character" w:customStyle="1" w:styleId="FuzeileZchn">
-    <w:name w:val="Fußzeile Zchn"/>
-    <w:basedOn w:val="Absatz-Standardschriftart"/>
-    <w:link w:val="Fuzeile"/>
+  <w:style w:type="character" w:customStyle="1" w:styleId="FooterChar">
+    <w:name w:val="Footer Char"/>
+    <w:basedOn w:val="DefaultParagraphFont"/>
+    <w:link w:val="Footer"/>
     <w:uiPriority w:val="99"/>
     <w:rsid w:val="00905571"/>
   </w:style>
-  <w:style w:type="paragraph" w:styleId="Listenabsatz">
+  <w:style w:type="paragraph" w:styleId="ListParagraph">
     <w:name w:val="List Paragraph"/>
-    <w:basedOn w:val="Standard"/>
+    <w:basedOn w:val="Normal"/>
     <w:uiPriority w:val="34"/>
     <w:qFormat/>
     <w:rsid w:val="00AF26D9"/>
@@ -11679,9 +11931,9 @@
       <w:contextualSpacing/>
     </w:pPr>
   </w:style>
-  <w:style w:type="paragraph" w:styleId="KeinLeerraum">
+  <w:style w:type="paragraph" w:styleId="NoSpacing">
     <w:name w:val="No Spacing"/>
-    <w:link w:val="KeinLeerraumZchn"/>
+    <w:link w:val="NoSpacingChar"/>
     <w:uiPriority w:val="1"/>
     <w:qFormat/>
     <w:rsid w:val="007200F4"/>
@@ -11693,10 +11945,10 @@
       <w:lang w:eastAsia="de-CH"/>
     </w:rPr>
   </w:style>
-  <w:style w:type="character" w:customStyle="1" w:styleId="KeinLeerraumZchn">
-    <w:name w:val="Kein Leerraum Zchn"/>
-    <w:basedOn w:val="Absatz-Standardschriftart"/>
-    <w:link w:val="KeinLeerraum"/>
+  <w:style w:type="character" w:customStyle="1" w:styleId="NoSpacingChar">
+    <w:name w:val="No Spacing Char"/>
+    <w:basedOn w:val="DefaultParagraphFont"/>
+    <w:link w:val="NoSpacing"/>
     <w:uiPriority w:val="1"/>
     <w:rsid w:val="007200F4"/>
     <w:rPr>
@@ -11704,10 +11956,10 @@
       <w:lang w:eastAsia="de-CH"/>
     </w:rPr>
   </w:style>
-  <w:style w:type="character" w:customStyle="1" w:styleId="berschrift1Zchn">
-    <w:name w:val="Überschrift 1 Zchn"/>
-    <w:basedOn w:val="Absatz-Standardschriftart"/>
-    <w:link w:val="berschrift1"/>
+  <w:style w:type="character" w:customStyle="1" w:styleId="Heading1Char">
+    <w:name w:val="Heading 1 Char"/>
+    <w:basedOn w:val="DefaultParagraphFont"/>
+    <w:link w:val="Heading1"/>
     <w:uiPriority w:val="9"/>
     <w:rsid w:val="00FE4ED9"/>
     <w:rPr>
@@ -11718,10 +11970,10 @@
       <w:szCs w:val="32"/>
     </w:rPr>
   </w:style>
-  <w:style w:type="character" w:customStyle="1" w:styleId="berschrift2Zchn">
-    <w:name w:val="Überschrift 2 Zchn"/>
-    <w:basedOn w:val="Absatz-Standardschriftart"/>
-    <w:link w:val="berschrift2"/>
+  <w:style w:type="character" w:customStyle="1" w:styleId="Heading2Char">
+    <w:name w:val="Heading 2 Char"/>
+    <w:basedOn w:val="DefaultParagraphFont"/>
+    <w:link w:val="Heading2"/>
     <w:uiPriority w:val="9"/>
     <w:rsid w:val="003950AD"/>
     <w:rPr>
@@ -11732,9 +11984,9 @@
       <w:szCs w:val="26"/>
     </w:rPr>
   </w:style>
-  <w:style w:type="character" w:styleId="Kommentarzeichen">
+  <w:style w:type="character" w:styleId="CommentReference">
     <w:name w:val="annotation reference"/>
-    <w:basedOn w:val="Absatz-Standardschriftart"/>
+    <w:basedOn w:val="DefaultParagraphFont"/>
     <w:uiPriority w:val="99"/>
     <w:semiHidden/>
     <w:unhideWhenUsed/>
@@ -11744,10 +11996,10 @@
       <w:szCs w:val="16"/>
     </w:rPr>
   </w:style>
-  <w:style w:type="paragraph" w:styleId="Kommentartext">
+  <w:style w:type="paragraph" w:styleId="CommentText">
     <w:name w:val="annotation text"/>
-    <w:basedOn w:val="Standard"/>
-    <w:link w:val="KommentartextZchn"/>
+    <w:basedOn w:val="Normal"/>
+    <w:link w:val="CommentTextChar"/>
     <w:uiPriority w:val="99"/>
     <w:unhideWhenUsed/>
     <w:rsid w:val="00B3451D"/>
@@ -11759,10 +12011,10 @@
       <w:szCs w:val="20"/>
     </w:rPr>
   </w:style>
-  <w:style w:type="character" w:customStyle="1" w:styleId="KommentartextZchn">
-    <w:name w:val="Kommentartext Zchn"/>
-    <w:basedOn w:val="Absatz-Standardschriftart"/>
-    <w:link w:val="Kommentartext"/>
+  <w:style w:type="character" w:customStyle="1" w:styleId="CommentTextChar">
+    <w:name w:val="Comment Text Char"/>
+    <w:basedOn w:val="DefaultParagraphFont"/>
+    <w:link w:val="CommentText"/>
     <w:uiPriority w:val="99"/>
     <w:rsid w:val="00B3451D"/>
     <w:rPr>
@@ -11770,11 +12022,11 @@
       <w:szCs w:val="20"/>
     </w:rPr>
   </w:style>
-  <w:style w:type="paragraph" w:styleId="Kommentarthema">
+  <w:style w:type="paragraph" w:styleId="CommentSubject">
     <w:name w:val="annotation subject"/>
-    <w:basedOn w:val="Kommentartext"/>
-    <w:next w:val="Kommentartext"/>
-    <w:link w:val="KommentarthemaZchn"/>
+    <w:basedOn w:val="CommentText"/>
+    <w:next w:val="CommentText"/>
+    <w:link w:val="CommentSubjectChar"/>
     <w:uiPriority w:val="99"/>
     <w:semiHidden/>
     <w:unhideWhenUsed/>
@@ -11784,10 +12036,10 @@
       <w:bCs/>
     </w:rPr>
   </w:style>
-  <w:style w:type="character" w:customStyle="1" w:styleId="KommentarthemaZchn">
-    <w:name w:val="Kommentarthema Zchn"/>
-    <w:basedOn w:val="KommentartextZchn"/>
-    <w:link w:val="Kommentarthema"/>
+  <w:style w:type="character" w:customStyle="1" w:styleId="CommentSubjectChar">
+    <w:name w:val="Comment Subject Char"/>
+    <w:basedOn w:val="CommentTextChar"/>
+    <w:link w:val="CommentSubject"/>
     <w:uiPriority w:val="99"/>
     <w:semiHidden/>
     <w:rsid w:val="00B3451D"/>
@@ -11798,9 +12050,9 @@
       <w:szCs w:val="20"/>
     </w:rPr>
   </w:style>
-  <w:style w:type="character" w:styleId="Platzhaltertext">
+  <w:style w:type="character" w:styleId="PlaceholderText">
     <w:name w:val="Placeholder Text"/>
-    <w:basedOn w:val="Absatz-Standardschriftart"/>
+    <w:basedOn w:val="DefaultParagraphFont"/>
     <w:uiPriority w:val="99"/>
     <w:semiHidden/>
     <w:rsid w:val="0062650B"/>
@@ -11808,10 +12060,10 @@
       <w:color w:val="808080"/>
     </w:rPr>
   </w:style>
-  <w:style w:type="paragraph" w:styleId="Inhaltsverzeichnisberschrift">
+  <w:style w:type="paragraph" w:styleId="TOCHeading">
     <w:name w:val="TOC Heading"/>
-    <w:basedOn w:val="berschrift1"/>
-    <w:next w:val="Standard"/>
+    <w:basedOn w:val="Heading1"/>
+    <w:next w:val="Normal"/>
     <w:uiPriority w:val="39"/>
     <w:unhideWhenUsed/>
     <w:qFormat/>
@@ -11830,10 +12082,10 @@
       <w:lang w:eastAsia="de-CH"/>
     </w:rPr>
   </w:style>
-  <w:style w:type="paragraph" w:styleId="Verzeichnis1">
+  <w:style w:type="paragraph" w:styleId="TOC1">
     <w:name w:val="toc 1"/>
-    <w:basedOn w:val="Standard"/>
-    <w:next w:val="Standard"/>
+    <w:basedOn w:val="Normal"/>
+    <w:next w:val="Normal"/>
     <w:autoRedefine/>
     <w:uiPriority w:val="39"/>
     <w:unhideWhenUsed/>
@@ -11842,10 +12094,10 @@
       <w:spacing w:after="100"/>
     </w:pPr>
   </w:style>
-  <w:style w:type="paragraph" w:styleId="Verzeichnis2">
+  <w:style w:type="paragraph" w:styleId="TOC2">
     <w:name w:val="toc 2"/>
-    <w:basedOn w:val="Standard"/>
-    <w:next w:val="Standard"/>
+    <w:basedOn w:val="Normal"/>
+    <w:next w:val="Normal"/>
     <w:autoRedefine/>
     <w:uiPriority w:val="39"/>
     <w:unhideWhenUsed/>
@@ -11857,7 +12109,7 @@
   </w:style>
   <w:style w:type="character" w:styleId="Hyperlink">
     <w:name w:val="Hyperlink"/>
-    <w:basedOn w:val="Absatz-Standardschriftart"/>
+    <w:basedOn w:val="DefaultParagraphFont"/>
     <w:uiPriority w:val="99"/>
     <w:unhideWhenUsed/>
     <w:rsid w:val="00B4749E"/>
@@ -11866,10 +12118,10 @@
       <w:u w:val="single"/>
     </w:rPr>
   </w:style>
-  <w:style w:type="paragraph" w:styleId="Beschriftung">
+  <w:style w:type="paragraph" w:styleId="Caption">
     <w:name w:val="caption"/>
-    <w:basedOn w:val="Standard"/>
-    <w:next w:val="Standard"/>
+    <w:basedOn w:val="Normal"/>
+    <w:next w:val="Normal"/>
     <w:uiPriority w:val="35"/>
     <w:unhideWhenUsed/>
     <w:qFormat/>
@@ -11885,9 +12137,9 @@
       <w:szCs w:val="18"/>
     </w:rPr>
   </w:style>
-  <w:style w:type="character" w:styleId="NichtaufgelsteErwhnung">
+  <w:style w:type="character" w:styleId="UnresolvedMention">
     <w:name w:val="Unresolved Mention"/>
-    <w:basedOn w:val="Absatz-Standardschriftart"/>
+    <w:basedOn w:val="DefaultParagraphFont"/>
     <w:uiPriority w:val="99"/>
     <w:semiHidden/>
     <w:unhideWhenUsed/>
@@ -11897,11 +12149,10 @@
       <w:shd w:val="clear" w:color="auto" w:fill="E1DFDD"/>
     </w:rPr>
   </w:style>
-  <w:style w:type="paragraph" w:styleId="StandardWeb">
+  <w:style w:type="paragraph" w:styleId="NormalWeb">
     <w:name w:val="Normal (Web)"/>
-    <w:basedOn w:val="Standard"/>
+    <w:basedOn w:val="Normal"/>
     <w:uiPriority w:val="99"/>
-    <w:semiHidden/>
     <w:unhideWhenUsed/>
     <w:rsid w:val="00DB6C4C"/>
     <w:pPr>
@@ -11914,9 +12165,9 @@
       <w:lang w:eastAsia="de-CH"/>
     </w:rPr>
   </w:style>
-  <w:style w:type="character" w:styleId="Fett">
+  <w:style w:type="character" w:styleId="Strong">
     <w:name w:val="Strong"/>
-    <w:basedOn w:val="Absatz-Standardschriftart"/>
+    <w:basedOn w:val="DefaultParagraphFont"/>
     <w:uiPriority w:val="22"/>
     <w:qFormat/>
     <w:rsid w:val="00DB6C4C"/>
@@ -11925,10 +12176,10 @@
       <w:bCs/>
     </w:rPr>
   </w:style>
-  <w:style w:type="character" w:customStyle="1" w:styleId="berschrift3Zchn">
-    <w:name w:val="Überschrift 3 Zchn"/>
-    <w:basedOn w:val="Absatz-Standardschriftart"/>
-    <w:link w:val="berschrift3"/>
+  <w:style w:type="character" w:customStyle="1" w:styleId="Heading3Char">
+    <w:name w:val="Heading 3 Char"/>
+    <w:basedOn w:val="DefaultParagraphFont"/>
+    <w:link w:val="Heading3"/>
     <w:uiPriority w:val="9"/>
     <w:semiHidden/>
     <w:rsid w:val="00B94617"/>
@@ -11939,17 +12190,17 @@
       <w:szCs w:val="24"/>
     </w:rPr>
   </w:style>
-  <w:style w:type="paragraph" w:styleId="Abbildungsverzeichnis">
+  <w:style w:type="paragraph" w:styleId="TableofFigures">
     <w:name w:val="table of figures"/>
-    <w:basedOn w:val="Standard"/>
-    <w:next w:val="Standard"/>
+    <w:basedOn w:val="Normal"/>
+    <w:next w:val="Normal"/>
     <w:uiPriority w:val="99"/>
     <w:unhideWhenUsed/>
     <w:rsid w:val="00527460"/>
   </w:style>
-  <w:style w:type="character" w:styleId="BesuchterLink">
+  <w:style w:type="character" w:styleId="FollowedHyperlink">
     <w:name w:val="FollowedHyperlink"/>
-    <w:basedOn w:val="Absatz-Standardschriftart"/>
+    <w:basedOn w:val="DefaultParagraphFont"/>
     <w:uiPriority w:val="99"/>
     <w:semiHidden/>
     <w:unhideWhenUsed/>
@@ -11959,9 +12210,9 @@
       <w:u w:val="single"/>
     </w:rPr>
   </w:style>
-  <w:style w:type="table" w:styleId="Tabellenraster">
+  <w:style w:type="table" w:styleId="TableGrid">
     <w:name w:val="Table Grid"/>
-    <w:basedOn w:val="NormaleTabelle"/>
+    <w:basedOn w:val="TableNormal"/>
     <w:uiPriority w:val="59"/>
     <w:rsid w:val="00EA052D"/>
     <w:pPr>
@@ -11978,9 +12229,9 @@
       </w:tblBorders>
     </w:tblPr>
   </w:style>
-  <w:style w:type="table" w:styleId="Gitternetztabelle4Akzent6">
+  <w:style w:type="table" w:styleId="GridTable4-Accent6">
     <w:name w:val="Grid Table 4 Accent 6"/>
-    <w:basedOn w:val="NormaleTabelle"/>
+    <w:basedOn w:val="TableNormal"/>
     <w:uiPriority w:val="49"/>
     <w:rsid w:val="00EA052D"/>
     <w:pPr>
@@ -12056,7 +12307,7 @@
   </w:style>
   <w:style w:type="paragraph" w:customStyle="1" w:styleId="isselectedend">
     <w:name w:val="isselectedend"/>
-    <w:basedOn w:val="Standard"/>
+    <w:basedOn w:val="Normal"/>
     <w:rsid w:val="00FE4ED9"/>
     <w:pPr>
       <w:spacing w:before="100" w:beforeAutospacing="1" w:after="100" w:afterAutospacing="1" w:line="240" w:lineRule="auto"/>
@@ -12068,9 +12319,9 @@
       <w:lang w:eastAsia="ja-JP"/>
     </w:rPr>
   </w:style>
-  <w:style w:type="table" w:styleId="EinfacheTabelle5">
+  <w:style w:type="table" w:styleId="PlainTable5">
     <w:name w:val="Plain Table 5"/>
-    <w:basedOn w:val="NormaleTabelle"/>
+    <w:basedOn w:val="TableNormal"/>
     <w:uiPriority w:val="45"/>
     <w:rsid w:val="002533FB"/>
     <w:pPr>
@@ -12188,9 +12439,9 @@
       </w:tcPr>
     </w:tblStylePr>
   </w:style>
-  <w:style w:type="table" w:styleId="Gitternetztabelle2Akzent3">
+  <w:style w:type="table" w:styleId="GridTable2-Accent3">
     <w:name w:val="Grid Table 2 Accent 3"/>
-    <w:basedOn w:val="NormaleTabelle"/>
+    <w:basedOn w:val="TableNormal"/>
     <w:uiPriority w:val="47"/>
     <w:rsid w:val="002533FB"/>
     <w:pPr>
@@ -12263,9 +12514,9 @@
       </w:tcPr>
     </w:tblStylePr>
   </w:style>
-  <w:style w:type="table" w:styleId="Gitternetztabelle2">
+  <w:style w:type="table" w:styleId="GridTable2">
     <w:name w:val="Grid Table 2"/>
-    <w:basedOn w:val="NormaleTabelle"/>
+    <w:basedOn w:val="TableNormal"/>
     <w:uiPriority w:val="47"/>
     <w:rsid w:val="002533FB"/>
     <w:pPr>
@@ -12338,11 +12589,24 @@
       </w:tcPr>
     </w:tblStylePr>
   </w:style>
+  <w:style w:type="character" w:styleId="HTMLCode">
+    <w:name w:val="HTML Code"/>
+    <w:basedOn w:val="DefaultParagraphFont"/>
+    <w:uiPriority w:val="99"/>
+    <w:semiHidden/>
+    <w:unhideWhenUsed/>
+    <w:rsid w:val="00753397"/>
+    <w:rPr>
+      <w:rFonts w:ascii="Courier New" w:eastAsia="Times New Roman" w:hAnsi="Courier New" w:cs="Courier New"/>
+      <w:sz w:val="20"/>
+      <w:szCs w:val="20"/>
+    </w:rPr>
+  </w:style>
 </w:styles>
 </file>
 
 <file path=word/glossary/document.xml><?xml version="1.0" encoding="utf-8"?>
-<w:glossaryDocument xmlns:wpc="http://schemas.microsoft.com/office/word/2010/wordprocessingCanvas" xmlns:cx="http://schemas.microsoft.com/office/drawing/2014/chartex" xmlns:cx1="http://schemas.microsoft.com/office/drawing/2015/9/8/chartex" xmlns:cx2="http://schemas.microsoft.com/office/drawing/2015/10/21/chartex" xmlns:cx3="http://schemas.microsoft.com/office/drawing/2016/5/9/chartex" xmlns:cx4="http://schemas.microsoft.com/office/drawing/2016/5/10/chartex" xmlns:cx5="http://schemas.microsoft.com/office/drawing/2016/5/11/chartex" xmlns:cx6="http://schemas.microsoft.com/office/drawing/2016/5/12/chartex" xmlns:cx7="http://schemas.microsoft.com/office/drawing/2016/5/13/chartex" xmlns:cx8="http://schemas.microsoft.com/office/drawing/2016/5/14/chartex" xmlns:mc="http://schemas.openxmlformats.org/markup-compatibility/2006" xmlns:m="http://schemas.openxmlformats.org/officeDocument/2006/math" xmlns:aink="http://schemas.microsoft.com/office/drawing/2016/ink" xmlns:am3d="http://schemas.microsoft.com/office/drawing/2017/model3d" xmlns:oel="http://schemas.microsoft.com/office/2019/extlst" xmlns:r="http://schemas.openxmlformats.org/officeDocument/2006/relationships" xmlns:wp14="http://schemas.microsoft.com/office/word/2010/wordprocessingDrawing" xmlns:wp="http://schemas.openxmlformats.org/drawingml/2006/wordprocessingDrawing" xmlns:wpg="http://schemas.microsoft.com/office/word/2010/wordprocessingGroup" xmlns:wpi="http://schemas.microsoft.com/office/word/2010/wordprocessingInk" xmlns:wps="http://schemas.microsoft.com/office/word/2010/wordprocessingShape" xmlns:o="urn:schemas-microsoft-com:office:office" xmlns:v="urn:schemas-microsoft-com:vml" xmlns:w10="urn:schemas-microsoft-com:office:word" xmlns:w="http://schemas.openxmlformats.org/wordprocessingml/2006/main" xmlns:w14="http://schemas.microsoft.com/office/word/2010/wordml" xmlns:w15="http://schemas.microsoft.com/office/word/2012/wordml" xmlns:w16cex="http://schemas.microsoft.com/office/word/2018/wordml/cex" xmlns:w16cid="http://schemas.microsoft.com/office/word/2016/wordml/cid" xmlns:w16="http://schemas.microsoft.com/office/word/2018/wordml" xmlns:w16sdtdh="http://schemas.microsoft.com/office/word/2020/wordml/sdtdatahash" xmlns:w16sdtfl="http://schemas.microsoft.com/office/word/2024/wordml/sdtformatlock" xmlns:w16se="http://schemas.microsoft.com/office/word/2015/wordml/symex" xmlns:w16du="http://schemas.microsoft.com/office/word/2023/wordml/word16du" xmlns:wne="http://schemas.microsoft.com/office/word/2006/wordml" mc:Ignorable="w14 w15 w16se w16cid w16 w16cex w16sdtdh w16sdtfl w16du wp14">
+<w:glossaryDocument xmlns:wpc="http://schemas.microsoft.com/office/word/2010/wordprocessingCanvas" xmlns:cx="http://schemas.microsoft.com/office/drawing/2014/chartex" xmlns:cx1="http://schemas.microsoft.com/office/drawing/2015/9/8/chartex" xmlns:cx2="http://schemas.microsoft.com/office/drawing/2015/10/21/chartex" xmlns:cx3="http://schemas.microsoft.com/office/drawing/2016/5/9/chartex" xmlns:cx4="http://schemas.microsoft.com/office/drawing/2016/5/10/chartex" xmlns:cx5="http://schemas.microsoft.com/office/drawing/2016/5/11/chartex" xmlns:cx6="http://schemas.microsoft.com/office/drawing/2016/5/12/chartex" xmlns:cx7="http://schemas.microsoft.com/office/drawing/2016/5/13/chartex" xmlns:cx8="http://schemas.microsoft.com/office/drawing/2016/5/14/chartex" xmlns:mc="http://schemas.openxmlformats.org/markup-compatibility/2006" xmlns:aink="http://schemas.microsoft.com/office/drawing/2016/ink" xmlns:am3d="http://schemas.microsoft.com/office/drawing/2017/model3d" xmlns:o="urn:schemas-microsoft-com:office:office" xmlns:oel="http://schemas.microsoft.com/office/2019/extlst" xmlns:r="http://schemas.openxmlformats.org/officeDocument/2006/relationships" xmlns:m="http://schemas.openxmlformats.org/officeDocument/2006/math" xmlns:v="urn:schemas-microsoft-com:vml" xmlns:wp14="http://schemas.microsoft.com/office/word/2010/wordprocessingDrawing" xmlns:wp="http://schemas.openxmlformats.org/drawingml/2006/wordprocessingDrawing" xmlns:w10="urn:schemas-microsoft-com:office:word" xmlns:w="http://schemas.openxmlformats.org/wordprocessingml/2006/main" xmlns:w14="http://schemas.microsoft.com/office/word/2010/wordml" xmlns:w15="http://schemas.microsoft.com/office/word/2012/wordml" xmlns:w16cex="http://schemas.microsoft.com/office/word/2018/wordml/cex" xmlns:w16cid="http://schemas.microsoft.com/office/word/2016/wordml/cid" xmlns:w16="http://schemas.microsoft.com/office/word/2018/wordml" xmlns:w16du="http://schemas.microsoft.com/office/word/2023/wordml/word16du" xmlns:w16sdtdh="http://schemas.microsoft.com/office/word/2020/wordml/sdtdatahash" xmlns:w16sdtfl="http://schemas.microsoft.com/office/word/2024/wordml/sdtformatlock" xmlns:w16se="http://schemas.microsoft.com/office/word/2015/wordml/symex" xmlns:wpg="http://schemas.microsoft.com/office/word/2010/wordprocessingGroup" xmlns:wpi="http://schemas.microsoft.com/office/word/2010/wordprocessingInk" xmlns:wne="http://schemas.microsoft.com/office/word/2006/wordml" xmlns:wps="http://schemas.microsoft.com/office/word/2010/wordprocessingShape" mc:Ignorable="w14 w15 w16se w16cid w16 w16cex w16sdtdh w16sdtfl w16du wp14">
   <w:docParts>
     <w:docPart>
       <w:docPartPr>
@@ -12363,7 +12627,7 @@
         <w:p>
           <w:r>
             <w:rPr>
-              <w:rStyle w:val="Platzhaltertext"/>
+              <w:rStyle w:val="PlaceholderText"/>
             </w:rPr>
             <w:t>Klicken oder tippen Sie hier, um Text einzugeben.</w:t>
           </w:r>
@@ -12375,7 +12639,7 @@
 </file>
 
 <file path=word/glossary/fontTable.xml><?xml version="1.0" encoding="utf-8"?>
-<w:fonts xmlns:mc="http://schemas.openxmlformats.org/markup-compatibility/2006" xmlns:r="http://schemas.openxmlformats.org/officeDocument/2006/relationships" xmlns:w="http://schemas.openxmlformats.org/wordprocessingml/2006/main" xmlns:w14="http://schemas.microsoft.com/office/word/2010/wordml" xmlns:w15="http://schemas.microsoft.com/office/word/2012/wordml" xmlns:w16cex="http://schemas.microsoft.com/office/word/2018/wordml/cex" xmlns:w16cid="http://schemas.microsoft.com/office/word/2016/wordml/cid" xmlns:w16="http://schemas.microsoft.com/office/word/2018/wordml" xmlns:w16sdtdh="http://schemas.microsoft.com/office/word/2020/wordml/sdtdatahash" xmlns:w16sdtfl="http://schemas.microsoft.com/office/word/2024/wordml/sdtformatlock" xmlns:w16se="http://schemas.microsoft.com/office/word/2015/wordml/symex" xmlns:w16du="http://schemas.microsoft.com/office/word/2023/wordml/word16du" mc:Ignorable="w14 w15 w16se w16cid w16 w16cex w16sdtdh w16sdtfl w16du">
+<w:fonts xmlns:mc="http://schemas.openxmlformats.org/markup-compatibility/2006" xmlns:r="http://schemas.openxmlformats.org/officeDocument/2006/relationships" xmlns:w="http://schemas.openxmlformats.org/wordprocessingml/2006/main" xmlns:w14="http://schemas.microsoft.com/office/word/2010/wordml" xmlns:w15="http://schemas.microsoft.com/office/word/2012/wordml" xmlns:w16cex="http://schemas.microsoft.com/office/word/2018/wordml/cex" xmlns:w16cid="http://schemas.microsoft.com/office/word/2016/wordml/cid" xmlns:w16="http://schemas.microsoft.com/office/word/2018/wordml" xmlns:w16du="http://schemas.microsoft.com/office/word/2023/wordml/word16du" xmlns:w16sdtdh="http://schemas.microsoft.com/office/word/2020/wordml/sdtdatahash" xmlns:w16sdtfl="http://schemas.microsoft.com/office/word/2024/wordml/sdtformatlock" xmlns:w16se="http://schemas.microsoft.com/office/word/2015/wordml/symex" mc:Ignorable="w14 w15 w16se w16cid w16 w16cex w16sdtdh w16sdtfl w16du">
   <w:font w:name="Times New Roman">
     <w:panose1 w:val="02020603050405020304"/>
     <w:charset w:val="00"/>
@@ -12388,7 +12652,7 @@
     <w:charset w:val="00"/>
     <w:family w:val="swiss"/>
     <w:pitch w:val="variable"/>
-    <w:sig w:usb0="E0002AFF" w:usb1="C0007843" w:usb2="00000009" w:usb3="00000000" w:csb0="000001FF" w:csb1="00000000"/>
+    <w:sig w:usb0="E0002EFF" w:usb1="C000785B" w:usb2="00000009" w:usb3="00000000" w:csb0="000001FF" w:csb1="00000000"/>
   </w:font>
   <w:font w:name="Calibri">
     <w:panose1 w:val="020F0502020204030204"/>
@@ -12406,15 +12670,15 @@
   </w:font>
   <w:font w:name="Wingdings">
     <w:panose1 w:val="05000000000000000000"/>
-    <w:charset w:val="4D"/>
-    <w:family w:val="decorative"/>
+    <w:charset w:val="02"/>
+    <w:family w:val="auto"/>
     <w:pitch w:val="variable"/>
-    <w:sig w:usb0="00000003" w:usb1="00000000" w:usb2="00000000" w:usb3="00000000" w:csb0="80000001" w:csb1="00000000"/>
+    <w:sig w:usb0="00000000" w:usb1="10000000" w:usb2="00000000" w:usb3="00000000" w:csb0="80000000" w:csb1="00000000"/>
   </w:font>
   <w:font w:name="Symbol">
     <w:panose1 w:val="05050102010706020507"/>
     <w:charset w:val="02"/>
-    <w:family w:val="decorative"/>
+    <w:family w:val="roman"/>
     <w:pitch w:val="variable"/>
     <w:sig w:usb0="00000000" w:usb1="10000000" w:usb2="00000000" w:usb3="00000000" w:csb0="80000000" w:csb1="00000000"/>
   </w:font>
@@ -12434,22 +12698,18 @@
     <w:sig w:usb0="E4002EFF" w:usb1="C200247B" w:usb2="00000009" w:usb3="00000000" w:csb0="000001FF" w:csb1="00000000"/>
   </w:font>
   <w:font w:name="Yu Mincho">
-    <w:altName w:val="游明朝"/>
-    <w:panose1 w:val="02020400000000000000"/>
     <w:charset w:val="80"/>
     <w:family w:val="roman"/>
-    <w:notTrueType/>
-    <w:pitch w:val="default"/>
+    <w:pitch w:val="variable"/>
+    <w:sig w:usb0="800002E7" w:usb1="2AC7FCFF" w:usb2="00000012" w:usb3="00000000" w:csb0="0002009F" w:csb1="00000000"/>
   </w:font>
   <w:font w:name="Aptos">
-    <w:panose1 w:val="020B0004020202020204"/>
     <w:charset w:val="00"/>
     <w:family w:val="swiss"/>
     <w:pitch w:val="variable"/>
     <w:sig w:usb0="20000287" w:usb1="00000003" w:usb2="00000000" w:usb3="00000000" w:csb0="0000019F" w:csb1="00000000"/>
   </w:font>
   <w:font w:name="Aptos Display">
-    <w:panose1 w:val="020B0004020202020204"/>
     <w:charset w:val="00"/>
     <w:family w:val="swiss"/>
     <w:pitch w:val="variable"/>
@@ -12459,7 +12719,7 @@
 </file>
 
 <file path=word/glossary/settings.xml><?xml version="1.0" encoding="utf-8"?>
-<w:settings xmlns:mc="http://schemas.openxmlformats.org/markup-compatibility/2006" xmlns:m="http://schemas.openxmlformats.org/officeDocument/2006/math" xmlns:r="http://schemas.openxmlformats.org/officeDocument/2006/relationships" xmlns:sl="http://schemas.openxmlformats.org/schemaLibrary/2006/main" xmlns:o="urn:schemas-microsoft-com:office:office" xmlns:v="urn:schemas-microsoft-com:vml" xmlns:w10="urn:schemas-microsoft-com:office:word" xmlns:w="http://schemas.openxmlformats.org/wordprocessingml/2006/main" xmlns:w14="http://schemas.microsoft.com/office/word/2010/wordml" xmlns:w15="http://schemas.microsoft.com/office/word/2012/wordml" xmlns:w16cex="http://schemas.microsoft.com/office/word/2018/wordml/cex" xmlns:w16cid="http://schemas.microsoft.com/office/word/2016/wordml/cid" xmlns:w16="http://schemas.microsoft.com/office/word/2018/wordml" xmlns:w16sdtdh="http://schemas.microsoft.com/office/word/2020/wordml/sdtdatahash" xmlns:w16sdtfl="http://schemas.microsoft.com/office/word/2024/wordml/sdtformatlock" xmlns:w16se="http://schemas.microsoft.com/office/word/2015/wordml/symex" xmlns:w16du="http://schemas.microsoft.com/office/word/2023/wordml/word16du" mc:Ignorable="w14 w15 w16se w16cid w16 w16cex w16sdtdh w16sdtfl w16du">
+<w:settings xmlns:mc="http://schemas.openxmlformats.org/markup-compatibility/2006" xmlns:o="urn:schemas-microsoft-com:office:office" xmlns:r="http://schemas.openxmlformats.org/officeDocument/2006/relationships" xmlns:m="http://schemas.openxmlformats.org/officeDocument/2006/math" xmlns:v="urn:schemas-microsoft-com:vml" xmlns:w10="urn:schemas-microsoft-com:office:word" xmlns:w="http://schemas.openxmlformats.org/wordprocessingml/2006/main" xmlns:w14="http://schemas.microsoft.com/office/word/2010/wordml" xmlns:w15="http://schemas.microsoft.com/office/word/2012/wordml" xmlns:w16cex="http://schemas.microsoft.com/office/word/2018/wordml/cex" xmlns:w16cid="http://schemas.microsoft.com/office/word/2016/wordml/cid" xmlns:w16="http://schemas.microsoft.com/office/word/2018/wordml" xmlns:w16du="http://schemas.microsoft.com/office/word/2023/wordml/word16du" xmlns:w16sdtdh="http://schemas.microsoft.com/office/word/2020/wordml/sdtdatahash" xmlns:w16sdtfl="http://schemas.microsoft.com/office/word/2024/wordml/sdtformatlock" xmlns:w16se="http://schemas.microsoft.com/office/word/2015/wordml/symex" xmlns:sl="http://schemas.openxmlformats.org/schemaLibrary/2006/main" mc:Ignorable="w14 w15 w16se w16cid w16 w16cex w16sdtdh w16sdtfl w16du">
   <w:view w:val="normal"/>
   <w:defaultTabStop w:val="708"/>
   <w:hyphenationZone w:val="425"/>
@@ -12513,6 +12773,7 @@
     <w:rsid w:val="005440A0"/>
     <w:rsid w:val="005648AA"/>
     <w:rsid w:val="005843A7"/>
+    <w:rsid w:val="005B2260"/>
     <w:rsid w:val="005C5115"/>
     <w:rsid w:val="00624014"/>
     <w:rsid w:val="00685803"/>
@@ -12542,6 +12803,7 @@
     <w:rsid w:val="00D04E6E"/>
     <w:rsid w:val="00D92868"/>
     <w:rsid w:val="00DB2476"/>
+    <w:rsid w:val="00DC4085"/>
     <w:rsid w:val="00DC6FD5"/>
     <w:rsid w:val="00DD05D6"/>
     <w:rsid w:val="00E049DB"/>
@@ -12574,7 +12836,7 @@
 </file>
 
 <file path=word/glossary/styles.xml><?xml version="1.0" encoding="utf-8"?>
-<w:styles xmlns:mc="http://schemas.openxmlformats.org/markup-compatibility/2006" xmlns:r="http://schemas.openxmlformats.org/officeDocument/2006/relationships" xmlns:w="http://schemas.openxmlformats.org/wordprocessingml/2006/main" xmlns:w14="http://schemas.microsoft.com/office/word/2010/wordml" xmlns:w15="http://schemas.microsoft.com/office/word/2012/wordml" xmlns:w16cex="http://schemas.microsoft.com/office/word/2018/wordml/cex" xmlns:w16cid="http://schemas.microsoft.com/office/word/2016/wordml/cid" xmlns:w16="http://schemas.microsoft.com/office/word/2018/wordml" xmlns:w16sdtdh="http://schemas.microsoft.com/office/word/2020/wordml/sdtdatahash" xmlns:w16sdtfl="http://schemas.microsoft.com/office/word/2024/wordml/sdtformatlock" xmlns:w16se="http://schemas.microsoft.com/office/word/2015/wordml/symex" xmlns:w16du="http://schemas.microsoft.com/office/word/2023/wordml/word16du" mc:Ignorable="w14 w15 w16se w16cid w16 w16cex w16sdtdh w16sdtfl w16du">
+<w:styles xmlns:mc="http://schemas.openxmlformats.org/markup-compatibility/2006" xmlns:r="http://schemas.openxmlformats.org/officeDocument/2006/relationships" xmlns:w="http://schemas.openxmlformats.org/wordprocessingml/2006/main" xmlns:w14="http://schemas.microsoft.com/office/word/2010/wordml" xmlns:w15="http://schemas.microsoft.com/office/word/2012/wordml" xmlns:w16cex="http://schemas.microsoft.com/office/word/2018/wordml/cex" xmlns:w16cid="http://schemas.microsoft.com/office/word/2016/wordml/cid" xmlns:w16="http://schemas.microsoft.com/office/word/2018/wordml" xmlns:w16du="http://schemas.microsoft.com/office/word/2023/wordml/word16du" xmlns:w16sdtdh="http://schemas.microsoft.com/office/word/2020/wordml/sdtdatahash" xmlns:w16sdtfl="http://schemas.microsoft.com/office/word/2024/wordml/sdtformatlock" xmlns:w16se="http://schemas.microsoft.com/office/word/2015/wordml/symex" mc:Ignorable="w14 w15 w16se w16cid w16 w16cex w16sdtdh w16sdtfl w16du">
   <w:docDefaults>
     <w:rPrDefault>
       <w:rPr>
@@ -12968,17 +13230,17 @@
     <w:lsdException w:name="Unresolved Mention" w:semiHidden="1" w:unhideWhenUsed="1"/>
     <w:lsdException w:name="Smart Link" w:semiHidden="1" w:unhideWhenUsed="1"/>
   </w:latentStyles>
-  <w:style w:type="paragraph" w:default="1" w:styleId="Standard">
+  <w:style w:type="paragraph" w:default="1" w:styleId="Normal">
     <w:name w:val="Normal"/>
     <w:qFormat/>
   </w:style>
-  <w:style w:type="character" w:default="1" w:styleId="Absatz-Standardschriftart">
+  <w:style w:type="character" w:default="1" w:styleId="DefaultParagraphFont">
     <w:name w:val="Default Paragraph Font"/>
     <w:uiPriority w:val="1"/>
     <w:semiHidden/>
     <w:unhideWhenUsed/>
   </w:style>
-  <w:style w:type="table" w:default="1" w:styleId="NormaleTabelle">
+  <w:style w:type="table" w:default="1" w:styleId="TableNormal">
     <w:name w:val="Normal Table"/>
     <w:uiPriority w:val="99"/>
     <w:semiHidden/>
@@ -12993,15 +13255,15 @@
       </w:tblCellMar>
     </w:tblPr>
   </w:style>
-  <w:style w:type="numbering" w:default="1" w:styleId="KeineListe">
+  <w:style w:type="numbering" w:default="1" w:styleId="NoList">
     <w:name w:val="No List"/>
     <w:uiPriority w:val="99"/>
     <w:semiHidden/>
     <w:unhideWhenUsed/>
   </w:style>
-  <w:style w:type="character" w:styleId="Platzhaltertext">
+  <w:style w:type="character" w:styleId="PlaceholderText">
     <w:name w:val="Placeholder Text"/>
-    <w:basedOn w:val="Absatz-Standardschriftart"/>
+    <w:basedOn w:val="DefaultParagraphFont"/>
     <w:uiPriority w:val="99"/>
     <w:semiHidden/>
     <w:rsid w:val="003A4554"/>
@@ -13013,7 +13275,7 @@
 </file>
 
 <file path=word/glossary/webSettings.xml><?xml version="1.0" encoding="utf-8"?>
-<w:webSettings xmlns:mc="http://schemas.openxmlformats.org/markup-compatibility/2006" xmlns:r="http://schemas.openxmlformats.org/officeDocument/2006/relationships" xmlns:w="http://schemas.openxmlformats.org/wordprocessingml/2006/main" xmlns:w14="http://schemas.microsoft.com/office/word/2010/wordml" xmlns:w15="http://schemas.microsoft.com/office/word/2012/wordml" xmlns:w16cex="http://schemas.microsoft.com/office/word/2018/wordml/cex" xmlns:w16cid="http://schemas.microsoft.com/office/word/2016/wordml/cid" xmlns:w16="http://schemas.microsoft.com/office/word/2018/wordml" xmlns:w16sdtdh="http://schemas.microsoft.com/office/word/2020/wordml/sdtdatahash" xmlns:w16sdtfl="http://schemas.microsoft.com/office/word/2024/wordml/sdtformatlock" xmlns:w16se="http://schemas.microsoft.com/office/word/2015/wordml/symex" xmlns:w16du="http://schemas.microsoft.com/office/word/2023/wordml/word16du" mc:Ignorable="w14 w15 w16se w16cid w16 w16cex w16sdtdh w16sdtfl w16du">
+<w:webSettings xmlns:mc="http://schemas.openxmlformats.org/markup-compatibility/2006" xmlns:r="http://schemas.openxmlformats.org/officeDocument/2006/relationships" xmlns:w="http://schemas.openxmlformats.org/wordprocessingml/2006/main" xmlns:w14="http://schemas.microsoft.com/office/word/2010/wordml" xmlns:w15="http://schemas.microsoft.com/office/word/2012/wordml" xmlns:w16cex="http://schemas.microsoft.com/office/word/2018/wordml/cex" xmlns:w16cid="http://schemas.microsoft.com/office/word/2016/wordml/cid" xmlns:w16="http://schemas.microsoft.com/office/word/2018/wordml" xmlns:w16du="http://schemas.microsoft.com/office/word/2023/wordml/word16du" xmlns:w16sdtdh="http://schemas.microsoft.com/office/word/2020/wordml/sdtdatahash" xmlns:w16sdtfl="http://schemas.microsoft.com/office/word/2024/wordml/sdtformatlock" xmlns:w16se="http://schemas.microsoft.com/office/word/2015/wordml/symex" mc:Ignorable="w14 w15 w16se w16cid w16 w16cex w16sdtdh w16sdtfl w16du">
   <w:optimizeForBrowser/>
   <w:allowPNG/>
 </w:webSettings>
@@ -13281,10 +13543,6 @@
 </file>
 
 <file path=customXml/item1.xml><?xml version="1.0" encoding="utf-8"?>
-<b:Sources xmlns:b="http://schemas.openxmlformats.org/officeDocument/2006/bibliography" xmlns="http://schemas.openxmlformats.org/officeDocument/2006/bibliography" SelectedStyle="\APASixthEditionOfficeOnline.xsl" StyleName="APA" Version="6"/>
-</file>
-
-<file path=customXml/item2.xml><?xml version="1.0" encoding="utf-8"?>
 <?mso-contentType ?>
 <FormTemplates xmlns="http://schemas.microsoft.com/sharepoint/v3/contenttype/forms">
   <Display>DocumentLibraryForm</Display>
@@ -13293,18 +13551,11 @@
 </FormTemplates>
 </file>
 
-<file path=customXml/item3.xml><?xml version="1.0" encoding="utf-8"?>
-<p:properties xmlns:p="http://schemas.microsoft.com/office/2006/metadata/properties" xmlns:xsi="http://www.w3.org/2001/XMLSchema-instance" xmlns:pc="http://schemas.microsoft.com/office/infopath/2007/PartnerControls">
-  <documentManagement>
-    <TaxCatchAll xmlns="e32c9bb7-34f5-44bb-800b-35798843376c" xsi:nil="true"/>
-    <lcf76f155ced4ddcb4097134ff3c332f xmlns="22aa7da5-41f5-464e-85e6-b2dd1761cd70">
-      <Terms xmlns="http://schemas.microsoft.com/office/infopath/2007/PartnerControls"/>
-    </lcf76f155ced4ddcb4097134ff3c332f>
-  </documentManagement>
-</p:properties>
+<file path=customXml/item2.xml><?xml version="1.0" encoding="utf-8"?>
+<b:Sources xmlns:b="http://schemas.openxmlformats.org/officeDocument/2006/bibliography" xmlns="http://schemas.openxmlformats.org/officeDocument/2006/bibliography" SelectedStyle="\APASixthEditionOfficeOnline.xsl" StyleName="APA" Version="6"/>
 </file>
 
-<file path=customXml/item4.xml><?xml version="1.0" encoding="utf-8"?>
+<file path=customXml/item3.xml><?xml version="1.0" encoding="utf-8"?>
 <ct:contentTypeSchema xmlns:ct="http://schemas.microsoft.com/office/2006/metadata/contentType" xmlns:ma="http://schemas.microsoft.com/office/2006/metadata/properties/metaAttributes" ct:_="" ma:_="" ma:contentTypeName="Dokument" ma:contentTypeID="0x010100D827C1AAE83348469185F4DE8D8E42AA" ma:contentTypeVersion="18" ma:contentTypeDescription="Ein neues Dokument erstellen." ma:contentTypeScope="" ma:versionID="618348fa32be16a474572d476ed91d7d">
   <xsd:schema xmlns:xsd="http://www.w3.org/2001/XMLSchema" xmlns:xs="http://www.w3.org/2001/XMLSchema" xmlns:p="http://schemas.microsoft.com/office/2006/metadata/properties" xmlns:ns2="22aa7da5-41f5-464e-85e6-b2dd1761cd70" xmlns:ns3="e32c9bb7-34f5-44bb-800b-35798843376c" targetNamespace="http://schemas.microsoft.com/office/2006/metadata/properties" ma:root="true" ma:fieldsID="348e17a0368de80907a02c9ddfbbbd22" ns2:_="" ns3:_="">
     <xsd:import namespace="22aa7da5-41f5-464e-85e6-b2dd1761cd70"/>
@@ -13559,7 +13810,26 @@
 </ct:contentTypeSchema>
 </file>
 
+<file path=customXml/item4.xml><?xml version="1.0" encoding="utf-8"?>
+<p:properties xmlns:p="http://schemas.microsoft.com/office/2006/metadata/properties" xmlns:xsi="http://www.w3.org/2001/XMLSchema-instance" xmlns:pc="http://schemas.microsoft.com/office/infopath/2007/PartnerControls">
+  <documentManagement>
+    <TaxCatchAll xmlns="e32c9bb7-34f5-44bb-800b-35798843376c" xsi:nil="true"/>
+    <lcf76f155ced4ddcb4097134ff3c332f xmlns="22aa7da5-41f5-464e-85e6-b2dd1761cd70">
+      <Terms xmlns="http://schemas.microsoft.com/office/infopath/2007/PartnerControls"/>
+    </lcf76f155ced4ddcb4097134ff3c332f>
+  </documentManagement>
+</p:properties>
+</file>
+
 <file path=customXml/itemProps1.xml><?xml version="1.0" encoding="utf-8"?>
+<ds:datastoreItem xmlns:ds="http://schemas.openxmlformats.org/officeDocument/2006/customXml" ds:itemID="{B8133326-A9D9-4C20-AED2-57D8DB38EE3B}">
+  <ds:schemaRefs>
+    <ds:schemaRef ds:uri="http://schemas.microsoft.com/sharepoint/v3/contenttype/forms"/>
+  </ds:schemaRefs>
+</ds:datastoreItem>
+</file>
+
+<file path=customXml/itemProps2.xml><?xml version="1.0" encoding="utf-8"?>
 <ds:datastoreItem xmlns:ds="http://schemas.openxmlformats.org/officeDocument/2006/customXml" ds:itemID="{84661881-BC85-4481-9F58-A76FBE332CB1}">
   <ds:schemaRefs>
     <ds:schemaRef ds:uri="http://schemas.openxmlformats.org/officeDocument/2006/bibliography"/>
@@ -13567,26 +13837,7 @@
 </ds:datastoreItem>
 </file>
 
-<file path=customXml/itemProps2.xml><?xml version="1.0" encoding="utf-8"?>
-<ds:datastoreItem xmlns:ds="http://schemas.openxmlformats.org/officeDocument/2006/customXml" ds:itemID="{B8133326-A9D9-4C20-AED2-57D8DB38EE3B}">
-  <ds:schemaRefs>
-    <ds:schemaRef ds:uri="http://schemas.microsoft.com/sharepoint/v3/contenttype/forms"/>
-  </ds:schemaRefs>
-</ds:datastoreItem>
-</file>
-
 <file path=customXml/itemProps3.xml><?xml version="1.0" encoding="utf-8"?>
-<ds:datastoreItem xmlns:ds="http://schemas.openxmlformats.org/officeDocument/2006/customXml" ds:itemID="{AEB5EB03-E1DB-4DE6-8456-3A44BE197CDE}">
-  <ds:schemaRefs>
-    <ds:schemaRef ds:uri="http://schemas.microsoft.com/office/2006/metadata/properties"/>
-    <ds:schemaRef ds:uri="http://schemas.microsoft.com/office/infopath/2007/PartnerControls"/>
-    <ds:schemaRef ds:uri="e32c9bb7-34f5-44bb-800b-35798843376c"/>
-    <ds:schemaRef ds:uri="22aa7da5-41f5-464e-85e6-b2dd1761cd70"/>
-  </ds:schemaRefs>
-</ds:datastoreItem>
-</file>
-
-<file path=customXml/itemProps4.xml><?xml version="1.0" encoding="utf-8"?>
 <ds:datastoreItem xmlns:ds="http://schemas.openxmlformats.org/officeDocument/2006/customXml" ds:itemID="{60D544C4-8D4D-481D-B00F-1F09332EE222}">
   <ds:schemaRefs>
     <ds:schemaRef ds:uri="http://schemas.microsoft.com/office/2006/metadata/contentType"/>
@@ -13603,4 +13854,15 @@
     <ds:schemaRef ds:uri="http://schemas.microsoft.com/internal/obd"/>
   </ds:schemaRefs>
 </ds:datastoreItem>
+</file>
+
+<file path=customXml/itemProps4.xml><?xml version="1.0" encoding="utf-8"?>
+<ds:datastoreItem xmlns:ds="http://schemas.openxmlformats.org/officeDocument/2006/customXml" ds:itemID="{AEB5EB03-E1DB-4DE6-8456-3A44BE197CDE}">
+  <ds:schemaRefs>
+    <ds:schemaRef ds:uri="http://schemas.microsoft.com/office/2006/metadata/properties"/>
+    <ds:schemaRef ds:uri="http://schemas.microsoft.com/office/infopath/2007/PartnerControls"/>
+    <ds:schemaRef ds:uri="e32c9bb7-34f5-44bb-800b-35798843376c"/>
+    <ds:schemaRef ds:uri="22aa7da5-41f5-464e-85e6-b2dd1761cd70"/>
+  </ds:schemaRefs>
+</ds:datastoreItem>
 </file>
</xml_diff>

<commit_message>
Persoenliche meinung und Stunden Nachgetragen
</commit_message>
<xml_diff>
--- a/Doc/Dokumentation/Case Study Doku.docx
+++ b/Doc/Dokumentation/Case Study Doku.docx
@@ -350,12 +350,8 @@
           <w:szCs w:val="28"/>
         </w:rPr>
         <w:sectPr>
-          <w:headerReference w:type="even" r:id="rId13"/>
-          <w:headerReference w:type="default" r:id="rId14"/>
-          <w:footerReference w:type="even" r:id="rId15"/>
-          <w:footerReference w:type="default" r:id="rId16"/>
-          <w:headerReference w:type="first" r:id="rId17"/>
-          <w:footerReference w:type="first" r:id="rId18"/>
+          <w:footerReference w:type="default" r:id="rId13"/>
+          <w:footerReference w:type="first" r:id="rId14"/>
           <w:pgSz w:w="11906" w:h="16838"/>
           <w:pgMar w:top="1418" w:right="1134" w:bottom="1134" w:left="1134" w:header="709" w:footer="709" w:gutter="0"/>
           <w:cols w:space="708"/>
@@ -3616,7 +3612,7 @@
                     <pic:cNvPicPr/>
                   </pic:nvPicPr>
                   <pic:blipFill>
-                    <a:blip r:embed="rId19">
+                    <a:blip r:embed="rId15">
                       <a:extLst>
                         <a:ext uri="{28A0092B-C50C-407E-A947-70E740481C1C}">
                           <a14:useLocalDpi xmlns:a14="http://schemas.microsoft.com/office/drawing/2010/main" val="0"/>
@@ -3733,7 +3729,7 @@
                     <pic:cNvPicPr/>
                   </pic:nvPicPr>
                   <pic:blipFill>
-                    <a:blip r:embed="rId20">
+                    <a:blip r:embed="rId16">
                       <a:extLst>
                         <a:ext uri="{28A0092B-C50C-407E-A947-70E740481C1C}">
                           <a14:useLocalDpi xmlns:a14="http://schemas.microsoft.com/office/drawing/2010/main" val="0"/>
@@ -3845,7 +3841,7 @@
                     <pic:cNvPicPr/>
                   </pic:nvPicPr>
                   <pic:blipFill rotWithShape="1">
-                    <a:blip r:embed="rId21">
+                    <a:blip r:embed="rId17">
                       <a:extLst>
                         <a:ext uri="{28A0092B-C50C-407E-A947-70E740481C1C}">
                           <a14:useLocalDpi xmlns:a14="http://schemas.microsoft.com/office/drawing/2010/main" val="0"/>
@@ -4056,7 +4052,7 @@
                     <pic:cNvPicPr/>
                   </pic:nvPicPr>
                   <pic:blipFill>
-                    <a:blip r:embed="rId22">
+                    <a:blip r:embed="rId18">
                       <a:extLst>
                         <a:ext uri="{28A0092B-C50C-407E-A947-70E740481C1C}">
                           <a14:useLocalDpi xmlns:a14="http://schemas.microsoft.com/office/drawing/2010/main" val="0"/>
@@ -4316,7 +4312,7 @@
                     </pic:cNvPicPr>
                   </pic:nvPicPr>
                   <pic:blipFill>
-                    <a:blip r:embed="rId23" cstate="print">
+                    <a:blip r:embed="rId19" cstate="print">
                       <a:extLst>
                         <a:ext uri="{28A0092B-C50C-407E-A947-70E740481C1C}">
                           <a14:useLocalDpi xmlns:a14="http://schemas.microsoft.com/office/drawing/2010/main" val="0"/>
@@ -4452,7 +4448,7 @@
                     </pic:cNvPicPr>
                   </pic:nvPicPr>
                   <pic:blipFill>
-                    <a:blip r:embed="rId24" cstate="print">
+                    <a:blip r:embed="rId20" cstate="print">
                       <a:extLst>
                         <a:ext uri="{28A0092B-C50C-407E-A947-70E740481C1C}">
                           <a14:useLocalDpi xmlns:a14="http://schemas.microsoft.com/office/drawing/2010/main" val="0"/>
@@ -4568,7 +4564,7 @@
                     <pic:cNvPicPr/>
                   </pic:nvPicPr>
                   <pic:blipFill rotWithShape="1">
-                    <a:blip r:embed="rId25"/>
+                    <a:blip r:embed="rId21"/>
                     <a:srcRect r="3809"/>
                     <a:stretch>
                       <a:fillRect/>
@@ -5428,7 +5424,7 @@
                     <pic:cNvPicPr/>
                   </pic:nvPicPr>
                   <pic:blipFill rotWithShape="1">
-                    <a:blip r:embed="rId26"/>
+                    <a:blip r:embed="rId22"/>
                     <a:srcRect t="10512"/>
                     <a:stretch>
                       <a:fillRect/>
@@ -5485,70 +5481,181 @@
     <w:p/>
     <w:p/>
     <w:p/>
-    <w:p/>
+    <w:p>
+      <w:pPr>
+        <w:spacing w:after="160" w:line="259" w:lineRule="auto"/>
+      </w:pPr>
+      <w:r>
+        <w:br w:type="page"/>
+      </w:r>
+    </w:p>
     <w:p>
       <w:pPr>
         <w:pStyle w:val="Heading1"/>
       </w:pPr>
       <w:bookmarkStart w:id="31" w:name="_Toc233202769"/>
       <w:r>
+        <w:lastRenderedPageBreak/>
         <w:t>Schlussteil</w:t>
       </w:r>
       <w:bookmarkEnd w:id="31"/>
     </w:p>
     <w:p>
       <w:r>
-        <w:t xml:space="preserve">Die Case Study war für uns sehr lehrreich, da wir eine komplette Steuerung von der Analyse bis zur Umsetzung gemeinsam entwickeln konnten. Besonders interessant war, dass wir das Wissen aus Steuerungstechnik 1 und 2 praktisch anwenden konnten. Dadurch konnten wir Schritt für </w:t>
-      </w:r>
-      <w:r>
+        <w:t>Die Case Study war für uns sehr lehrreich, da wir eine komplette Steuerung von der Analyse bis zur Umsetzung gemeinsam entwickeln konnten. Besonders interessant war, dass wir das Wissen aus Steuerungstechnik 1 und 2 praktisch anwenden konnten. Dadurch konnten wir Schritt für Schritt nachvollziehen, wie aus einer geplanten Architektur eine funktionierende Steuerung entsteht.</w:t>
+      </w:r>
+    </w:p>
+    <w:p/>
+    <w:p>
+      <w:r>
+        <w:t>Die Zusammenarbeit im Team hat gut funktioniert, da wir die Aufgaben sinnvoll aufgeteilt und uns regelmässig abgesprochen haben. So konnten wir parallel an der Steuerung, der HMI-Visualisierung und der Dokumentation arbeiten. Auch die Zusammenarbeit mit Git war für uns ein wichtiger Bestandteil des Projekts. Obwohl es zwischendurch Probleme mit Branches, Pulls, Pushes und fehlenden Dateien gab, konnten wir diese gemeinsam lösen und daraus viel lernen.</w:t>
+      </w:r>
+    </w:p>
+    <w:p/>
+    <w:p>
+      <w:r>
+        <w:t>Technisch war vor allem die Anbindung der Motoren und die Arbeit mit Motion sehr spannend. Dabei konnten wir besser verstehen, wie Antriebe in ein SPS-Projekt eingebunden und später von der Steuerungslogik verwendet werden. Insgesamt hat uns die Case Study gezeigt, wie wichtig eine saubere Planung, klare Schnittstellen und regelmässiges Testen sind. Trotz einiger Herausforderungen hat das Projekt Spass gemacht und war für uns ein wertvoller Lernprozess.</w:t>
+      </w:r>
+    </w:p>
+    <w:p>
+      <w:pPr>
+        <w:pStyle w:val="Heading2"/>
+      </w:pPr>
+      <w:bookmarkStart w:id="32" w:name="_Toc233202770"/>
+      <w:r>
+        <w:t>Niklaus</w:t>
+      </w:r>
+      <w:bookmarkEnd w:id="32"/>
+    </w:p>
+    <w:p>
+      <w:pPr>
+        <w:pStyle w:val="Heading2"/>
+        <w:rPr>
+          <w:rFonts w:ascii="Times New Roman" w:hAnsi="Times New Roman"/>
+        </w:rPr>
+      </w:pPr>
+      <w:r>
+        <w:t>5.1. Niklaus</w:t>
+      </w:r>
+    </w:p>
+    <w:p>
+      <w:pPr>
+        <w:pStyle w:val="NormalWeb"/>
+        <w:rPr>
+          <w:rFonts w:ascii="Arial" w:hAnsi="Arial" w:cs="Arial"/>
+        </w:rPr>
+      </w:pPr>
+      <w:r>
+        <w:rPr>
+          <w:rFonts w:ascii="Arial" w:hAnsi="Arial" w:cs="Arial"/>
+        </w:rPr>
+        <w:t>Ich empfand die Case Study 4 als ein sehr technisches und interessantes Projekt. Besonders wertvoll war für mich, dass ich mein Verständnis für objektorientierte Programmierung in der SPS-Welt deutlich vertiefen konnte. Durch die Aufteilung in einzelne Klassen, Methoden und Objekte wurde für mich klarer, wie ein grösseres Steuerungsprogramm strukturiert aufgebaut werden kann. Vor allem das Zusammenspiel zwischen Hauptablauf, Aufzugmodul, Sensorik, Antriebsklassen und HMI hat mir geholfen, das Gesamtkonzept besser zu verstehen.</w:t>
+      </w:r>
+    </w:p>
+    <w:p>
+      <w:pPr>
+        <w:pStyle w:val="NormalWeb"/>
+        <w:rPr>
+          <w:rFonts w:ascii="Arial" w:hAnsi="Arial" w:cs="Arial"/>
+        </w:rPr>
+      </w:pPr>
+      <w:r>
+        <w:rPr>
+          <w:rFonts w:ascii="Arial" w:hAnsi="Arial" w:cs="Arial"/>
+        </w:rPr>
+        <w:t>Die Arbeit mit der SIGMATEK-Umgebung war für mich teilweise herausfordernd. Da ich aus anderen Steuerungsumgebungen wie B&amp;R, Beckhoff und TIA komme, musste ich mich zuerst an die Arbeitsweise in LASAL gewöhnen. Besonders die vielen einzelnen Einstellungen, Task-Zuordnungen und Verknüpfungen zwischen Klassen empfand ich als fehleranfällig. Einerseits bietet diese Struktur viele Möglichkeiten und eine hohe Flexibilität. Andererseits entstehen dadurch auch viele Stellen, an denen kleine Konfigurationsfehler grosse Auswirkungen haben können.</w:t>
+      </w:r>
+    </w:p>
+    <w:p>
+      <w:pPr>
+        <w:pStyle w:val="NormalWeb"/>
+        <w:rPr>
+          <w:rFonts w:ascii="Arial" w:hAnsi="Arial" w:cs="Arial"/>
+        </w:rPr>
+      </w:pPr>
+      <w:r>
+        <w:rPr>
+          <w:rFonts w:ascii="Arial" w:hAnsi="Arial" w:cs="Arial"/>
+        </w:rPr>
+        <w:t>Auch die Visualisierung war anspruchsvoller als erwartet. Die Verbindung zwischen SPS-Variablen, Servern, Textschemes und HMI-Elementen musste sehr genau aufgebaut werden. Dadurch wurde die Inbetriebnahme teilweise aufwendig. Gleichzeitig konnte ich dadurch besser nachvollziehen, wie stark SPS-Logik und Visualisierung voneinander abhängig sind und wie wichtig saubere Schnittstellen sind.</w:t>
+      </w:r>
+    </w:p>
+    <w:p>
+      <w:pPr>
+        <w:pStyle w:val="NormalWeb"/>
+        <w:rPr>
+          <w:rFonts w:ascii="Arial" w:hAnsi="Arial" w:cs="Arial"/>
+        </w:rPr>
+      </w:pPr>
+      <w:r>
+        <w:rPr>
+          <w:rFonts w:ascii="Arial" w:hAnsi="Arial" w:cs="Arial"/>
+        </w:rPr>
         <w:lastRenderedPageBreak/>
-        <w:t>Schritt nachvollziehen, wie aus einer geplanten Architektur eine funktionierende Steuerung entsteht.</w:t>
-      </w:r>
-    </w:p>
-    <w:p/>
-    <w:p>
-      <w:r>
-        <w:t>Die Zusammenarbeit im Team hat gut funktioniert, da wir die Aufgaben sinnvoll aufgeteilt und uns regelmässig abgesprochen haben. So konnten wir parallel an der Steuerung, der HMI-Visualisierung und der Dokumentation arbeiten. Auch die Zusammenarbeit mit Git war für uns ein wichtiger Bestandteil des Projekts. Obwohl es zwischendurch Probleme mit Branches, Pulls, Pushes und fehlenden Dateien gab, konnten wir diese gemeinsam lösen und daraus viel lernen.</w:t>
-      </w:r>
-    </w:p>
-    <w:p/>
-    <w:p>
-      <w:r>
-        <w:t>Technisch war vor allem die Anbindung der Motoren und die Arbeit mit Motion sehr spannend. Dabei konnten wir besser verstehen, wie Antriebe in ein SPS-Projekt eingebunden und später von der Steuerungslogik verwendet werden. Insgesamt hat uns die Case Study gezeigt, wie wichtig eine saubere Planung, klare Schnittstellen und regelmässiges Testen sind. Trotz einiger Herausforderungen hat das Projekt Spass gemacht und war für uns ein wertvoller Lernprozess.</w:t>
+        <w:t>Im Gesamten finde ich das Programmierkonzept von SIGMATEK trotzdem interessant und leistungsfähig. Die objektorientierte Struktur bietet viele Vorteile, sobald das Grundprinzip verstanden ist. Für mich wirkte die Umgebung jedoch weniger direkt und komfortabel als andere Systeme, weil sehr viele Einstellungen manuell gepflegt werden müssen.</w:t>
+      </w:r>
+    </w:p>
+    <w:p>
+      <w:pPr>
+        <w:pStyle w:val="NormalWeb"/>
+        <w:rPr>
+          <w:rFonts w:ascii="Arial" w:hAnsi="Arial" w:cs="Arial"/>
+        </w:rPr>
+      </w:pPr>
+      <w:r>
+        <w:rPr>
+          <w:rFonts w:ascii="Arial" w:hAnsi="Arial" w:cs="Arial"/>
+        </w:rPr>
+        <w:t>Trotz dieser Herausforderungen bin ich froh, diese Erfahrung gemacht zu haben. Ich konnte mein Verständnis für Steuerungsarchitektur, objektorientierte SPS-Programmierung, Motion-Anbindung, HMI-Kommunikation und Fehlersuche deutlich erweitern. Wenn ich in Zukunft wieder mit SIGMATEK arbeite, werde ich mit deutlich mehr Verständnis und Sicherheit an die Aufgabe herangehen.</w:t>
+      </w:r>
+      <w:r>
+        <w:rPr>
+          <w:rFonts w:ascii="Arial" w:hAnsi="Arial" w:cs="Arial"/>
+        </w:rPr>
+        <w:t xml:space="preserve"> </w:t>
+      </w:r>
+      <w:r>
+        <w:rPr>
+          <mc:AlternateContent>
+            <mc:Choice Requires="w16se">
+              <w:rFonts w:ascii="Arial" w:hAnsi="Arial" w:cs="Arial"/>
+            </mc:Choice>
+            <mc:Fallback>
+              <w:rFonts w:ascii="Segoe UI Emoji" w:eastAsia="Segoe UI Emoji" w:hAnsi="Segoe UI Emoji" w:cs="Segoe UI Emoji"/>
+            </mc:Fallback>
+          </mc:AlternateContent>
+        </w:rPr>
+        <mc:AlternateContent>
+          <mc:Choice Requires="w16se">
+            <w16se:symEx w16se:font="Segoe UI Emoji" w16se:char="1F609"/>
+          </mc:Choice>
+          <mc:Fallback>
+            <w:t>😉</w:t>
+          </mc:Fallback>
+        </mc:AlternateContent>
+      </w:r>
+    </w:p>
+    <w:p>
+      <w:pPr>
+        <w:spacing w:after="160" w:line="259" w:lineRule="auto"/>
+        <w:rPr>
+          <w:rFonts w:cs="Arial"/>
+        </w:rPr>
+      </w:pPr>
+      <w:r>
+        <w:rPr>
+          <w:rFonts w:cs="Arial"/>
+        </w:rPr>
+        <w:br w:type="page"/>
       </w:r>
     </w:p>
     <w:p>
       <w:pPr>
         <w:pStyle w:val="Heading2"/>
       </w:pPr>
-      <w:bookmarkStart w:id="32" w:name="_Toc233202770"/>
-      <w:r>
-        <w:t>Niklaus</w:t>
-      </w:r>
-      <w:bookmarkEnd w:id="32"/>
-    </w:p>
-    <w:p/>
-    <w:p/>
-    <w:p/>
-    <w:p/>
-    <w:p/>
-    <w:p/>
-    <w:p/>
-    <w:p/>
-    <w:p/>
-    <w:p/>
-    <w:p/>
-    <w:p/>
-    <w:p/>
-    <w:p/>
-    <w:p/>
-    <w:p/>
-    <w:p>
-      <w:pPr>
-        <w:pStyle w:val="Heading2"/>
-      </w:pPr>
       <w:bookmarkStart w:id="33" w:name="_Toc233202771"/>
       <w:r>
+        <w:lastRenderedPageBreak/>
         <w:t>Hassan</w:t>
       </w:r>
       <w:bookmarkEnd w:id="33"/>
@@ -5580,49 +5687,14 @@
     <w:p/>
     <w:p/>
     <w:p/>
-    <w:p/>
-    <w:p/>
-    <w:p/>
-    <w:p/>
-    <w:p/>
-    <w:p/>
-    <w:p/>
-    <w:p/>
-    <w:p/>
-    <w:p/>
-    <w:p/>
-    <w:p/>
-    <w:p/>
-    <w:p/>
-    <w:p/>
-    <w:p/>
-    <w:p/>
-    <w:p/>
-    <w:p/>
-    <w:p/>
-    <w:p/>
-    <w:p/>
-    <w:p/>
-    <w:p/>
-    <w:p/>
-    <w:p/>
-    <w:p/>
-    <w:p/>
-    <w:p/>
-    <w:p/>
-    <w:p/>
-    <w:p/>
-    <w:p/>
-    <w:p/>
-    <w:p/>
-    <w:p/>
-    <w:p/>
-    <w:p/>
-    <w:p/>
-    <w:p/>
-    <w:p/>
-    <w:p/>
-    <w:p/>
+    <w:p>
+      <w:pPr>
+        <w:spacing w:after="160" w:line="259" w:lineRule="auto"/>
+      </w:pPr>
+      <w:r>
+        <w:br w:type="page"/>
+      </w:r>
+    </w:p>
     <w:p>
       <w:pPr>
         <w:pStyle w:val="Heading1"/>
@@ -5634,6 +5706,7 @@
       </w:pPr>
       <w:bookmarkStart w:id="34" w:name="_Toc233202772"/>
       <w:r>
+        <w:lastRenderedPageBreak/>
         <w:t>Aufwandsübersicht</w:t>
       </w:r>
       <w:bookmarkEnd w:id="34"/>
@@ -5953,7 +6026,6 @@
                 <w:b w:val="0"/>
                 <w:bCs w:val="0"/>
               </w:rPr>
-              <w:lastRenderedPageBreak/>
               <w:t>Zustandsautomat Vorlage erstellt</w:t>
             </w:r>
           </w:p>
@@ -7030,6 +7102,7 @@
                 <w:b w:val="0"/>
                 <w:bCs w:val="0"/>
               </w:rPr>
+              <w:lastRenderedPageBreak/>
               <w:t>VISU nach Skizze editiert und Knöpfe mit Server hinterlegt</w:t>
             </w:r>
           </w:p>
@@ -7235,7 +7308,6 @@
                 <w:b w:val="0"/>
                 <w:bCs w:val="0"/>
               </w:rPr>
-              <w:lastRenderedPageBreak/>
               <w:t>Antriebsansteuerung angepasst</w:t>
             </w:r>
           </w:p>
@@ -7489,25 +7561,7 @@
                 <w:bCs w:val="0"/>
                 <w:lang w:val="en-GB"/>
               </w:rPr>
-              <w:t xml:space="preserve">Troubleshooting HMI </w:t>
-            </w:r>
-            <w:proofErr w:type="spellStart"/>
-            <w:r>
-              <w:rPr>
-                <w:b w:val="0"/>
-                <w:bCs w:val="0"/>
-                <w:lang w:val="en-GB"/>
-              </w:rPr>
-              <w:t>rendert</w:t>
-            </w:r>
-            <w:proofErr w:type="spellEnd"/>
-            <w:r>
-              <w:rPr>
-                <w:b w:val="0"/>
-                <w:bCs w:val="0"/>
-                <w:lang w:val="en-GB"/>
-              </w:rPr>
-              <w:t xml:space="preserve"> Buttons nicht</w:t>
+              <w:t>Troubleshooting HMI rendert Buttons nicht</w:t>
             </w:r>
           </w:p>
         </w:tc>
@@ -7567,112 +7621,82 @@
                 <w:lang w:val="en-GB"/>
               </w:rPr>
             </w:pPr>
-            <w:proofErr w:type="spellStart"/>
             <w:r>
               <w:rPr>
                 <w:b w:val="0"/>
                 <w:bCs w:val="0"/>
                 <w:lang w:val="en-GB"/>
               </w:rPr>
-              <w:t>Verlinkung</w:t>
-            </w:r>
-            <w:proofErr w:type="spellEnd"/>
-            <w:r>
+              <w:t>Verlinkung Textscheme</w:t>
+            </w:r>
+          </w:p>
+        </w:tc>
+        <w:tc>
+          <w:tcPr>
+            <w:tcW w:w="3209" w:type="dxa"/>
+          </w:tcPr>
+          <w:p>
+            <w:pPr>
+              <w:cnfStyle w:val="000000100000" w:firstRow="0" w:lastRow="0" w:firstColumn="0" w:lastColumn="0" w:oddVBand="0" w:evenVBand="0" w:oddHBand="1" w:evenHBand="0" w:firstRowFirstColumn="0" w:firstRowLastColumn="0" w:lastRowFirstColumn="0" w:lastRowLastColumn="0"/>
+              <w:rPr>
+                <w:lang w:val="en-GB"/>
+              </w:rPr>
+            </w:pPr>
+            <w:r>
+              <w:rPr>
+                <w:lang w:val="en-GB"/>
+              </w:rPr>
+              <w:t>Hassan</w:t>
+            </w:r>
+          </w:p>
+        </w:tc>
+        <w:tc>
+          <w:tcPr>
+            <w:tcW w:w="3210" w:type="dxa"/>
+          </w:tcPr>
+          <w:p>
+            <w:pPr>
+              <w:cnfStyle w:val="000000100000" w:firstRow="0" w:lastRow="0" w:firstColumn="0" w:lastColumn="0" w:oddVBand="0" w:evenVBand="0" w:oddHBand="1" w:evenHBand="0" w:firstRowFirstColumn="0" w:firstRowLastColumn="0" w:lastRowFirstColumn="0" w:lastRowLastColumn="0"/>
+              <w:rPr>
+                <w:lang w:val="en-GB"/>
+              </w:rPr>
+            </w:pPr>
+            <w:r>
+              <w:rPr>
+                <w:lang w:val="en-GB"/>
+              </w:rPr>
+              <w:t>1</w:t>
+            </w:r>
+            <w:r>
+              <w:rPr>
+                <w:lang w:val="en-GB"/>
+              </w:rPr>
+              <w:t>h</w:t>
+            </w:r>
+          </w:p>
+        </w:tc>
+      </w:tr>
+      <w:tr>
+        <w:tc>
+          <w:tcPr>
+            <w:cnfStyle w:val="001000000000" w:firstRow="0" w:lastRow="0" w:firstColumn="1" w:lastColumn="0" w:oddVBand="0" w:evenVBand="0" w:oddHBand="0" w:evenHBand="0" w:firstRowFirstColumn="0" w:firstRowLastColumn="0" w:lastRowFirstColumn="0" w:lastRowLastColumn="0"/>
+            <w:tcW w:w="3209" w:type="dxa"/>
+          </w:tcPr>
+          <w:p>
+            <w:pPr>
               <w:rPr>
                 <w:b w:val="0"/>
                 <w:bCs w:val="0"/>
                 <w:lang w:val="en-GB"/>
               </w:rPr>
-              <w:t xml:space="preserve"> </w:t>
-            </w:r>
-            <w:proofErr w:type="spellStart"/>
+            </w:pPr>
             <w:r>
               <w:rPr>
                 <w:b w:val="0"/>
                 <w:bCs w:val="0"/>
                 <w:lang w:val="en-GB"/>
               </w:rPr>
-              <w:t>Textscheme</w:t>
-            </w:r>
-            <w:proofErr w:type="spellEnd"/>
-          </w:p>
-        </w:tc>
-        <w:tc>
-          <w:tcPr>
-            <w:tcW w:w="3209" w:type="dxa"/>
-          </w:tcPr>
-          <w:p>
-            <w:pPr>
-              <w:cnfStyle w:val="000000100000" w:firstRow="0" w:lastRow="0" w:firstColumn="0" w:lastColumn="0" w:oddVBand="0" w:evenVBand="0" w:oddHBand="1" w:evenHBand="0" w:firstRowFirstColumn="0" w:firstRowLastColumn="0" w:lastRowFirstColumn="0" w:lastRowLastColumn="0"/>
-              <w:rPr>
-                <w:lang w:val="en-GB"/>
-              </w:rPr>
-            </w:pPr>
-            <w:r>
-              <w:rPr>
-                <w:lang w:val="en-GB"/>
-              </w:rPr>
-              <w:t>Hassan</w:t>
-            </w:r>
-          </w:p>
-        </w:tc>
-        <w:tc>
-          <w:tcPr>
-            <w:tcW w:w="3210" w:type="dxa"/>
-          </w:tcPr>
-          <w:p>
-            <w:pPr>
-              <w:cnfStyle w:val="000000100000" w:firstRow="0" w:lastRow="0" w:firstColumn="0" w:lastColumn="0" w:oddVBand="0" w:evenVBand="0" w:oddHBand="1" w:evenHBand="0" w:firstRowFirstColumn="0" w:firstRowLastColumn="0" w:lastRowFirstColumn="0" w:lastRowLastColumn="0"/>
-              <w:rPr>
-                <w:lang w:val="en-GB"/>
-              </w:rPr>
-            </w:pPr>
-            <w:r>
-              <w:rPr>
-                <w:lang w:val="en-GB"/>
-              </w:rPr>
-              <w:t>1</w:t>
-            </w:r>
-            <w:r>
-              <w:rPr>
-                <w:lang w:val="en-GB"/>
-              </w:rPr>
-              <w:t>h</w:t>
-            </w:r>
-          </w:p>
-        </w:tc>
-      </w:tr>
-      <w:tr>
-        <w:tc>
-          <w:tcPr>
-            <w:cnfStyle w:val="001000000000" w:firstRow="0" w:lastRow="0" w:firstColumn="1" w:lastColumn="0" w:oddVBand="0" w:evenVBand="0" w:oddHBand="0" w:evenHBand="0" w:firstRowFirstColumn="0" w:firstRowLastColumn="0" w:lastRowFirstColumn="0" w:lastRowLastColumn="0"/>
-            <w:tcW w:w="3209" w:type="dxa"/>
-          </w:tcPr>
-          <w:p>
-            <w:pPr>
-              <w:rPr>
-                <w:b w:val="0"/>
-                <w:bCs w:val="0"/>
-                <w:lang w:val="en-GB"/>
-              </w:rPr>
-            </w:pPr>
-            <w:proofErr w:type="spellStart"/>
-            <w:r>
-              <w:rPr>
-                <w:b w:val="0"/>
-                <w:bCs w:val="0"/>
-                <w:lang w:val="en-GB"/>
-              </w:rPr>
-              <w:t>Zentrierung</w:t>
-            </w:r>
-            <w:proofErr w:type="spellEnd"/>
-            <w:r>
-              <w:rPr>
-                <w:b w:val="0"/>
-                <w:bCs w:val="0"/>
-                <w:lang w:val="en-GB"/>
-              </w:rPr>
-              <w:t xml:space="preserve"> Buttons und Outputs</w:t>
+              <w:t>Zentrierung Buttons und Outputs</w:t>
             </w:r>
           </w:p>
         </w:tc>
@@ -7732,52 +7756,14 @@
                 <w:lang w:val="en-GB"/>
               </w:rPr>
             </w:pPr>
-            <w:proofErr w:type="spellStart"/>
             <w:r>
               <w:rPr>
                 <w:b w:val="0"/>
                 <w:bCs w:val="0"/>
                 <w:lang w:val="en-GB"/>
               </w:rPr>
-              <w:t>clsAntrieb</w:t>
-            </w:r>
-            <w:proofErr w:type="spellEnd"/>
-            <w:r>
-              <w:rPr>
-                <w:b w:val="0"/>
-                <w:bCs w:val="0"/>
-                <w:lang w:val="en-GB"/>
-              </w:rPr>
-              <w:t xml:space="preserve"> in 2 </w:t>
-            </w:r>
-            <w:proofErr w:type="spellStart"/>
-            <w:r>
-              <w:rPr>
-                <w:b w:val="0"/>
-                <w:bCs w:val="0"/>
-                <w:lang w:val="en-GB"/>
-              </w:rPr>
-              <w:t>Objekte</w:t>
-            </w:r>
-            <w:proofErr w:type="spellEnd"/>
-            <w:r>
-              <w:rPr>
-                <w:b w:val="0"/>
-                <w:bCs w:val="0"/>
-                <w:lang w:val="en-GB"/>
-              </w:rPr>
-              <w:t xml:space="preserve"> </w:t>
-            </w:r>
-            <w:proofErr w:type="spellStart"/>
-            <w:r>
-              <w:rPr>
-                <w:b w:val="0"/>
-                <w:bCs w:val="0"/>
-                <w:lang w:val="en-GB"/>
-              </w:rPr>
-              <w:t>unterteilt</w:t>
-            </w:r>
-            <w:proofErr w:type="spellEnd"/>
+              <w:t>clsAntrieb in 2 Objekte unterteilt</w:t>
+            </w:r>
           </w:p>
         </w:tc>
         <w:tc>
@@ -8281,7 +8267,10 @@
               <w:cnfStyle w:val="000000000000" w:firstRow="0" w:lastRow="0" w:firstColumn="0" w:lastColumn="0" w:oddVBand="0" w:evenVBand="0" w:oddHBand="0" w:evenHBand="0" w:firstRowFirstColumn="0" w:firstRowLastColumn="0" w:lastRowFirstColumn="0" w:lastRowLastColumn="0"/>
             </w:pPr>
             <w:r>
-              <w:t>1h</w:t>
+              <w:t>1</w:t>
+            </w:r>
+            <w:r>
+              <w:t>h</w:t>
             </w:r>
           </w:p>
         </w:tc>
@@ -8356,6 +8345,7 @@
                 <w:b w:val="0"/>
                 <w:bCs w:val="0"/>
               </w:rPr>
+              <w:lastRenderedPageBreak/>
               <w:t>sZieletage mit Logik und Visualisierung implementiert</w:t>
             </w:r>
           </w:p>
@@ -8558,7 +8548,6 @@
                 <w:b w:val="0"/>
                 <w:bCs w:val="0"/>
               </w:rPr>
-              <w:lastRenderedPageBreak/>
               <w:t>Logik für die Status Leds verbessert</w:t>
             </w:r>
           </w:p>
@@ -8787,10 +8776,10 @@
               <w:cnfStyle w:val="000000000000" w:firstRow="0" w:lastRow="0" w:firstColumn="0" w:lastColumn="0" w:oddVBand="0" w:evenVBand="0" w:oddHBand="0" w:evenHBand="0" w:firstRowFirstColumn="0" w:firstRowLastColumn="0" w:lastRowFirstColumn="0" w:lastRowLastColumn="0"/>
             </w:pPr>
             <w:r>
-              <w:t>20</w:t>
-            </w:r>
-            <w:r>
-              <w:t>h bis jetzt</w:t>
+              <w:t>2</w:t>
+            </w:r>
+            <w:r>
+              <w:t>4h</w:t>
             </w:r>
           </w:p>
         </w:tc>
@@ -8809,14 +8798,45 @@
           <w:b/>
           <w:bCs/>
         </w:rPr>
-        <w:t xml:space="preserve">Gesamtaufwand in Stunden: </w:t>
-      </w:r>
-      <w:r>
+        <w:t>Hassan 60.7h</w:t>
+      </w:r>
+    </w:p>
+    <w:p>
+      <w:pPr>
         <w:rPr>
           <w:b/>
           <w:bCs/>
         </w:rPr>
-        <w:t>90h</w:t>
+      </w:pPr>
+      <w:r>
+        <w:rPr>
+          <w:b/>
+          <w:bCs/>
+        </w:rPr>
+        <w:t>Niklaus 63.5h</w:t>
+      </w:r>
+    </w:p>
+    <w:p>
+      <w:pPr>
+        <w:rPr>
+          <w:b/>
+          <w:bCs/>
+        </w:rPr>
+      </w:pPr>
+    </w:p>
+    <w:p>
+      <w:pPr>
+        <w:rPr>
+          <w:b/>
+          <w:bCs/>
+        </w:rPr>
+      </w:pPr>
+      <w:r>
+        <w:rPr>
+          <w:b/>
+          <w:bCs/>
+        </w:rPr>
+        <w:t>Summe 124.2h</w:t>
       </w:r>
     </w:p>
     <w:p/>
@@ -8861,76 +8881,76 @@
     <w:p/>
     <w:p>
       <w:r>
+        <w:t xml:space="preserve">Die Arbeit ist in gleicher oder ähnlicher Form noch nicht veröffentlicht und noch keiner Prüfungsbehörde vorgelegt worden. </w:t>
+      </w:r>
+    </w:p>
+    <w:p/>
+    <w:p/>
+    <w:p/>
+    <w:p/>
+    <w:p/>
+    <w:p/>
+    <w:p/>
+    <w:p/>
+    <w:p/>
+    <w:p/>
+    <w:p/>
+    <w:p/>
+    <w:p/>
+    <w:p/>
+    <w:p/>
+    <w:p/>
+    <w:p/>
+    <w:p/>
+    <w:p/>
+    <w:p/>
+    <w:p/>
+    <w:p/>
+    <w:p>
+      <w:r>
+        <w:t xml:space="preserve">Datum: </w:t>
+      </w:r>
+      <w:r>
+        <w:t xml:space="preserve">Landquart, </w:t>
+      </w:r>
+      <w:r>
+        <w:t>2</w:t>
+      </w:r>
+      <w:r>
+        <w:t>4</w:t>
+      </w:r>
+      <w:r>
+        <w:t>.</w:t>
+      </w:r>
+      <w:r>
+        <w:t>0</w:t>
+      </w:r>
+      <w:r>
+        <w:t>6</w:t>
+      </w:r>
+      <w:r>
+        <w:t>.202</w:t>
+      </w:r>
+      <w:r>
+        <w:t>6</w:t>
+      </w:r>
+    </w:p>
+    <w:p>
+      <w:r>
+        <w:t>Unterschrift:</w:t>
+      </w:r>
+    </w:p>
+    <w:p>
+      <w:pPr>
+        <w:rPr>
+          <w:noProof/>
+        </w:rPr>
+      </w:pPr>
+      <w:r>
+        <w:rPr>
+          <w:noProof/>
+        </w:rPr>
         <w:lastRenderedPageBreak/>
-        <w:t xml:space="preserve">Die Arbeit ist in gleicher oder ähnlicher Form noch nicht veröffentlicht und noch keiner Prüfungsbehörde vorgelegt worden. </w:t>
-      </w:r>
-    </w:p>
-    <w:p/>
-    <w:p/>
-    <w:p/>
-    <w:p/>
-    <w:p/>
-    <w:p/>
-    <w:p/>
-    <w:p/>
-    <w:p/>
-    <w:p/>
-    <w:p/>
-    <w:p/>
-    <w:p/>
-    <w:p/>
-    <w:p/>
-    <w:p/>
-    <w:p/>
-    <w:p/>
-    <w:p/>
-    <w:p/>
-    <w:p/>
-    <w:p/>
-    <w:p>
-      <w:r>
-        <w:t xml:space="preserve">Datum: </w:t>
-      </w:r>
-      <w:r>
-        <w:t xml:space="preserve">Landquart, </w:t>
-      </w:r>
-      <w:r>
-        <w:t>2</w:t>
-      </w:r>
-      <w:r>
-        <w:t>4</w:t>
-      </w:r>
-      <w:r>
-        <w:t>.</w:t>
-      </w:r>
-      <w:r>
-        <w:t>0</w:t>
-      </w:r>
-      <w:r>
-        <w:t>6</w:t>
-      </w:r>
-      <w:r>
-        <w:t>.202</w:t>
-      </w:r>
-      <w:r>
-        <w:t>6</w:t>
-      </w:r>
-    </w:p>
-    <w:p>
-      <w:r>
-        <w:t>Unterschrift:</w:t>
-      </w:r>
-    </w:p>
-    <w:p>
-      <w:pPr>
-        <w:rPr>
-          <w:noProof/>
-        </w:rPr>
-      </w:pPr>
-      <w:r>
-        <w:rPr>
-          <w:noProof/>
-        </w:rPr>
         <w:drawing>
           <wp:inline distT="0" distB="0" distL="0" distR="0" wp14:anchorId="10CE980B" wp14:editId="703CF82F">
             <wp:extent cx="563353" cy="399042"/>
@@ -8947,7 +8967,7 @@
                     <pic:cNvPicPr/>
                   </pic:nvPicPr>
                   <pic:blipFill>
-                    <a:blip r:embed="rId27"/>
+                    <a:blip r:embed="rId23"/>
                     <a:stretch>
                       <a:fillRect/>
                     </a:stretch>
@@ -8993,7 +9013,7 @@
                     <pic:cNvPicPr/>
                   </pic:nvPicPr>
                   <pic:blipFill>
-                    <a:blip r:embed="rId28" cstate="print">
+                    <a:blip r:embed="rId24" cstate="print">
                       <a:extLst>
                         <a:ext uri="{28A0092B-C50C-407E-A947-70E740481C1C}">
                           <a14:useLocalDpi xmlns:a14="http://schemas.microsoft.com/office/drawing/2010/main" val="0"/>
@@ -9781,7 +9801,6 @@
     </w:p>
     <w:p>
       <w:r>
-        <w:lastRenderedPageBreak/>
         <w:t>[3] Modul Steuerungstechnik II: SPS Namenskonventionen – Cheatsheet, 2026. Unterrichtsunterlage.</w:t>
       </w:r>
     </w:p>
@@ -9867,11 +9886,7 @@
     </w:p>
     <w:p>
       <w:r>
-        <w:t xml:space="preserve">Während der Bearbeitung wurden KI-Tools unterstützend eingesetzt. OpenAI ChatGPT wurde für die sprachliche Überarbeitung einzelner Dokumentationsabschnitte, die Strukturierung der Anforderungen sowie für Vorschläge zu Planung, Zustandsautomat, Architekturzeichnung und </w:t>
-      </w:r>
-      <w:r>
-        <w:lastRenderedPageBreak/>
-        <w:t>HMI-Skizze verwendet. Die vorgeschlagenen Inhalte wurden überprüft, angepasst und mit der eigenen Aufgabenstellung abgeglichen.</w:t>
+        <w:t>Während der Bearbeitung wurden KI-Tools unterstützend eingesetzt. OpenAI ChatGPT wurde für die sprachliche Überarbeitung einzelner Dokumentationsabschnitte, die Strukturierung der Anforderungen sowie für Vorschläge zu Planung, Zustandsautomat, Architekturzeichnung und HMI-Skizze verwendet. Die vorgeschlagenen Inhalte wurden überprüft, angepasst und mit der eigenen Aufgabenstellung abgeglichen.</w:t>
       </w:r>
     </w:p>
     <w:p/>
@@ -9938,8 +9953,8 @@
       </w:pPr>
     </w:p>
     <w:sectPr>
-      <w:headerReference w:type="first" r:id="rId29"/>
-      <w:footerReference w:type="first" r:id="rId30"/>
+      <w:headerReference w:type="first" r:id="rId25"/>
+      <w:footerReference w:type="first" r:id="rId26"/>
       <w:pgSz w:w="11906" w:h="16838"/>
       <w:pgMar w:top="1418" w:right="1134" w:bottom="1134" w:left="1134" w:header="709" w:footer="709" w:gutter="0"/>
       <w:pgNumType w:start="1"/>
@@ -9983,16 +9998,6 @@
 </file>
 
 <file path=word/footer1.xml><?xml version="1.0" encoding="utf-8"?>
-<w:ftr xmlns:wpc="http://schemas.microsoft.com/office/word/2010/wordprocessingCanvas" xmlns:cx="http://schemas.microsoft.com/office/drawing/2014/chartex" xmlns:cx1="http://schemas.microsoft.com/office/drawing/2015/9/8/chartex" xmlns:cx2="http://schemas.microsoft.com/office/drawing/2015/10/21/chartex" xmlns:cx3="http://schemas.microsoft.com/office/drawing/2016/5/9/chartex" xmlns:cx4="http://schemas.microsoft.com/office/drawing/2016/5/10/chartex" xmlns:cx5="http://schemas.microsoft.com/office/drawing/2016/5/11/chartex" xmlns:cx6="http://schemas.microsoft.com/office/drawing/2016/5/12/chartex" xmlns:cx7="http://schemas.microsoft.com/office/drawing/2016/5/13/chartex" xmlns:cx8="http://schemas.microsoft.com/office/drawing/2016/5/14/chartex" xmlns:mc="http://schemas.openxmlformats.org/markup-compatibility/2006" xmlns:aink="http://schemas.microsoft.com/office/drawing/2016/ink" xmlns:am3d="http://schemas.microsoft.com/office/drawing/2017/model3d" xmlns:o="urn:schemas-microsoft-com:office:office" xmlns:oel="http://schemas.microsoft.com/office/2019/extlst" xmlns:r="http://schemas.openxmlformats.org/officeDocument/2006/relationships" xmlns:m="http://schemas.openxmlformats.org/officeDocument/2006/math" xmlns:v="urn:schemas-microsoft-com:vml" xmlns:wp14="http://schemas.microsoft.com/office/word/2010/wordprocessingDrawing" xmlns:wp="http://schemas.openxmlformats.org/drawingml/2006/wordprocessingDrawing" xmlns:w10="urn:schemas-microsoft-com:office:word" xmlns:w="http://schemas.openxmlformats.org/wordprocessingml/2006/main" xmlns:w14="http://schemas.microsoft.com/office/word/2010/wordml" xmlns:w15="http://schemas.microsoft.com/office/word/2012/wordml" xmlns:w16cex="http://schemas.microsoft.com/office/word/2018/wordml/cex" xmlns:w16cid="http://schemas.microsoft.com/office/word/2016/wordml/cid" xmlns:w16="http://schemas.microsoft.com/office/word/2018/wordml" xmlns:w16du="http://schemas.microsoft.com/office/word/2023/wordml/word16du" xmlns:w16sdtdh="http://schemas.microsoft.com/office/word/2020/wordml/sdtdatahash" xmlns:w16sdtfl="http://schemas.microsoft.com/office/word/2024/wordml/sdtformatlock" xmlns:w16se="http://schemas.microsoft.com/office/word/2015/wordml/symex" xmlns:wpg="http://schemas.microsoft.com/office/word/2010/wordprocessingGroup" xmlns:wpi="http://schemas.microsoft.com/office/word/2010/wordprocessingInk" xmlns:wne="http://schemas.microsoft.com/office/word/2006/wordml" xmlns:wps="http://schemas.microsoft.com/office/word/2010/wordprocessingShape" mc:Ignorable="w14 w15 w16se w16cid w16 w16cex w16sdtdh w16sdtfl w16du wp14">
-  <w:p>
-    <w:pPr>
-      <w:pStyle w:val="Footer"/>
-    </w:pPr>
-  </w:p>
-</w:ftr>
-</file>
-
-<file path=word/footer2.xml><?xml version="1.0" encoding="utf-8"?>
 <w:ftr xmlns:wpc="http://schemas.microsoft.com/office/word/2010/wordprocessingCanvas" xmlns:cx="http://schemas.microsoft.com/office/drawing/2014/chartex" xmlns:cx1="http://schemas.microsoft.com/office/drawing/2015/9/8/chartex" xmlns:cx2="http://schemas.microsoft.com/office/drawing/2015/10/21/chartex" xmlns:cx3="http://schemas.microsoft.com/office/drawing/2016/5/9/chartex" xmlns:cx4="http://schemas.microsoft.com/office/drawing/2016/5/10/chartex" xmlns:cx5="http://schemas.microsoft.com/office/drawing/2016/5/11/chartex" xmlns:cx6="http://schemas.microsoft.com/office/drawing/2016/5/12/chartex" xmlns:cx7="http://schemas.microsoft.com/office/drawing/2016/5/13/chartex" xmlns:cx8="http://schemas.microsoft.com/office/drawing/2016/5/14/chartex" xmlns:mc="http://schemas.openxmlformats.org/markup-compatibility/2006" xmlns:aink="http://schemas.microsoft.com/office/drawing/2016/ink" xmlns:am3d="http://schemas.microsoft.com/office/drawing/2017/model3d" xmlns:o="urn:schemas-microsoft-com:office:office" xmlns:oel="http://schemas.microsoft.com/office/2019/extlst" xmlns:r="http://schemas.openxmlformats.org/officeDocument/2006/relationships" xmlns:m="http://schemas.openxmlformats.org/officeDocument/2006/math" xmlns:v="urn:schemas-microsoft-com:vml" xmlns:wp14="http://schemas.microsoft.com/office/word/2010/wordprocessingDrawing" xmlns:wp="http://schemas.openxmlformats.org/drawingml/2006/wordprocessingDrawing" xmlns:w10="urn:schemas-microsoft-com:office:word" xmlns:w="http://schemas.openxmlformats.org/wordprocessingml/2006/main" xmlns:w14="http://schemas.microsoft.com/office/word/2010/wordml" xmlns:w15="http://schemas.microsoft.com/office/word/2012/wordml" xmlns:w16cex="http://schemas.microsoft.com/office/word/2018/wordml/cex" xmlns:w16cid="http://schemas.microsoft.com/office/word/2016/wordml/cid" xmlns:w16="http://schemas.microsoft.com/office/word/2018/wordml" xmlns:w16du="http://schemas.microsoft.com/office/word/2023/wordml/word16du" xmlns:w16sdtdh="http://schemas.microsoft.com/office/word/2020/wordml/sdtdatahash" xmlns:w16sdtfl="http://schemas.microsoft.com/office/word/2024/wordml/sdtformatlock" xmlns:w16se="http://schemas.microsoft.com/office/word/2015/wordml/symex" xmlns:wpg="http://schemas.microsoft.com/office/word/2010/wordprocessingGroup" xmlns:wpi="http://schemas.microsoft.com/office/word/2010/wordprocessingInk" xmlns:wne="http://schemas.microsoft.com/office/word/2006/wordml" xmlns:wps="http://schemas.microsoft.com/office/word/2010/wordprocessingShape" mc:Ignorable="w14 w15 w16se w16cid w16 w16cex w16sdtdh w16sdtfl w16du wp14">
   <w:p>
     <w:pPr>
@@ -10210,7 +10215,7 @@
 </w:ftr>
 </file>
 
-<file path=word/footer3.xml><?xml version="1.0" encoding="utf-8"?>
+<file path=word/footer2.xml><?xml version="1.0" encoding="utf-8"?>
 <w:ftr xmlns:wpc="http://schemas.microsoft.com/office/word/2010/wordprocessingCanvas" xmlns:cx="http://schemas.microsoft.com/office/drawing/2014/chartex" xmlns:cx1="http://schemas.microsoft.com/office/drawing/2015/9/8/chartex" xmlns:cx2="http://schemas.microsoft.com/office/drawing/2015/10/21/chartex" xmlns:cx3="http://schemas.microsoft.com/office/drawing/2016/5/9/chartex" xmlns:cx4="http://schemas.microsoft.com/office/drawing/2016/5/10/chartex" xmlns:cx5="http://schemas.microsoft.com/office/drawing/2016/5/11/chartex" xmlns:cx6="http://schemas.microsoft.com/office/drawing/2016/5/12/chartex" xmlns:cx7="http://schemas.microsoft.com/office/drawing/2016/5/13/chartex" xmlns:cx8="http://schemas.microsoft.com/office/drawing/2016/5/14/chartex" xmlns:mc="http://schemas.openxmlformats.org/markup-compatibility/2006" xmlns:aink="http://schemas.microsoft.com/office/drawing/2016/ink" xmlns:am3d="http://schemas.microsoft.com/office/drawing/2017/model3d" xmlns:o="urn:schemas-microsoft-com:office:office" xmlns:oel="http://schemas.microsoft.com/office/2019/extlst" xmlns:r="http://schemas.openxmlformats.org/officeDocument/2006/relationships" xmlns:m="http://schemas.openxmlformats.org/officeDocument/2006/math" xmlns:v="urn:schemas-microsoft-com:vml" xmlns:wp14="http://schemas.microsoft.com/office/word/2010/wordprocessingDrawing" xmlns:wp="http://schemas.openxmlformats.org/drawingml/2006/wordprocessingDrawing" xmlns:w10="urn:schemas-microsoft-com:office:word" xmlns:w="http://schemas.openxmlformats.org/wordprocessingml/2006/main" xmlns:w14="http://schemas.microsoft.com/office/word/2010/wordml" xmlns:w15="http://schemas.microsoft.com/office/word/2012/wordml" xmlns:w16cex="http://schemas.microsoft.com/office/word/2018/wordml/cex" xmlns:w16cid="http://schemas.microsoft.com/office/word/2016/wordml/cid" xmlns:w16="http://schemas.microsoft.com/office/word/2018/wordml" xmlns:w16du="http://schemas.microsoft.com/office/word/2023/wordml/word16du" xmlns:w16sdtdh="http://schemas.microsoft.com/office/word/2020/wordml/sdtdatahash" xmlns:w16sdtfl="http://schemas.microsoft.com/office/word/2024/wordml/sdtformatlock" xmlns:w16se="http://schemas.microsoft.com/office/word/2015/wordml/symex" xmlns:wpg="http://schemas.microsoft.com/office/word/2010/wordprocessingGroup" xmlns:wpi="http://schemas.microsoft.com/office/word/2010/wordprocessingInk" xmlns:wne="http://schemas.microsoft.com/office/word/2006/wordml" xmlns:wps="http://schemas.microsoft.com/office/word/2010/wordprocessingShape" mc:Ignorable="w14 w15 w16se w16cid w16 w16cex w16sdtdh w16sdtfl w16du wp14">
   <w:p>
     <w:pPr>
@@ -10231,7 +10236,7 @@
 </w:ftr>
 </file>
 
-<file path=word/footer4.xml><?xml version="1.0" encoding="utf-8"?>
+<file path=word/footer3.xml><?xml version="1.0" encoding="utf-8"?>
 <w:ftr xmlns:wpc="http://schemas.microsoft.com/office/word/2010/wordprocessingCanvas" xmlns:cx="http://schemas.microsoft.com/office/drawing/2014/chartex" xmlns:cx1="http://schemas.microsoft.com/office/drawing/2015/9/8/chartex" xmlns:cx2="http://schemas.microsoft.com/office/drawing/2015/10/21/chartex" xmlns:cx3="http://schemas.microsoft.com/office/drawing/2016/5/9/chartex" xmlns:cx4="http://schemas.microsoft.com/office/drawing/2016/5/10/chartex" xmlns:cx5="http://schemas.microsoft.com/office/drawing/2016/5/11/chartex" xmlns:cx6="http://schemas.microsoft.com/office/drawing/2016/5/12/chartex" xmlns:cx7="http://schemas.microsoft.com/office/drawing/2016/5/13/chartex" xmlns:cx8="http://schemas.microsoft.com/office/drawing/2016/5/14/chartex" xmlns:mc="http://schemas.openxmlformats.org/markup-compatibility/2006" xmlns:aink="http://schemas.microsoft.com/office/drawing/2016/ink" xmlns:am3d="http://schemas.microsoft.com/office/drawing/2017/model3d" xmlns:o="urn:schemas-microsoft-com:office:office" xmlns:oel="http://schemas.microsoft.com/office/2019/extlst" xmlns:r="http://schemas.openxmlformats.org/officeDocument/2006/relationships" xmlns:m="http://schemas.openxmlformats.org/officeDocument/2006/math" xmlns:v="urn:schemas-microsoft-com:vml" xmlns:wp14="http://schemas.microsoft.com/office/word/2010/wordprocessingDrawing" xmlns:wp="http://schemas.openxmlformats.org/drawingml/2006/wordprocessingDrawing" xmlns:w10="urn:schemas-microsoft-com:office:word" xmlns:w="http://schemas.openxmlformats.org/wordprocessingml/2006/main" xmlns:w14="http://schemas.microsoft.com/office/word/2010/wordml" xmlns:w15="http://schemas.microsoft.com/office/word/2012/wordml" xmlns:w16cex="http://schemas.microsoft.com/office/word/2018/wordml/cex" xmlns:w16cid="http://schemas.microsoft.com/office/word/2016/wordml/cid" xmlns:w16="http://schemas.microsoft.com/office/word/2018/wordml" xmlns:w16du="http://schemas.microsoft.com/office/word/2023/wordml/word16du" xmlns:w16sdtdh="http://schemas.microsoft.com/office/word/2020/wordml/sdtdatahash" xmlns:w16sdtfl="http://schemas.microsoft.com/office/word/2024/wordml/sdtformatlock" xmlns:w16se="http://schemas.microsoft.com/office/word/2015/wordml/symex" xmlns:wpg="http://schemas.microsoft.com/office/word/2010/wordprocessingGroup" xmlns:wpi="http://schemas.microsoft.com/office/word/2010/wordprocessingInk" xmlns:wne="http://schemas.microsoft.com/office/word/2006/wordml" xmlns:wps="http://schemas.microsoft.com/office/word/2010/wordprocessingShape" mc:Ignorable="w14 w15 w16se w16cid w16 w16cex w16sdtdh w16sdtfl w16du wp14">
   <w:p>
     <w:pPr>
@@ -10285,36 +10290,6 @@
 </file>
 
 <file path=word/header1.xml><?xml version="1.0" encoding="utf-8"?>
-<w:hdr xmlns:wpc="http://schemas.microsoft.com/office/word/2010/wordprocessingCanvas" xmlns:cx="http://schemas.microsoft.com/office/drawing/2014/chartex" xmlns:cx1="http://schemas.microsoft.com/office/drawing/2015/9/8/chartex" xmlns:cx2="http://schemas.microsoft.com/office/drawing/2015/10/21/chartex" xmlns:cx3="http://schemas.microsoft.com/office/drawing/2016/5/9/chartex" xmlns:cx4="http://schemas.microsoft.com/office/drawing/2016/5/10/chartex" xmlns:cx5="http://schemas.microsoft.com/office/drawing/2016/5/11/chartex" xmlns:cx6="http://schemas.microsoft.com/office/drawing/2016/5/12/chartex" xmlns:cx7="http://schemas.microsoft.com/office/drawing/2016/5/13/chartex" xmlns:cx8="http://schemas.microsoft.com/office/drawing/2016/5/14/chartex" xmlns:mc="http://schemas.openxmlformats.org/markup-compatibility/2006" xmlns:aink="http://schemas.microsoft.com/office/drawing/2016/ink" xmlns:am3d="http://schemas.microsoft.com/office/drawing/2017/model3d" xmlns:o="urn:schemas-microsoft-com:office:office" xmlns:oel="http://schemas.microsoft.com/office/2019/extlst" xmlns:r="http://schemas.openxmlformats.org/officeDocument/2006/relationships" xmlns:m="http://schemas.openxmlformats.org/officeDocument/2006/math" xmlns:v="urn:schemas-microsoft-com:vml" xmlns:wp14="http://schemas.microsoft.com/office/word/2010/wordprocessingDrawing" xmlns:wp="http://schemas.openxmlformats.org/drawingml/2006/wordprocessingDrawing" xmlns:w10="urn:schemas-microsoft-com:office:word" xmlns:w="http://schemas.openxmlformats.org/wordprocessingml/2006/main" xmlns:w14="http://schemas.microsoft.com/office/word/2010/wordml" xmlns:w15="http://schemas.microsoft.com/office/word/2012/wordml" xmlns:w16cex="http://schemas.microsoft.com/office/word/2018/wordml/cex" xmlns:w16cid="http://schemas.microsoft.com/office/word/2016/wordml/cid" xmlns:w16="http://schemas.microsoft.com/office/word/2018/wordml" xmlns:w16du="http://schemas.microsoft.com/office/word/2023/wordml/word16du" xmlns:w16sdtdh="http://schemas.microsoft.com/office/word/2020/wordml/sdtdatahash" xmlns:w16sdtfl="http://schemas.microsoft.com/office/word/2024/wordml/sdtformatlock" xmlns:w16se="http://schemas.microsoft.com/office/word/2015/wordml/symex" xmlns:wpg="http://schemas.microsoft.com/office/word/2010/wordprocessingGroup" xmlns:wpi="http://schemas.microsoft.com/office/word/2010/wordprocessingInk" xmlns:wne="http://schemas.microsoft.com/office/word/2006/wordml" xmlns:wps="http://schemas.microsoft.com/office/word/2010/wordprocessingShape" mc:Ignorable="w14 w15 w16se w16cid w16 w16cex w16sdtdh w16sdtfl w16du wp14">
-  <w:p>
-    <w:pPr>
-      <w:pStyle w:val="Header"/>
-    </w:pPr>
-  </w:p>
-</w:hdr>
-</file>
-
-<file path=word/header2.xml><?xml version="1.0" encoding="utf-8"?>
-<w:hdr xmlns:wpc="http://schemas.microsoft.com/office/word/2010/wordprocessingCanvas" xmlns:cx="http://schemas.microsoft.com/office/drawing/2014/chartex" xmlns:cx1="http://schemas.microsoft.com/office/drawing/2015/9/8/chartex" xmlns:cx2="http://schemas.microsoft.com/office/drawing/2015/10/21/chartex" xmlns:cx3="http://schemas.microsoft.com/office/drawing/2016/5/9/chartex" xmlns:cx4="http://schemas.microsoft.com/office/drawing/2016/5/10/chartex" xmlns:cx5="http://schemas.microsoft.com/office/drawing/2016/5/11/chartex" xmlns:cx6="http://schemas.microsoft.com/office/drawing/2016/5/12/chartex" xmlns:cx7="http://schemas.microsoft.com/office/drawing/2016/5/13/chartex" xmlns:cx8="http://schemas.microsoft.com/office/drawing/2016/5/14/chartex" xmlns:mc="http://schemas.openxmlformats.org/markup-compatibility/2006" xmlns:aink="http://schemas.microsoft.com/office/drawing/2016/ink" xmlns:am3d="http://schemas.microsoft.com/office/drawing/2017/model3d" xmlns:o="urn:schemas-microsoft-com:office:office" xmlns:oel="http://schemas.microsoft.com/office/2019/extlst" xmlns:r="http://schemas.openxmlformats.org/officeDocument/2006/relationships" xmlns:m="http://schemas.openxmlformats.org/officeDocument/2006/math" xmlns:v="urn:schemas-microsoft-com:vml" xmlns:wp14="http://schemas.microsoft.com/office/word/2010/wordprocessingDrawing" xmlns:wp="http://schemas.openxmlformats.org/drawingml/2006/wordprocessingDrawing" xmlns:w10="urn:schemas-microsoft-com:office:word" xmlns:w="http://schemas.openxmlformats.org/wordprocessingml/2006/main" xmlns:w14="http://schemas.microsoft.com/office/word/2010/wordml" xmlns:w15="http://schemas.microsoft.com/office/word/2012/wordml" xmlns:w16cex="http://schemas.microsoft.com/office/word/2018/wordml/cex" xmlns:w16cid="http://schemas.microsoft.com/office/word/2016/wordml/cid" xmlns:w16="http://schemas.microsoft.com/office/word/2018/wordml" xmlns:w16du="http://schemas.microsoft.com/office/word/2023/wordml/word16du" xmlns:w16sdtdh="http://schemas.microsoft.com/office/word/2020/wordml/sdtdatahash" xmlns:w16sdtfl="http://schemas.microsoft.com/office/word/2024/wordml/sdtformatlock" xmlns:w16se="http://schemas.microsoft.com/office/word/2015/wordml/symex" xmlns:wpg="http://schemas.microsoft.com/office/word/2010/wordprocessingGroup" xmlns:wpi="http://schemas.microsoft.com/office/word/2010/wordprocessingInk" xmlns:wne="http://schemas.microsoft.com/office/word/2006/wordml" xmlns:wps="http://schemas.microsoft.com/office/word/2010/wordprocessingShape" mc:Ignorable="w14 w15 w16se w16cid w16 w16cex w16sdtdh w16sdtfl w16du wp14">
-  <w:p>
-    <w:pPr>
-      <w:pStyle w:val="Header"/>
-    </w:pPr>
-  </w:p>
-</w:hdr>
-</file>
-
-<file path=word/header3.xml><?xml version="1.0" encoding="utf-8"?>
-<w:hdr xmlns:wpc="http://schemas.microsoft.com/office/word/2010/wordprocessingCanvas" xmlns:cx="http://schemas.microsoft.com/office/drawing/2014/chartex" xmlns:cx1="http://schemas.microsoft.com/office/drawing/2015/9/8/chartex" xmlns:cx2="http://schemas.microsoft.com/office/drawing/2015/10/21/chartex" xmlns:cx3="http://schemas.microsoft.com/office/drawing/2016/5/9/chartex" xmlns:cx4="http://schemas.microsoft.com/office/drawing/2016/5/10/chartex" xmlns:cx5="http://schemas.microsoft.com/office/drawing/2016/5/11/chartex" xmlns:cx6="http://schemas.microsoft.com/office/drawing/2016/5/12/chartex" xmlns:cx7="http://schemas.microsoft.com/office/drawing/2016/5/13/chartex" xmlns:cx8="http://schemas.microsoft.com/office/drawing/2016/5/14/chartex" xmlns:mc="http://schemas.openxmlformats.org/markup-compatibility/2006" xmlns:aink="http://schemas.microsoft.com/office/drawing/2016/ink" xmlns:am3d="http://schemas.microsoft.com/office/drawing/2017/model3d" xmlns:o="urn:schemas-microsoft-com:office:office" xmlns:oel="http://schemas.microsoft.com/office/2019/extlst" xmlns:r="http://schemas.openxmlformats.org/officeDocument/2006/relationships" xmlns:m="http://schemas.openxmlformats.org/officeDocument/2006/math" xmlns:v="urn:schemas-microsoft-com:vml" xmlns:wp14="http://schemas.microsoft.com/office/word/2010/wordprocessingDrawing" xmlns:wp="http://schemas.openxmlformats.org/drawingml/2006/wordprocessingDrawing" xmlns:w10="urn:schemas-microsoft-com:office:word" xmlns:w="http://schemas.openxmlformats.org/wordprocessingml/2006/main" xmlns:w14="http://schemas.microsoft.com/office/word/2010/wordml" xmlns:w15="http://schemas.microsoft.com/office/word/2012/wordml" xmlns:w16cex="http://schemas.microsoft.com/office/word/2018/wordml/cex" xmlns:w16cid="http://schemas.microsoft.com/office/word/2016/wordml/cid" xmlns:w16="http://schemas.microsoft.com/office/word/2018/wordml" xmlns:w16du="http://schemas.microsoft.com/office/word/2023/wordml/word16du" xmlns:w16sdtdh="http://schemas.microsoft.com/office/word/2020/wordml/sdtdatahash" xmlns:w16sdtfl="http://schemas.microsoft.com/office/word/2024/wordml/sdtformatlock" xmlns:w16se="http://schemas.microsoft.com/office/word/2015/wordml/symex" xmlns:wpg="http://schemas.microsoft.com/office/word/2010/wordprocessingGroup" xmlns:wpi="http://schemas.microsoft.com/office/word/2010/wordprocessingInk" xmlns:wne="http://schemas.microsoft.com/office/word/2006/wordml" xmlns:wps="http://schemas.microsoft.com/office/word/2010/wordprocessingShape" mc:Ignorable="w14 w15 w16se w16cid w16 w16cex w16sdtdh w16sdtfl w16du wp14">
-  <w:p>
-    <w:pPr>
-      <w:pStyle w:val="Header"/>
-    </w:pPr>
-  </w:p>
-</w:hdr>
-</file>
-
-<file path=word/header4.xml><?xml version="1.0" encoding="utf-8"?>
 <w:hdr xmlns:wpc="http://schemas.microsoft.com/office/word/2010/wordprocessingCanvas" xmlns:cx="http://schemas.microsoft.com/office/drawing/2014/chartex" xmlns:cx1="http://schemas.microsoft.com/office/drawing/2015/9/8/chartex" xmlns:cx2="http://schemas.microsoft.com/office/drawing/2015/10/21/chartex" xmlns:cx3="http://schemas.microsoft.com/office/drawing/2016/5/9/chartex" xmlns:cx4="http://schemas.microsoft.com/office/drawing/2016/5/10/chartex" xmlns:cx5="http://schemas.microsoft.com/office/drawing/2016/5/11/chartex" xmlns:cx6="http://schemas.microsoft.com/office/drawing/2016/5/12/chartex" xmlns:cx7="http://schemas.microsoft.com/office/drawing/2016/5/13/chartex" xmlns:cx8="http://schemas.microsoft.com/office/drawing/2016/5/14/chartex" xmlns:mc="http://schemas.openxmlformats.org/markup-compatibility/2006" xmlns:aink="http://schemas.microsoft.com/office/drawing/2016/ink" xmlns:am3d="http://schemas.microsoft.com/office/drawing/2017/model3d" xmlns:o="urn:schemas-microsoft-com:office:office" xmlns:oel="http://schemas.microsoft.com/office/2019/extlst" xmlns:r="http://schemas.openxmlformats.org/officeDocument/2006/relationships" xmlns:m="http://schemas.openxmlformats.org/officeDocument/2006/math" xmlns:v="urn:schemas-microsoft-com:vml" xmlns:wp14="http://schemas.microsoft.com/office/word/2010/wordprocessingDrawing" xmlns:wp="http://schemas.openxmlformats.org/drawingml/2006/wordprocessingDrawing" xmlns:w10="urn:schemas-microsoft-com:office:word" xmlns:w="http://schemas.openxmlformats.org/wordprocessingml/2006/main" xmlns:w14="http://schemas.microsoft.com/office/word/2010/wordml" xmlns:w15="http://schemas.microsoft.com/office/word/2012/wordml" xmlns:w16cex="http://schemas.microsoft.com/office/word/2018/wordml/cex" xmlns:w16cid="http://schemas.microsoft.com/office/word/2016/wordml/cid" xmlns:w16="http://schemas.microsoft.com/office/word/2018/wordml" xmlns:w16du="http://schemas.microsoft.com/office/word/2023/wordml/word16du" xmlns:w16sdtdh="http://schemas.microsoft.com/office/word/2020/wordml/sdtdatahash" xmlns:w16sdtfl="http://schemas.microsoft.com/office/word/2024/wordml/sdtformatlock" xmlns:w16se="http://schemas.microsoft.com/office/word/2015/wordml/symex" xmlns:wpg="http://schemas.microsoft.com/office/word/2010/wordprocessingGroup" xmlns:wpi="http://schemas.microsoft.com/office/word/2010/wordprocessingInk" xmlns:wne="http://schemas.microsoft.com/office/word/2006/wordml" xmlns:wps="http://schemas.microsoft.com/office/word/2010/wordprocessingShape" mc:Ignorable="w14 w15 w16se w16cid w16 w16cex w16sdtdh w16sdtfl w16du wp14">
   <w:p>
     <w:pPr>
@@ -12703,6 +12678,13 @@
     <w:pitch w:val="variable"/>
     <w:sig w:usb0="800002E7" w:usb1="2AC7FCFF" w:usb2="00000012" w:usb3="00000000" w:csb0="0002009F" w:csb1="00000000"/>
   </w:font>
+  <w:font w:name="Segoe UI Emoji">
+    <w:panose1 w:val="020B0502040204020203"/>
+    <w:charset w:val="00"/>
+    <w:family w:val="swiss"/>
+    <w:pitch w:val="variable"/>
+    <w:sig w:usb0="00000003" w:usb1="02000000" w:usb2="08000000" w:usb3="00000000" w:csb0="00000001" w:csb1="00000000"/>
+  </w:font>
   <w:font w:name="Aptos">
     <w:charset w:val="00"/>
     <w:family w:val="swiss"/>
@@ -12759,6 +12741,7 @@
     <w:rsid w:val="003A4554"/>
     <w:rsid w:val="003B5FF2"/>
     <w:rsid w:val="003D0A8C"/>
+    <w:rsid w:val="003E3DA3"/>
     <w:rsid w:val="004173C7"/>
     <w:rsid w:val="00446E52"/>
     <w:rsid w:val="004B575C"/>
@@ -12788,12 +12771,14 @@
     <w:rsid w:val="008C303B"/>
     <w:rsid w:val="008D7980"/>
     <w:rsid w:val="00981AB9"/>
+    <w:rsid w:val="009A74CA"/>
     <w:rsid w:val="00A25765"/>
     <w:rsid w:val="00A70D94"/>
     <w:rsid w:val="00AF5738"/>
     <w:rsid w:val="00AF6DE6"/>
     <w:rsid w:val="00B00A9F"/>
     <w:rsid w:val="00B25868"/>
+    <w:rsid w:val="00B41CF8"/>
     <w:rsid w:val="00B50A6E"/>
     <w:rsid w:val="00BD5506"/>
     <w:rsid w:val="00BE1720"/>
@@ -12803,7 +12788,6 @@
     <w:rsid w:val="00D04E6E"/>
     <w:rsid w:val="00D92868"/>
     <w:rsid w:val="00DB2476"/>
-    <w:rsid w:val="00DC4085"/>
     <w:rsid w:val="00DC6FD5"/>
     <w:rsid w:val="00DD05D6"/>
     <w:rsid w:val="00E049DB"/>
@@ -13543,6 +13527,10 @@
 </file>
 
 <file path=customXml/item1.xml><?xml version="1.0" encoding="utf-8"?>
+<b:Sources xmlns:b="http://schemas.openxmlformats.org/officeDocument/2006/bibliography" xmlns="http://schemas.openxmlformats.org/officeDocument/2006/bibliography" SelectedStyle="\APASixthEditionOfficeOnline.xsl" StyleName="APA" Version="6"/>
+</file>
+
+<file path=customXml/item2.xml><?xml version="1.0" encoding="utf-8"?>
 <?mso-contentType ?>
 <FormTemplates xmlns="http://schemas.microsoft.com/sharepoint/v3/contenttype/forms">
   <Display>DocumentLibraryForm</Display>
@@ -13551,11 +13539,18 @@
 </FormTemplates>
 </file>
 
-<file path=customXml/item2.xml><?xml version="1.0" encoding="utf-8"?>
-<b:Sources xmlns:b="http://schemas.openxmlformats.org/officeDocument/2006/bibliography" xmlns="http://schemas.openxmlformats.org/officeDocument/2006/bibliography" SelectedStyle="\APASixthEditionOfficeOnline.xsl" StyleName="APA" Version="6"/>
+<file path=customXml/item3.xml><?xml version="1.0" encoding="utf-8"?>
+<p:properties xmlns:p="http://schemas.microsoft.com/office/2006/metadata/properties" xmlns:xsi="http://www.w3.org/2001/XMLSchema-instance" xmlns:pc="http://schemas.microsoft.com/office/infopath/2007/PartnerControls">
+  <documentManagement>
+    <TaxCatchAll xmlns="e32c9bb7-34f5-44bb-800b-35798843376c" xsi:nil="true"/>
+    <lcf76f155ced4ddcb4097134ff3c332f xmlns="22aa7da5-41f5-464e-85e6-b2dd1761cd70">
+      <Terms xmlns="http://schemas.microsoft.com/office/infopath/2007/PartnerControls"/>
+    </lcf76f155ced4ddcb4097134ff3c332f>
+  </documentManagement>
+</p:properties>
 </file>
 
-<file path=customXml/item3.xml><?xml version="1.0" encoding="utf-8"?>
+<file path=customXml/item4.xml><?xml version="1.0" encoding="utf-8"?>
 <ct:contentTypeSchema xmlns:ct="http://schemas.microsoft.com/office/2006/metadata/contentType" xmlns:ma="http://schemas.microsoft.com/office/2006/metadata/properties/metaAttributes" ct:_="" ma:_="" ma:contentTypeName="Dokument" ma:contentTypeID="0x010100D827C1AAE83348469185F4DE8D8E42AA" ma:contentTypeVersion="18" ma:contentTypeDescription="Ein neues Dokument erstellen." ma:contentTypeScope="" ma:versionID="618348fa32be16a474572d476ed91d7d">
   <xsd:schema xmlns:xsd="http://www.w3.org/2001/XMLSchema" xmlns:xs="http://www.w3.org/2001/XMLSchema" xmlns:p="http://schemas.microsoft.com/office/2006/metadata/properties" xmlns:ns2="22aa7da5-41f5-464e-85e6-b2dd1761cd70" xmlns:ns3="e32c9bb7-34f5-44bb-800b-35798843376c" targetNamespace="http://schemas.microsoft.com/office/2006/metadata/properties" ma:root="true" ma:fieldsID="348e17a0368de80907a02c9ddfbbbd22" ns2:_="" ns3:_="">
     <xsd:import namespace="22aa7da5-41f5-464e-85e6-b2dd1761cd70"/>
@@ -13810,18 +13805,15 @@
 </ct:contentTypeSchema>
 </file>
 
-<file path=customXml/item4.xml><?xml version="1.0" encoding="utf-8"?>
-<p:properties xmlns:p="http://schemas.microsoft.com/office/2006/metadata/properties" xmlns:xsi="http://www.w3.org/2001/XMLSchema-instance" xmlns:pc="http://schemas.microsoft.com/office/infopath/2007/PartnerControls">
-  <documentManagement>
-    <TaxCatchAll xmlns="e32c9bb7-34f5-44bb-800b-35798843376c" xsi:nil="true"/>
-    <lcf76f155ced4ddcb4097134ff3c332f xmlns="22aa7da5-41f5-464e-85e6-b2dd1761cd70">
-      <Terms xmlns="http://schemas.microsoft.com/office/infopath/2007/PartnerControls"/>
-    </lcf76f155ced4ddcb4097134ff3c332f>
-  </documentManagement>
-</p:properties>
+<file path=customXml/itemProps1.xml><?xml version="1.0" encoding="utf-8"?>
+<ds:datastoreItem xmlns:ds="http://schemas.openxmlformats.org/officeDocument/2006/customXml" ds:itemID="{84661881-BC85-4481-9F58-A76FBE332CB1}">
+  <ds:schemaRefs>
+    <ds:schemaRef ds:uri="http://schemas.openxmlformats.org/officeDocument/2006/bibliography"/>
+  </ds:schemaRefs>
+</ds:datastoreItem>
 </file>
 
-<file path=customXml/itemProps1.xml><?xml version="1.0" encoding="utf-8"?>
+<file path=customXml/itemProps2.xml><?xml version="1.0" encoding="utf-8"?>
 <ds:datastoreItem xmlns:ds="http://schemas.openxmlformats.org/officeDocument/2006/customXml" ds:itemID="{B8133326-A9D9-4C20-AED2-57D8DB38EE3B}">
   <ds:schemaRefs>
     <ds:schemaRef ds:uri="http://schemas.microsoft.com/sharepoint/v3/contenttype/forms"/>
@@ -13829,15 +13821,18 @@
 </ds:datastoreItem>
 </file>
 
-<file path=customXml/itemProps2.xml><?xml version="1.0" encoding="utf-8"?>
-<ds:datastoreItem xmlns:ds="http://schemas.openxmlformats.org/officeDocument/2006/customXml" ds:itemID="{84661881-BC85-4481-9F58-A76FBE332CB1}">
+<file path=customXml/itemProps3.xml><?xml version="1.0" encoding="utf-8"?>
+<ds:datastoreItem xmlns:ds="http://schemas.openxmlformats.org/officeDocument/2006/customXml" ds:itemID="{AEB5EB03-E1DB-4DE6-8456-3A44BE197CDE}">
   <ds:schemaRefs>
-    <ds:schemaRef ds:uri="http://schemas.openxmlformats.org/officeDocument/2006/bibliography"/>
+    <ds:schemaRef ds:uri="http://schemas.microsoft.com/office/2006/metadata/properties"/>
+    <ds:schemaRef ds:uri="http://schemas.microsoft.com/office/infopath/2007/PartnerControls"/>
+    <ds:schemaRef ds:uri="e32c9bb7-34f5-44bb-800b-35798843376c"/>
+    <ds:schemaRef ds:uri="22aa7da5-41f5-464e-85e6-b2dd1761cd70"/>
   </ds:schemaRefs>
 </ds:datastoreItem>
 </file>
 
-<file path=customXml/itemProps3.xml><?xml version="1.0" encoding="utf-8"?>
+<file path=customXml/itemProps4.xml><?xml version="1.0" encoding="utf-8"?>
 <ds:datastoreItem xmlns:ds="http://schemas.openxmlformats.org/officeDocument/2006/customXml" ds:itemID="{60D544C4-8D4D-481D-B00F-1F09332EE222}">
   <ds:schemaRefs>
     <ds:schemaRef ds:uri="http://schemas.microsoft.com/office/2006/metadata/contentType"/>
@@ -13854,15 +13849,4 @@
     <ds:schemaRef ds:uri="http://schemas.microsoft.com/internal/obd"/>
   </ds:schemaRefs>
 </ds:datastoreItem>
-</file>
-
-<file path=customXml/itemProps4.xml><?xml version="1.0" encoding="utf-8"?>
-<ds:datastoreItem xmlns:ds="http://schemas.openxmlformats.org/officeDocument/2006/customXml" ds:itemID="{AEB5EB03-E1DB-4DE6-8456-3A44BE197CDE}">
-  <ds:schemaRefs>
-    <ds:schemaRef ds:uri="http://schemas.microsoft.com/office/2006/metadata/properties"/>
-    <ds:schemaRef ds:uri="http://schemas.microsoft.com/office/infopath/2007/PartnerControls"/>
-    <ds:schemaRef ds:uri="e32c9bb7-34f5-44bb-800b-35798843376c"/>
-    <ds:schemaRef ds:uri="22aa7da5-41f5-464e-85e6-b2dd1761cd70"/>
-  </ds:schemaRefs>
-</ds:datastoreItem>
 </file>
</xml_diff>